<commit_message>
Document search match modes (AND/OR/whole-sentence) in both manuals
Adds the previously-undocumented multi-word match selector to Section 7.1
in both manuals, with a live screenshot.

Co-Authored-By: Claude Sonnet 5 <noreply@anthropic.com>
</commit_message>
<xml_diff>
--- a/PMS_User_Manual.docx
+++ b/PMS_User_Manual.docx
@@ -5081,6 +5081,110 @@
       </w:r>
     </w:p>
     <w:p>
+      <w:r>
+        <w:t>When you type more than one word, the “Multi-word match” control next to the search box decides how they combine:</w:t>
+      </w:r>
+    </w:p>
+    <w:p>
+      <w:pPr>
+        <w:pStyle w:val="ListBullet"/>
+        <w:ind w:left="360"/>
+      </w:pPr>
+      <w:r>
+        <w:t>All words (AND) - the default. A document must contain every word you typed (in any order) to match.</w:t>
+      </w:r>
+    </w:p>
+    <w:p>
+      <w:pPr>
+        <w:pStyle w:val="ListBullet"/>
+        <w:ind w:left="360"/>
+      </w:pPr>
+      <w:r>
+        <w:t>Any word (OR) - a document matches if it contains at least one of the words.</w:t>
+      </w:r>
+    </w:p>
+    <w:p>
+      <w:pPr>
+        <w:pStyle w:val="ListBullet"/>
+        <w:ind w:left="360"/>
+      </w:pPr>
+      <w:r>
+        <w:t>Whole sentence - the entire contents of the search box is matched verbatim, as one exact phrase, instead of being split into separate words.</w:t>
+      </w:r>
+    </w:p>
+    <w:p>
+      <w:pPr>
+        <w:jc w:val="center"/>
+      </w:pPr>
+      <w:r>
+        <w:drawing>
+          <wp:inline xmlns:a="http://schemas.openxmlformats.org/drawingml/2006/main" xmlns:pic="http://schemas.openxmlformats.org/drawingml/2006/picture">
+            <wp:extent cx="5486400" cy="2936720"/>
+            <wp:docPr id="19" name="Picture 19"/>
+            <wp:cNvGraphicFramePr>
+              <a:graphicFrameLocks noChangeAspect="1"/>
+            </wp:cNvGraphicFramePr>
+            <a:graphic>
+              <a:graphicData uri="http://schemas.openxmlformats.org/drawingml/2006/picture">
+                <pic:pic>
+                  <pic:nvPicPr>
+                    <pic:cNvPr id="0" name="38_search_match_modes.png"/>
+                    <pic:cNvPicPr/>
+                  </pic:nvPicPr>
+                  <pic:blipFill>
+                    <a:blip r:embed="rId27"/>
+                    <a:stretch>
+                      <a:fillRect/>
+                    </a:stretch>
+                  </pic:blipFill>
+                  <pic:spPr>
+                    <a:xfrm>
+                      <a:off x="0" y="0"/>
+                      <a:ext cx="5486400" cy="2936720"/>
+                    </a:xfrm>
+                    <a:prstGeom prst="rect"/>
+                  </pic:spPr>
+                </pic:pic>
+              </a:graphicData>
+            </a:graphic>
+          </wp:inline>
+        </w:drawing>
+      </w:r>
+    </w:p>
+    <w:p>
+      <w:pPr>
+        <w:jc w:val="center"/>
+      </w:pPr>
+      <w:r>
+        <w:rPr>
+          <w:i/>
+          <w:color w:val="707070"/>
+          <w:sz w:val="18"/>
+        </w:rPr>
+        <w:t>Figure 7-1a  The Multi-word match control: All words (AND) / Any word (OR) / Whole sentence</w:t>
+      </w:r>
+    </w:p>
+    <w:p/>
+    <w:p>
+      <w:pPr>
+        <w:ind w:left="576" w:right="576"/>
+        <w:shd w:val="clear" w:color="auto" w:fill="E6F4EA"/>
+      </w:pPr>
+      <w:r>
+        <w:rPr>
+          <w:b/>
+          <w:color w:val="056F00"/>
+        </w:rPr>
+        <w:t xml:space="preserve">Tip: </w:t>
+      </w:r>
+      <w:r>
+        <w:rPr>
+          <w:color w:val="333333"/>
+        </w:rPr>
+        <w:t>Switch to “Any word (OR)” when you're not sure which of several related terms a document uses (e.g. “invoice receipt bill”); switch to “Whole sentence” when you want to find one specific phrase and AND/OR are turning up too many unrelated partial matches.</w:t>
+      </w:r>
+    </w:p>
+    <w:p>
       <w:pPr>
         <w:pStyle w:val="Heading2"/>
       </w:pPr>
@@ -5209,7 +5313,7 @@
         <w:drawing>
           <wp:inline xmlns:a="http://schemas.openxmlformats.org/drawingml/2006/main" xmlns:pic="http://schemas.openxmlformats.org/drawingml/2006/picture">
             <wp:extent cx="5486400" cy="3429000"/>
-            <wp:docPr id="19" name="Picture 19"/>
+            <wp:docPr id="20" name="Picture 20"/>
             <wp:cNvGraphicFramePr>
               <a:graphicFrameLocks noChangeAspect="1"/>
             </wp:cNvGraphicFramePr>
@@ -5218,184 +5322,6 @@
                 <pic:pic>
                   <pic:nvPicPr>
                     <pic:cNvPr id="0" name="07_search.png"/>
-                    <pic:cNvPicPr/>
-                  </pic:nvPicPr>
-                  <pic:blipFill>
-                    <a:blip r:embed="rId27"/>
-                    <a:stretch>
-                      <a:fillRect/>
-                    </a:stretch>
-                  </pic:blipFill>
-                  <pic:spPr>
-                    <a:xfrm>
-                      <a:off x="0" y="0"/>
-                      <a:ext cx="5486400" cy="3429000"/>
-                    </a:xfrm>
-                    <a:prstGeom prst="rect"/>
-                  </pic:spPr>
-                </pic:pic>
-              </a:graphicData>
-            </a:graphic>
-          </wp:inline>
-        </w:drawing>
-      </w:r>
-    </w:p>
-    <w:p>
-      <w:pPr>
-        <w:jc w:val="center"/>
-      </w:pPr>
-      <w:r>
-        <w:rPr>
-          <w:i/>
-          <w:color w:val="707070"/>
-          <w:sz w:val="18"/>
-        </w:rPr>
-        <w:t>Figure 7-1  Example search results</w:t>
-      </w:r>
-    </w:p>
-    <w:p/>
-    <w:p>
-      <w:pPr>
-        <w:pStyle w:val="Heading2"/>
-      </w:pPr>
-      <w:r>
-        <w:rPr>
-          <w:color w:val="1D4E89"/>
-        </w:rPr>
-        <w:t>7.3  Opening and Jumping to Results</w:t>
-      </w:r>
-    </w:p>
-    <w:p>
-      <w:pPr>
-        <w:pStyle w:val="ListBullet"/>
-        <w:ind w:left="360"/>
-      </w:pPr>
-      <w:r>
-        <w:t>Click a result card to open the Document Viewer for that document.</w:t>
-      </w:r>
-    </w:p>
-    <w:p>
-      <w:pPr>
-        <w:pStyle w:val="ListBullet"/>
-        <w:ind w:left="360"/>
-      </w:pPr>
-      <w:r>
-        <w:t>Double-click a result card to switch to the Tree tab and jump straight to the folder containing that document.</w:t>
-      </w:r>
-    </w:p>
-    <w:p>
-      <w:r>
-        <w:br w:type="page"/>
-      </w:r>
-    </w:p>
-    <w:p>
-      <w:pPr>
-        <w:pStyle w:val="Heading1"/>
-      </w:pPr>
-      <w:r>
-        <w:rPr>
-          <w:color w:val="1E40AF"/>
-        </w:rPr>
-        <w:t>8  Generating a Databook (PDF / Word)</w:t>
-      </w:r>
-    </w:p>
-    <w:p>
-      <w:r>
-        <w:t>The Databook feature combines selected documents into a single, professional document with a cover page, table of contents, section headers, and page numbers. Two modes are available: manually checking documents to build a PDF (8.1-8.2), or automatically generating an editable Word document from a folder's structure (8.3).</w:t>
-      </w:r>
-    </w:p>
-    <w:p>
-      <w:pPr>
-        <w:pStyle w:val="Heading2"/>
-      </w:pPr>
-      <w:r>
-        <w:rPr>
-          <w:color w:val="1D4E89"/>
-        </w:rPr>
-        <w:t>8.1  Selecting Documents (PDF mode)</w:t>
-      </w:r>
-    </w:p>
-    <w:p>
-      <w:pPr>
-        <w:pStyle w:val="ListNumber"/>
-        <w:ind w:left="360"/>
-      </w:pPr>
-      <w:r>
-        <w:t>Click the Databook tab in the sidebar.</w:t>
-      </w:r>
-    </w:p>
-    <w:p>
-      <w:pPr>
-        <w:pStyle w:val="ListNumber"/>
-        <w:ind w:left="360"/>
-      </w:pPr>
-      <w:r>
-        <w:t>The tree is shown with a checkbox next to each folder, plus a Select All link.</w:t>
-      </w:r>
-    </w:p>
-    <w:p>
-      <w:pPr>
-        <w:pStyle w:val="ListNumber"/>
-        <w:ind w:left="360"/>
-      </w:pPr>
-      <w:r>
-        <w:t>Check individual documents, or use the shortcuts:</w:t>
-      </w:r>
-    </w:p>
-    <w:p>
-      <w:pPr>
-        <w:pStyle w:val="ListBullet"/>
-        <w:ind w:left="360"/>
-      </w:pPr>
-      <w:r>
-        <w:t>Click Select All next to a folder to select every document in that folder (optionally including sub-folders).</w:t>
-      </w:r>
-    </w:p>
-    <w:p>
-      <w:pPr>
-        <w:pStyle w:val="ListBullet"/>
-        <w:ind w:left="360"/>
-      </w:pPr>
-      <w:r>
-        <w:t>Click Clear to deselect everything.</w:t>
-      </w:r>
-    </w:p>
-    <w:p>
-      <w:pPr>
-        <w:ind w:left="576" w:right="576"/>
-        <w:shd w:val="clear" w:color="auto" w:fill="E6F4EA"/>
-      </w:pPr>
-      <w:r>
-        <w:rPr>
-          <w:b/>
-          <w:color w:val="056F00"/>
-        </w:rPr>
-        <w:t xml:space="preserve">Tip: </w:t>
-      </w:r>
-      <w:r>
-        <w:rPr>
-          <w:color w:val="333333"/>
-        </w:rPr>
-        <w:t>Your selection is saved automatically - close and reopen DMS and it will still be there.</w:t>
-      </w:r>
-    </w:p>
-    <w:p>
-      <w:pPr>
-        <w:jc w:val="center"/>
-      </w:pPr>
-      <w:r>
-        <w:drawing>
-          <wp:inline xmlns:a="http://schemas.openxmlformats.org/drawingml/2006/main" xmlns:pic="http://schemas.openxmlformats.org/drawingml/2006/picture">
-            <wp:extent cx="5486400" cy="3429000"/>
-            <wp:docPr id="20" name="Picture 20"/>
-            <wp:cNvGraphicFramePr>
-              <a:graphicFrameLocks noChangeAspect="1"/>
-            </wp:cNvGraphicFramePr>
-            <a:graphic>
-              <a:graphicData uri="http://schemas.openxmlformats.org/drawingml/2006/picture">
-                <pic:pic>
-                  <pic:nvPicPr>
-                    <pic:cNvPr id="0" name="08_databook_tab.png"/>
                     <pic:cNvPicPr/>
                   </pic:nvPicPr>
                   <pic:blipFill>
@@ -5428,7 +5354,7 @@
           <w:color w:val="707070"/>
           <w:sz w:val="18"/>
         </w:rPr>
-        <w:t>Figure 8-1  The Databook tab: checking documents to include</w:t>
+        <w:t>Figure 7-1  Example search results</w:t>
       </w:r>
     </w:p>
     <w:p/>
@@ -5440,7 +5366,57 @@
         <w:rPr>
           <w:color w:val="1D4E89"/>
         </w:rPr>
-        <w:t>8.2  Generating the PDF</w:t>
+        <w:t>7.3  Opening and Jumping to Results</w:t>
+      </w:r>
+    </w:p>
+    <w:p>
+      <w:pPr>
+        <w:pStyle w:val="ListBullet"/>
+        <w:ind w:left="360"/>
+      </w:pPr>
+      <w:r>
+        <w:t>Click a result card to open the Document Viewer for that document.</w:t>
+      </w:r>
+    </w:p>
+    <w:p>
+      <w:pPr>
+        <w:pStyle w:val="ListBullet"/>
+        <w:ind w:left="360"/>
+      </w:pPr>
+      <w:r>
+        <w:t>Double-click a result card to switch to the Tree tab and jump straight to the folder containing that document.</w:t>
+      </w:r>
+    </w:p>
+    <w:p>
+      <w:r>
+        <w:br w:type="page"/>
+      </w:r>
+    </w:p>
+    <w:p>
+      <w:pPr>
+        <w:pStyle w:val="Heading1"/>
+      </w:pPr>
+      <w:r>
+        <w:rPr>
+          <w:color w:val="1E40AF"/>
+        </w:rPr>
+        <w:t>8  Generating a Databook (PDF / Word)</w:t>
+      </w:r>
+    </w:p>
+    <w:p>
+      <w:r>
+        <w:t>The Databook feature combines selected documents into a single, professional document with a cover page, table of contents, section headers, and page numbers. Two modes are available: manually checking documents to build a PDF (8.1-8.2), or automatically generating an editable Word document from a folder's structure (8.3).</w:t>
+      </w:r>
+    </w:p>
+    <w:p>
+      <w:pPr>
+        <w:pStyle w:val="Heading2"/>
+      </w:pPr>
+      <w:r>
+        <w:rPr>
+          <w:color w:val="1D4E89"/>
+        </w:rPr>
+        <w:t>8.1  Selecting Documents (PDF mode)</w:t>
       </w:r>
     </w:p>
     <w:p>
@@ -5449,7 +5425,7 @@
         <w:ind w:left="360"/>
       </w:pPr>
       <w:r>
-        <w:t>After selecting documents, click Generate Databook.</w:t>
+        <w:t>Click the Databook tab in the sidebar.</w:t>
       </w:r>
     </w:p>
     <w:p>
@@ -5458,7 +5434,7 @@
         <w:ind w:left="360"/>
       </w:pPr>
       <w:r>
-        <w:t>In the dialog, enter a Title (the main heading on the cover page) and a Subtitle (a secondary line, e.g. project name or revision number).</w:t>
+        <w:t>The tree is shown with a checkbox next to each folder, plus a Select All link.</w:t>
       </w:r>
     </w:p>
     <w:p>
@@ -5467,21 +5443,44 @@
         <w:ind w:left="360"/>
       </w:pPr>
       <w:r>
-        <w:t>Click Generate and Download.</w:t>
-      </w:r>
-    </w:p>
-    <w:p>
-      <w:pPr>
-        <w:pStyle w:val="ListNumber"/>
+        <w:t>Check individual documents, or use the shortcuts:</w:t>
+      </w:r>
+    </w:p>
+    <w:p>
+      <w:pPr>
+        <w:pStyle w:val="ListBullet"/>
         <w:ind w:left="360"/>
       </w:pPr>
       <w:r>
-        <w:t>DMS generates the PDF on the server and your browser downloads it automatically.</w:t>
-      </w:r>
-    </w:p>
-    <w:p>
-      <w:r>
-        <w:t>The generated PDF includes: a cover page (title, subtitle, date), a table of contents with clickable bookmarks, section-header pages, all selected documents in tree order, and page numbers/footers throughout.</w:t>
+        <w:t>Click Select All next to a folder to select every document in that folder (optionally including sub-folders).</w:t>
+      </w:r>
+    </w:p>
+    <w:p>
+      <w:pPr>
+        <w:pStyle w:val="ListBullet"/>
+        <w:ind w:left="360"/>
+      </w:pPr>
+      <w:r>
+        <w:t>Click Clear to deselect everything.</w:t>
+      </w:r>
+    </w:p>
+    <w:p>
+      <w:pPr>
+        <w:ind w:left="576" w:right="576"/>
+        <w:shd w:val="clear" w:color="auto" w:fill="E6F4EA"/>
+      </w:pPr>
+      <w:r>
+        <w:rPr>
+          <w:b/>
+          <w:color w:val="056F00"/>
+        </w:rPr>
+        <w:t xml:space="preserve">Tip: </w:t>
+      </w:r>
+      <w:r>
+        <w:rPr>
+          <w:color w:val="333333"/>
+        </w:rPr>
+        <w:t>Your selection is saved automatically - close and reopen DMS and it will still be there.</w:t>
       </w:r>
     </w:p>
     <w:p>
@@ -5500,7 +5499,7 @@
               <a:graphicData uri="http://schemas.openxmlformats.org/drawingml/2006/picture">
                 <pic:pic>
                   <pic:nvPicPr>
-                    <pic:cNvPr id="0" name="09_databook_dialog.png"/>
+                    <pic:cNvPr id="0" name="08_databook_tab.png"/>
                     <pic:cNvPicPr/>
                   </pic:nvPicPr>
                   <pic:blipFill>
@@ -5533,6 +5532,111 @@
           <w:color w:val="707070"/>
           <w:sz w:val="18"/>
         </w:rPr>
+        <w:t>Figure 8-1  The Databook tab: checking documents to include</w:t>
+      </w:r>
+    </w:p>
+    <w:p/>
+    <w:p>
+      <w:pPr>
+        <w:pStyle w:val="Heading2"/>
+      </w:pPr>
+      <w:r>
+        <w:rPr>
+          <w:color w:val="1D4E89"/>
+        </w:rPr>
+        <w:t>8.2  Generating the PDF</w:t>
+      </w:r>
+    </w:p>
+    <w:p>
+      <w:pPr>
+        <w:pStyle w:val="ListNumber"/>
+        <w:ind w:left="360"/>
+      </w:pPr>
+      <w:r>
+        <w:t>After selecting documents, click Generate Databook.</w:t>
+      </w:r>
+    </w:p>
+    <w:p>
+      <w:pPr>
+        <w:pStyle w:val="ListNumber"/>
+        <w:ind w:left="360"/>
+      </w:pPr>
+      <w:r>
+        <w:t>In the dialog, enter a Title (the main heading on the cover page) and a Subtitle (a secondary line, e.g. project name or revision number).</w:t>
+      </w:r>
+    </w:p>
+    <w:p>
+      <w:pPr>
+        <w:pStyle w:val="ListNumber"/>
+        <w:ind w:left="360"/>
+      </w:pPr>
+      <w:r>
+        <w:t>Click Generate and Download.</w:t>
+      </w:r>
+    </w:p>
+    <w:p>
+      <w:pPr>
+        <w:pStyle w:val="ListNumber"/>
+        <w:ind w:left="360"/>
+      </w:pPr>
+      <w:r>
+        <w:t>DMS generates the PDF on the server and your browser downloads it automatically.</w:t>
+      </w:r>
+    </w:p>
+    <w:p>
+      <w:r>
+        <w:t>The generated PDF includes: a cover page (title, subtitle, date), a table of contents with clickable bookmarks, section-header pages, all selected documents in tree order, and page numbers/footers throughout.</w:t>
+      </w:r>
+    </w:p>
+    <w:p>
+      <w:pPr>
+        <w:jc w:val="center"/>
+      </w:pPr>
+      <w:r>
+        <w:drawing>
+          <wp:inline xmlns:a="http://schemas.openxmlformats.org/drawingml/2006/main" xmlns:pic="http://schemas.openxmlformats.org/drawingml/2006/picture">
+            <wp:extent cx="5486400" cy="3429000"/>
+            <wp:docPr id="22" name="Picture 22"/>
+            <wp:cNvGraphicFramePr>
+              <a:graphicFrameLocks noChangeAspect="1"/>
+            </wp:cNvGraphicFramePr>
+            <a:graphic>
+              <a:graphicData uri="http://schemas.openxmlformats.org/drawingml/2006/picture">
+                <pic:pic>
+                  <pic:nvPicPr>
+                    <pic:cNvPr id="0" name="09_databook_dialog.png"/>
+                    <pic:cNvPicPr/>
+                  </pic:nvPicPr>
+                  <pic:blipFill>
+                    <a:blip r:embed="rId30"/>
+                    <a:stretch>
+                      <a:fillRect/>
+                    </a:stretch>
+                  </pic:blipFill>
+                  <pic:spPr>
+                    <a:xfrm>
+                      <a:off x="0" y="0"/>
+                      <a:ext cx="5486400" cy="3429000"/>
+                    </a:xfrm>
+                    <a:prstGeom prst="rect"/>
+                  </pic:spPr>
+                </pic:pic>
+              </a:graphicData>
+            </a:graphic>
+          </wp:inline>
+        </w:drawing>
+      </w:r>
+    </w:p>
+    <w:p>
+      <w:pPr>
+        <w:jc w:val="center"/>
+      </w:pPr>
+      <w:r>
+        <w:rPr>
+          <w:i/>
+          <w:color w:val="707070"/>
+          <w:sz w:val="18"/>
+        </w:rPr>
         <w:t>Figure 8-2  The Generate Databook dialog</w:t>
       </w:r>
     </w:p>
@@ -5588,7 +5692,7 @@
         <w:drawing>
           <wp:inline xmlns:a="http://schemas.openxmlformats.org/drawingml/2006/main" xmlns:pic="http://schemas.openxmlformats.org/drawingml/2006/picture">
             <wp:extent cx="5486400" cy="2741275"/>
-            <wp:docPr id="22" name="Picture 22"/>
+            <wp:docPr id="23" name="Picture 23"/>
             <wp:cNvGraphicFramePr>
               <a:graphicFrameLocks noChangeAspect="1"/>
             </wp:cNvGraphicFramePr>
@@ -5600,7 +5704,7 @@
                     <pic:cNvPicPr/>
                   </pic:nvPicPr>
                   <pic:blipFill>
-                    <a:blip r:embed="rId30"/>
+                    <a:blip r:embed="rId31"/>
                     <a:stretch>
                       <a:fillRect/>
                     </a:stretch>
@@ -5748,7 +5852,7 @@
         <w:drawing>
           <wp:inline xmlns:a="http://schemas.openxmlformats.org/drawingml/2006/main" xmlns:pic="http://schemas.openxmlformats.org/drawingml/2006/picture">
             <wp:extent cx="5486400" cy="3429000"/>
-            <wp:docPr id="23" name="Picture 23"/>
+            <wp:docPr id="24" name="Picture 24"/>
             <wp:cNvGraphicFramePr>
               <a:graphicFrameLocks noChangeAspect="1"/>
             </wp:cNvGraphicFramePr>
@@ -5757,118 +5861,6 @@
                 <pic:pic>
                   <pic:nvPicPr>
                     <pic:cNvPr id="0" name="10_combine_dialog.png"/>
-                    <pic:cNvPicPr/>
-                  </pic:nvPicPr>
-                  <pic:blipFill>
-                    <a:blip r:embed="rId31"/>
-                    <a:stretch>
-                      <a:fillRect/>
-                    </a:stretch>
-                  </pic:blipFill>
-                  <pic:spPr>
-                    <a:xfrm>
-                      <a:off x="0" y="0"/>
-                      <a:ext cx="5486400" cy="3429000"/>
-                    </a:xfrm>
-                    <a:prstGeom prst="rect"/>
-                  </pic:spPr>
-                </pic:pic>
-              </a:graphicData>
-            </a:graphic>
-          </wp:inline>
-        </w:drawing>
-      </w:r>
-    </w:p>
-    <w:p>
-      <w:pPr>
-        <w:jc w:val="center"/>
-      </w:pPr>
-      <w:r>
-        <w:rPr>
-          <w:i/>
-          <w:color w:val="707070"/>
-          <w:sz w:val="18"/>
-        </w:rPr>
-        <w:t>Figure 9-1  The merge-documents dialog</w:t>
-      </w:r>
-    </w:p>
-    <w:p/>
-    <w:p>
-      <w:r>
-        <w:br w:type="page"/>
-      </w:r>
-    </w:p>
-    <w:p>
-      <w:pPr>
-        <w:pStyle w:val="Heading1"/>
-      </w:pPr>
-      <w:r>
-        <w:rPr>
-          <w:color w:val="1E40AF"/>
-        </w:rPr>
-        <w:t>10  Face Recognition</w:t>
-      </w:r>
-    </w:p>
-    <w:p>
-      <w:r>
-        <w:t>The optional face-recognition component lets you tag faces in your photos and later browse them by person, with DMS automatically matching new photos of people it already knows.</w:t>
-      </w:r>
-    </w:p>
-    <w:p>
-      <w:pPr>
-        <w:pStyle w:val="Heading2"/>
-      </w:pPr>
-      <w:r>
-        <w:rPr>
-          <w:color w:val="1D4E89"/>
-        </w:rPr>
-        <w:t>10.1  Installing the Face Recognition Component</w:t>
-      </w:r>
-    </w:p>
-    <w:p>
-      <w:pPr>
-        <w:pStyle w:val="ListNumber"/>
-        <w:ind w:left="360"/>
-      </w:pPr>
-      <w:r>
-        <w:t>Click the Faces tab in the sidebar.</w:t>
-      </w:r>
-    </w:p>
-    <w:p>
-      <w:pPr>
-        <w:pStyle w:val="ListNumber"/>
-        <w:ind w:left="360"/>
-      </w:pPr>
-      <w:r>
-        <w:t>If the component (deepface) isn't installed yet, a prompt explains this and offers an Auto-install deepface button.</w:t>
-      </w:r>
-    </w:p>
-    <w:p>
-      <w:pPr>
-        <w:pStyle w:val="ListNumber"/>
-        <w:ind w:left="360"/>
-      </w:pPr>
-      <w:r>
-        <w:t>Click it and wait - this downloads TensorFlow and related libraries in the background and can take several minutes on a slow connection; you can keep using the rest of the app meanwhile.</w:t>
-      </w:r>
-    </w:p>
-    <w:p>
-      <w:pPr>
-        <w:jc w:val="center"/>
-      </w:pPr>
-      <w:r>
-        <w:drawing>
-          <wp:inline xmlns:a="http://schemas.openxmlformats.org/drawingml/2006/main" xmlns:pic="http://schemas.openxmlformats.org/drawingml/2006/picture">
-            <wp:extent cx="5486400" cy="3429000"/>
-            <wp:docPr id="24" name="Picture 24"/>
-            <wp:cNvGraphicFramePr>
-              <a:graphicFrameLocks noChangeAspect="1"/>
-            </wp:cNvGraphicFramePr>
-            <a:graphic>
-              <a:graphicData uri="http://schemas.openxmlformats.org/drawingml/2006/picture">
-                <pic:pic>
-                  <pic:nvPicPr>
-                    <pic:cNvPr id="0" name="16_face_tab.png"/>
                     <pic:cNvPicPr/>
                   </pic:nvPicPr>
                   <pic:blipFill>
@@ -5901,10 +5893,31 @@
           <w:color w:val="707070"/>
           <w:sz w:val="18"/>
         </w:rPr>
-        <w:t>Figure 10-1  The Faces tab (shown here with the component already installed, hence the empty state; before installing, you'd instead see a prompt with an Auto-install deepface button)</w:t>
+        <w:t>Figure 9-1  The merge-documents dialog</w:t>
       </w:r>
     </w:p>
     <w:p/>
+    <w:p>
+      <w:r>
+        <w:br w:type="page"/>
+      </w:r>
+    </w:p>
+    <w:p>
+      <w:pPr>
+        <w:pStyle w:val="Heading1"/>
+      </w:pPr>
+      <w:r>
+        <w:rPr>
+          <w:color w:val="1E40AF"/>
+        </w:rPr>
+        <w:t>10  Face Recognition</w:t>
+      </w:r>
+    </w:p>
+    <w:p>
+      <w:r>
+        <w:t>The optional face-recognition component lets you tag faces in your photos and later browse them by person, with DMS automatically matching new photos of people it already knows.</w:t>
+      </w:r>
+    </w:p>
     <w:p>
       <w:pPr>
         <w:pStyle w:val="Heading2"/>
@@ -5913,7 +5926,7 @@
         <w:rPr>
           <w:color w:val="1D4E89"/>
         </w:rPr>
-        <w:t>10.2  Tagging Faces</w:t>
+        <w:t>10.1  Installing the Face Recognition Component</w:t>
       </w:r>
     </w:p>
     <w:p>
@@ -5922,7 +5935,7 @@
         <w:ind w:left="360"/>
       </w:pPr>
       <w:r>
-        <w:t>From a folder, click Tag Faces to enter selection mode.</w:t>
+        <w:t>Click the Faces tab in the sidebar.</w:t>
       </w:r>
     </w:p>
     <w:p>
@@ -5931,7 +5944,16 @@
         <w:ind w:left="360"/>
       </w:pPr>
       <w:r>
-        <w:t>Check the photos you want DMS to scan for faces.</w:t>
+        <w:t>If the component (deepface) isn't installed yet, a prompt explains this and offers an Auto-install deepface button.</w:t>
+      </w:r>
+    </w:p>
+    <w:p>
+      <w:pPr>
+        <w:pStyle w:val="ListNumber"/>
+        <w:ind w:left="360"/>
+      </w:pPr>
+      <w:r>
+        <w:t>Click it and wait - this downloads TensorFlow and related libraries in the background and can take several minutes on a slow connection; you can keep using the rest of the app meanwhile.</w:t>
       </w:r>
     </w:p>
     <w:p>
@@ -5950,7 +5972,7 @@
               <a:graphicData uri="http://schemas.openxmlformats.org/drawingml/2006/picture">
                 <pic:pic>
                   <pic:nvPicPr>
-                    <pic:cNvPr id="0" name="21_face_select_mode.png"/>
+                    <pic:cNvPr id="0" name="16_face_tab.png"/>
                     <pic:cNvPicPr/>
                   </pic:nvPicPr>
                   <pic:blipFill>
@@ -5983,17 +6005,37 @@
           <w:color w:val="707070"/>
           <w:sz w:val="18"/>
         </w:rPr>
-        <w:t>Figure 10-2  Selection mode: photos checked for face detection</w:t>
+        <w:t>Figure 10-1  The Faces tab (shown here with the component already installed, hence the empty state; before installing, you'd instead see a prompt with an Auto-install deepface button)</w:t>
       </w:r>
     </w:p>
     <w:p/>
+    <w:p>
+      <w:pPr>
+        <w:pStyle w:val="Heading2"/>
+      </w:pPr>
+      <w:r>
+        <w:rPr>
+          <w:color w:val="1D4E89"/>
+        </w:rPr>
+        <w:t>10.2  Tagging Faces</w:t>
+      </w:r>
+    </w:p>
     <w:p>
       <w:pPr>
         <w:pStyle w:val="ListNumber"/>
         <w:ind w:left="360"/>
       </w:pPr>
       <w:r>
-        <w:t>Click to run detection; DMS finds faces in the checked photos.</w:t>
+        <w:t>From a folder, click Tag Faces to enter selection mode.</w:t>
+      </w:r>
+    </w:p>
+    <w:p>
+      <w:pPr>
+        <w:pStyle w:val="ListNumber"/>
+        <w:ind w:left="360"/>
+      </w:pPr>
+      <w:r>
+        <w:t>Check the photos you want DMS to scan for faces.</w:t>
       </w:r>
     </w:p>
     <w:p>
@@ -6012,7 +6054,7 @@
               <a:graphicData uri="http://schemas.openxmlformats.org/drawingml/2006/picture">
                 <pic:pic>
                   <pic:nvPicPr>
-                    <pic:cNvPr id="0" name="22_face_tagging_dialog.png"/>
+                    <pic:cNvPr id="0" name="21_face_select_mode.png"/>
                     <pic:cNvPicPr/>
                   </pic:nvPicPr>
                   <pic:blipFill>
@@ -6045,7 +6087,7 @@
           <w:color w:val="707070"/>
           <w:sz w:val="18"/>
         </w:rPr>
-        <w:t>Figure 10-3  Face detection in progress</w:t>
+        <w:t>Figure 10-2  Selection mode: photos checked for face detection</w:t>
       </w:r>
     </w:p>
     <w:p/>
@@ -6055,329 +6097,7 @@
         <w:ind w:left="360"/>
       </w:pPr>
       <w:r>
-        <w:t>For each detected face, type a person's name (or pick an existing one) to tag it.</w:t>
-      </w:r>
-    </w:p>
-    <w:p>
-      <w:pPr>
-        <w:pStyle w:val="Heading2"/>
-      </w:pPr>
-      <w:r>
-        <w:rPr>
-          <w:color w:val="1D4E89"/>
-        </w:rPr>
-        <w:t>10.3  Browsing by Person / Auto-Matching</w:t>
-      </w:r>
-    </w:p>
-    <w:p>
-      <w:r>
-        <w:t>Once some faces are tagged, the Faces tab lets you browse photos grouped by person. New photos you tag later are automatically compared against known faces and suggested matches, so you don't have to name every single photo of the same person from scratch.</w:t>
-      </w:r>
-    </w:p>
-    <w:p>
-      <w:r>
-        <w:br w:type="page"/>
-      </w:r>
-    </w:p>
-    <w:p>
-      <w:pPr>
-        <w:pStyle w:val="Heading1"/>
-      </w:pPr>
-      <w:r>
-        <w:rPr>
-          <w:color w:val="1E40AF"/>
-        </w:rPr>
-        <w:t>11  Remote and Mobile Upload</w:t>
-      </w:r>
-    </w:p>
-    <w:p>
-      <w:pPr>
-        <w:pStyle w:val="Heading2"/>
-      </w:pPr>
-      <w:r>
-        <w:rPr>
-          <w:color w:val="1D4E89"/>
-        </w:rPr>
-        <w:t>11.1  Sending a Single Document to a Phone</w:t>
-      </w:r>
-    </w:p>
-    <w:p>
-      <w:r>
-        <w:t>Click the “send to phone” icon on any document card to generate a link that opens the document directly on a phone's browser - share it by SMS/iMessage, or copy the link and send it any way you like.</w:t>
-      </w:r>
-    </w:p>
-    <w:p>
-      <w:pPr>
-        <w:pStyle w:val="Heading2"/>
-      </w:pPr>
-      <w:r>
-        <w:rPr>
-          <w:color w:val="1D4E89"/>
-        </w:rPr>
-        <w:t>11.2  Remote Upload (QR-Code Batch Intake)</w:t>
-      </w:r>
-    </w:p>
-    <w:p>
-      <w:r>
-        <w:t>To receive a batch of photos or files from someone else's phone (or your own) without emailing them one by one, use Remote Upload from the desktop launcher: it shows a QR code that, once scanned, opens an upload page on the phone's browser, and anything uploaded there lands directly in the folder you chose on the desktop.</w:t>
-      </w:r>
-    </w:p>
-    <w:p>
-      <w:pPr>
-        <w:ind w:left="576" w:right="576"/>
-        <w:shd w:val="clear" w:color="auto" w:fill="FFF8E1"/>
-      </w:pPr>
-      <w:r>
-        <w:rPr>
-          <w:b/>
-          <w:color w:val="924E00"/>
-        </w:rPr>
-        <w:t xml:space="preserve">Note: </w:t>
-      </w:r>
-      <w:r>
-        <w:t>Remote upload works over your local network by default; sending or receiving across the open internet requires the tunnel/ngrok setup described alongside that feature in the app, which is outside the scope of this manual section.</w:t>
-      </w:r>
-    </w:p>
-    <w:p>
-      <w:r>
-        <w:br w:type="page"/>
-      </w:r>
-    </w:p>
-    <w:p>
-      <w:pPr>
-        <w:pStyle w:val="Heading1"/>
-      </w:pPr>
-      <w:r>
-        <w:rPr>
-          <w:color w:val="1E40AF"/>
-        </w:rPr>
-        <w:t>12  Project Management</w:t>
-      </w:r>
-    </w:p>
-    <w:p>
-      <w:r>
-        <w:t>The Project menu (in the header bar) provides tools for backing up, restoring, merging, and importing data.</w:t>
-      </w:r>
-    </w:p>
-    <w:p>
-      <w:pPr>
-        <w:pStyle w:val="Heading2"/>
-      </w:pPr>
-      <w:r>
-        <w:rPr>
-          <w:color w:val="1D4E89"/>
-        </w:rPr>
-        <w:t>12.1  Export Index Backup (METADATA)</w:t>
-      </w:r>
-    </w:p>
-    <w:p>
-      <w:r>
-        <w:t>Backs up only the folder-tree structure and metadata (not the actual document files) as a .dms file, named with a METADATA- prefix. Much smaller and faster than a full backup - useful for structural snapshots.</w:t>
-      </w:r>
-    </w:p>
-    <w:p>
-      <w:pPr>
-        <w:pStyle w:val="Heading2"/>
-      </w:pPr>
-      <w:r>
-        <w:rPr>
-          <w:color w:val="1D4E89"/>
-        </w:rPr>
-        <w:t>12.2  Export Full Backup (COMP)</w:t>
-      </w:r>
-    </w:p>
-    <w:p>
-      <w:r>
-        <w:t>Backs up the entire folder tree and every document file, packaged as a .dms file with a COMP- prefix. This is a complete, self-contained backup of the project.</w:t>
-      </w:r>
-    </w:p>
-    <w:p>
-      <w:pPr>
-        <w:ind w:left="576" w:right="576"/>
-        <w:shd w:val="clear" w:color="auto" w:fill="E6F4EA"/>
-      </w:pPr>
-      <w:r>
-        <w:rPr>
-          <w:b/>
-          <w:color w:val="056F00"/>
-        </w:rPr>
-        <w:t xml:space="preserve">Tip: </w:t>
-      </w:r>
-      <w:r>
-        <w:rPr>
-          <w:color w:val="333333"/>
-        </w:rPr>
-        <w:t>Save this file to a USB drive or cloud storage as a regular backup.</w:t>
-      </w:r>
-    </w:p>
-    <w:p>
-      <w:pPr>
-        <w:pStyle w:val="Heading2"/>
-      </w:pPr>
-      <w:r>
-        <w:rPr>
-          <w:color w:val="1D4E89"/>
-        </w:rPr>
-        <w:t>12.3  Export Selected Folders (PART)</w:t>
-      </w:r>
-    </w:p>
-    <w:p>
-      <w:r>
-        <w:t>Lets you pick specific folders to export (with their files), producing a .dms file with a PART- prefix - useful for sharing or archiving just part of a project.</w:t>
-      </w:r>
-    </w:p>
-    <w:p>
-      <w:pPr>
-        <w:pStyle w:val="Heading2"/>
-      </w:pPr>
-      <w:r>
-        <w:rPr>
-          <w:color w:val="1D4E89"/>
-        </w:rPr>
-        <w:t>12.4  Backup Retention Rules</w:t>
-      </w:r>
-    </w:p>
-    <w:p>
-      <w:r>
-        <w:t>The project keeps the 10 most recent .dms backups in the project's root folder; older ones are automatically moved into a “Not Shown in The Tree” archive folder at the root of the storage directory (not to be confused with the similarly named “Not Show in Tree” node inside the document tree from section 3.2, which holds soft-deleted documents instead).</w:t>
-      </w:r>
-    </w:p>
-    <w:p>
-      <w:pPr>
-        <w:pStyle w:val="Heading2"/>
-      </w:pPr>
-      <w:r>
-        <w:rPr>
-          <w:color w:val="1D4E89"/>
-        </w:rPr>
-        <w:t>12.5  Import a Project (.dms)</w:t>
-      </w:r>
-    </w:p>
-    <w:p>
-      <w:pPr>
-        <w:pStyle w:val="ListNumber"/>
-        <w:ind w:left="360"/>
-      </w:pPr>
-      <w:r>
-        <w:t>Click Project, then Import Project (.dms) and select the file.</w:t>
-      </w:r>
-    </w:p>
-    <w:p>
-      <w:pPr>
-        <w:pStyle w:val="ListNumber"/>
-        <w:ind w:left="360"/>
-      </w:pPr>
-      <w:r>
-        <w:t>Choose a destination folder for the import (a new, empty folder is recommended).</w:t>
-      </w:r>
-    </w:p>
-    <w:p>
-      <w:pPr>
-        <w:pStyle w:val="ListNumber"/>
-        <w:ind w:left="360"/>
-      </w:pPr>
-      <w:r>
-        <w:t>Click Import and Switch.</w:t>
-      </w:r>
-    </w:p>
-    <w:p>
-      <w:pPr>
-        <w:pStyle w:val="ListNumber"/>
-        <w:ind w:left="360"/>
-      </w:pPr>
-      <w:r>
-        <w:t>DMS extracts the files and rebuilds the tree structure, and switches the active project to it.</w:t>
-      </w:r>
-    </w:p>
-    <w:p>
-      <w:pPr>
-        <w:ind w:left="576" w:right="576"/>
-        <w:shd w:val="clear" w:color="auto" w:fill="FFF8E1"/>
-      </w:pPr>
-      <w:r>
-        <w:rPr>
-          <w:b/>
-          <w:color w:val="924E00"/>
-        </w:rPr>
-        <w:t xml:space="preserve">Note: </w:t>
-      </w:r>
-      <w:r>
-        <w:t>Importing only restores the folder-tree structure; it never deletes files already on disk.</w:t>
-      </w:r>
-    </w:p>
-    <w:p>
-      <w:pPr>
-        <w:pStyle w:val="Heading2"/>
-      </w:pPr>
-      <w:r>
-        <w:rPr>
-          <w:color w:val="1D4E89"/>
-        </w:rPr>
-        <w:t>12.6  CSV Export</w:t>
-      </w:r>
-    </w:p>
-    <w:p>
-      <w:r>
-        <w:t>Click Project, then Export Metadata (CSV) to download a spreadsheet with one row per document, including document ID, name, size, upload date, and metadata fields. Open it in Excel or Google Sheets for analysis or sharing.</w:t>
-      </w:r>
-    </w:p>
-    <w:p>
-      <w:pPr>
-        <w:pStyle w:val="Heading2"/>
-      </w:pPr>
-      <w:r>
-        <w:rPr>
-          <w:color w:val="1D4E89"/>
-        </w:rPr>
-        <w:t>12.7  Batch ZIP Import</w:t>
-      </w:r>
-    </w:p>
-    <w:p>
-      <w:r>
-        <w:t>Upload many files at once from a ZIP archive and have DMS automatically sort them into matching folders by filename prefix. Folders referenced by a filename must already exist in the tree; documents with an unrecognized folder name are left unlinked.</w:t>
-      </w:r>
-    </w:p>
-    <w:p>
-      <w:pPr>
-        <w:pStyle w:val="Heading2"/>
-      </w:pPr>
-      <w:r>
-        <w:rPr>
-          <w:color w:val="1D4E89"/>
-        </w:rPr>
-        <w:t>12.8  Hierarchy Import (with auto de-duplication)</w:t>
-      </w:r>
-    </w:p>
-    <w:p>
-      <w:r>
-        <w:t>Builds a folder tree quickly from a plain text file.</w:t>
-      </w:r>
-    </w:p>
-    <w:p>
-      <w:pPr>
-        <w:pStyle w:val="ListNumber"/>
-        <w:ind w:left="360"/>
-      </w:pPr>
-      <w:r>
-        <w:t>Prepare a text file with 2-3 comma-separated columns per line: folder name, parent folder name, description (optional). The first line is the root folder, with the parent-folder column omitted for it.</w:t>
-      </w:r>
-    </w:p>
-    <w:p>
-      <w:pPr>
-        <w:pStyle w:val="ListNumber"/>
-        <w:ind w:left="360"/>
-      </w:pPr>
-      <w:r>
-        <w:t>Click Project, then Create Folder Tree from Hierarchy, and upload (or paste) the text.</w:t>
-      </w:r>
-    </w:p>
-    <w:p>
-      <w:pPr>
-        <w:pStyle w:val="ListNumber"/>
-        <w:ind w:left="360"/>
-      </w:pPr>
-      <w:r>
-        <w:t>DMS validates the structure and shows a preview, including any errors.</w:t>
+        <w:t>Click to run detection; DMS finds faces in the checked photos.</w:t>
       </w:r>
     </w:p>
     <w:p>
@@ -6396,7 +6116,7 @@
               <a:graphicData uri="http://schemas.openxmlformats.org/drawingml/2006/picture">
                 <pic:pic>
                   <pic:nvPicPr>
-                    <pic:cNvPr id="0" name="12_hierarchy_import_empty.png"/>
+                    <pic:cNvPr id="0" name="22_face_tagging_dialog.png"/>
                     <pic:cNvPicPr/>
                   </pic:nvPicPr>
                   <pic:blipFill>
@@ -6429,10 +6149,341 @@
           <w:color w:val="707070"/>
           <w:sz w:val="18"/>
         </w:rPr>
-        <w:t>Figure 12-1  The hierarchy import dialog (initial state)</w:t>
+        <w:t>Figure 10-3  Face detection in progress</w:t>
       </w:r>
     </w:p>
     <w:p/>
+    <w:p>
+      <w:pPr>
+        <w:pStyle w:val="ListNumber"/>
+        <w:ind w:left="360"/>
+      </w:pPr>
+      <w:r>
+        <w:t>For each detected face, type a person's name (or pick an existing one) to tag it.</w:t>
+      </w:r>
+    </w:p>
+    <w:p>
+      <w:pPr>
+        <w:pStyle w:val="Heading2"/>
+      </w:pPr>
+      <w:r>
+        <w:rPr>
+          <w:color w:val="1D4E89"/>
+        </w:rPr>
+        <w:t>10.3  Browsing by Person / Auto-Matching</w:t>
+      </w:r>
+    </w:p>
+    <w:p>
+      <w:r>
+        <w:t>Once some faces are tagged, the Faces tab lets you browse photos grouped by person. New photos you tag later are automatically compared against known faces and suggested matches, so you don't have to name every single photo of the same person from scratch.</w:t>
+      </w:r>
+    </w:p>
+    <w:p>
+      <w:r>
+        <w:br w:type="page"/>
+      </w:r>
+    </w:p>
+    <w:p>
+      <w:pPr>
+        <w:pStyle w:val="Heading1"/>
+      </w:pPr>
+      <w:r>
+        <w:rPr>
+          <w:color w:val="1E40AF"/>
+        </w:rPr>
+        <w:t>11  Remote and Mobile Upload</w:t>
+      </w:r>
+    </w:p>
+    <w:p>
+      <w:pPr>
+        <w:pStyle w:val="Heading2"/>
+      </w:pPr>
+      <w:r>
+        <w:rPr>
+          <w:color w:val="1D4E89"/>
+        </w:rPr>
+        <w:t>11.1  Sending a Single Document to a Phone</w:t>
+      </w:r>
+    </w:p>
+    <w:p>
+      <w:r>
+        <w:t>Click the “send to phone” icon on any document card to generate a link that opens the document directly on a phone's browser - share it by SMS/iMessage, or copy the link and send it any way you like.</w:t>
+      </w:r>
+    </w:p>
+    <w:p>
+      <w:pPr>
+        <w:pStyle w:val="Heading2"/>
+      </w:pPr>
+      <w:r>
+        <w:rPr>
+          <w:color w:val="1D4E89"/>
+        </w:rPr>
+        <w:t>11.2  Remote Upload (QR-Code Batch Intake)</w:t>
+      </w:r>
+    </w:p>
+    <w:p>
+      <w:r>
+        <w:t>To receive a batch of photos or files from someone else's phone (or your own) without emailing them one by one, use Remote Upload from the desktop launcher: it shows a QR code that, once scanned, opens an upload page on the phone's browser, and anything uploaded there lands directly in the folder you chose on the desktop.</w:t>
+      </w:r>
+    </w:p>
+    <w:p>
+      <w:pPr>
+        <w:ind w:left="576" w:right="576"/>
+        <w:shd w:val="clear" w:color="auto" w:fill="FFF8E1"/>
+      </w:pPr>
+      <w:r>
+        <w:rPr>
+          <w:b/>
+          <w:color w:val="924E00"/>
+        </w:rPr>
+        <w:t xml:space="preserve">Note: </w:t>
+      </w:r>
+      <w:r>
+        <w:t>Remote upload works over your local network by default; sending or receiving across the open internet requires the tunnel/ngrok setup described alongside that feature in the app, which is outside the scope of this manual section.</w:t>
+      </w:r>
+    </w:p>
+    <w:p>
+      <w:r>
+        <w:br w:type="page"/>
+      </w:r>
+    </w:p>
+    <w:p>
+      <w:pPr>
+        <w:pStyle w:val="Heading1"/>
+      </w:pPr>
+      <w:r>
+        <w:rPr>
+          <w:color w:val="1E40AF"/>
+        </w:rPr>
+        <w:t>12  Project Management</w:t>
+      </w:r>
+    </w:p>
+    <w:p>
+      <w:r>
+        <w:t>The Project menu (in the header bar) provides tools for backing up, restoring, merging, and importing data.</w:t>
+      </w:r>
+    </w:p>
+    <w:p>
+      <w:pPr>
+        <w:pStyle w:val="Heading2"/>
+      </w:pPr>
+      <w:r>
+        <w:rPr>
+          <w:color w:val="1D4E89"/>
+        </w:rPr>
+        <w:t>12.1  Export Index Backup (METADATA)</w:t>
+      </w:r>
+    </w:p>
+    <w:p>
+      <w:r>
+        <w:t>Backs up only the folder-tree structure and metadata (not the actual document files) as a .dms file, named with a METADATA- prefix. Much smaller and faster than a full backup - useful for structural snapshots.</w:t>
+      </w:r>
+    </w:p>
+    <w:p>
+      <w:pPr>
+        <w:pStyle w:val="Heading2"/>
+      </w:pPr>
+      <w:r>
+        <w:rPr>
+          <w:color w:val="1D4E89"/>
+        </w:rPr>
+        <w:t>12.2  Export Full Backup (COMP)</w:t>
+      </w:r>
+    </w:p>
+    <w:p>
+      <w:r>
+        <w:t>Backs up the entire folder tree and every document file, packaged as a .dms file with a COMP- prefix. This is a complete, self-contained backup of the project.</w:t>
+      </w:r>
+    </w:p>
+    <w:p>
+      <w:pPr>
+        <w:ind w:left="576" w:right="576"/>
+        <w:shd w:val="clear" w:color="auto" w:fill="E6F4EA"/>
+      </w:pPr>
+      <w:r>
+        <w:rPr>
+          <w:b/>
+          <w:color w:val="056F00"/>
+        </w:rPr>
+        <w:t xml:space="preserve">Tip: </w:t>
+      </w:r>
+      <w:r>
+        <w:rPr>
+          <w:color w:val="333333"/>
+        </w:rPr>
+        <w:t>Save this file to a USB drive or cloud storage as a regular backup.</w:t>
+      </w:r>
+    </w:p>
+    <w:p>
+      <w:pPr>
+        <w:pStyle w:val="Heading2"/>
+      </w:pPr>
+      <w:r>
+        <w:rPr>
+          <w:color w:val="1D4E89"/>
+        </w:rPr>
+        <w:t>12.3  Export Selected Folders (PART)</w:t>
+      </w:r>
+    </w:p>
+    <w:p>
+      <w:r>
+        <w:t>Lets you pick specific folders to export (with their files), producing a .dms file with a PART- prefix - useful for sharing or archiving just part of a project.</w:t>
+      </w:r>
+    </w:p>
+    <w:p>
+      <w:pPr>
+        <w:pStyle w:val="Heading2"/>
+      </w:pPr>
+      <w:r>
+        <w:rPr>
+          <w:color w:val="1D4E89"/>
+        </w:rPr>
+        <w:t>12.4  Backup Retention Rules</w:t>
+      </w:r>
+    </w:p>
+    <w:p>
+      <w:r>
+        <w:t>The project keeps the 10 most recent .dms backups in the project's root folder; older ones are automatically moved into a “Not Shown in The Tree” archive folder at the root of the storage directory (not to be confused with the similarly named “Not Show in Tree” node inside the document tree from section 3.2, which holds soft-deleted documents instead).</w:t>
+      </w:r>
+    </w:p>
+    <w:p>
+      <w:pPr>
+        <w:pStyle w:val="Heading2"/>
+      </w:pPr>
+      <w:r>
+        <w:rPr>
+          <w:color w:val="1D4E89"/>
+        </w:rPr>
+        <w:t>12.5  Import a Project (.dms)</w:t>
+      </w:r>
+    </w:p>
+    <w:p>
+      <w:pPr>
+        <w:pStyle w:val="ListNumber"/>
+        <w:ind w:left="360"/>
+      </w:pPr>
+      <w:r>
+        <w:t>Click Project, then Import Project (.dms) and select the file.</w:t>
+      </w:r>
+    </w:p>
+    <w:p>
+      <w:pPr>
+        <w:pStyle w:val="ListNumber"/>
+        <w:ind w:left="360"/>
+      </w:pPr>
+      <w:r>
+        <w:t>Choose a destination folder for the import (a new, empty folder is recommended).</w:t>
+      </w:r>
+    </w:p>
+    <w:p>
+      <w:pPr>
+        <w:pStyle w:val="ListNumber"/>
+        <w:ind w:left="360"/>
+      </w:pPr>
+      <w:r>
+        <w:t>Click Import and Switch.</w:t>
+      </w:r>
+    </w:p>
+    <w:p>
+      <w:pPr>
+        <w:pStyle w:val="ListNumber"/>
+        <w:ind w:left="360"/>
+      </w:pPr>
+      <w:r>
+        <w:t>DMS extracts the files and rebuilds the tree structure, and switches the active project to it.</w:t>
+      </w:r>
+    </w:p>
+    <w:p>
+      <w:pPr>
+        <w:ind w:left="576" w:right="576"/>
+        <w:shd w:val="clear" w:color="auto" w:fill="FFF8E1"/>
+      </w:pPr>
+      <w:r>
+        <w:rPr>
+          <w:b/>
+          <w:color w:val="924E00"/>
+        </w:rPr>
+        <w:t xml:space="preserve">Note: </w:t>
+      </w:r>
+      <w:r>
+        <w:t>Importing only restores the folder-tree structure; it never deletes files already on disk.</w:t>
+      </w:r>
+    </w:p>
+    <w:p>
+      <w:pPr>
+        <w:pStyle w:val="Heading2"/>
+      </w:pPr>
+      <w:r>
+        <w:rPr>
+          <w:color w:val="1D4E89"/>
+        </w:rPr>
+        <w:t>12.6  CSV Export</w:t>
+      </w:r>
+    </w:p>
+    <w:p>
+      <w:r>
+        <w:t>Click Project, then Export Metadata (CSV) to download a spreadsheet with one row per document, including document ID, name, size, upload date, and metadata fields. Open it in Excel or Google Sheets for analysis or sharing.</w:t>
+      </w:r>
+    </w:p>
+    <w:p>
+      <w:pPr>
+        <w:pStyle w:val="Heading2"/>
+      </w:pPr>
+      <w:r>
+        <w:rPr>
+          <w:color w:val="1D4E89"/>
+        </w:rPr>
+        <w:t>12.7  Batch ZIP Import</w:t>
+      </w:r>
+    </w:p>
+    <w:p>
+      <w:r>
+        <w:t>Upload many files at once from a ZIP archive and have DMS automatically sort them into matching folders by filename prefix. Folders referenced by a filename must already exist in the tree; documents with an unrecognized folder name are left unlinked.</w:t>
+      </w:r>
+    </w:p>
+    <w:p>
+      <w:pPr>
+        <w:pStyle w:val="Heading2"/>
+      </w:pPr>
+      <w:r>
+        <w:rPr>
+          <w:color w:val="1D4E89"/>
+        </w:rPr>
+        <w:t>12.8  Hierarchy Import (with auto de-duplication)</w:t>
+      </w:r>
+    </w:p>
+    <w:p>
+      <w:r>
+        <w:t>Builds a folder tree quickly from a plain text file.</w:t>
+      </w:r>
+    </w:p>
+    <w:p>
+      <w:pPr>
+        <w:pStyle w:val="ListNumber"/>
+        <w:ind w:left="360"/>
+      </w:pPr>
+      <w:r>
+        <w:t>Prepare a text file with 2-3 comma-separated columns per line: folder name, parent folder name, description (optional). The first line is the root folder, with the parent-folder column omitted for it.</w:t>
+      </w:r>
+    </w:p>
+    <w:p>
+      <w:pPr>
+        <w:pStyle w:val="ListNumber"/>
+        <w:ind w:left="360"/>
+      </w:pPr>
+      <w:r>
+        <w:t>Click Project, then Create Folder Tree from Hierarchy, and upload (or paste) the text.</w:t>
+      </w:r>
+    </w:p>
+    <w:p>
+      <w:pPr>
+        <w:pStyle w:val="ListNumber"/>
+        <w:ind w:left="360"/>
+      </w:pPr>
+      <w:r>
+        <w:t>DMS validates the structure and shows a preview, including any errors.</w:t>
+      </w:r>
+    </w:p>
     <w:p>
       <w:pPr>
         <w:jc w:val="center"/>
@@ -6449,7 +6500,7 @@
               <a:graphicData uri="http://schemas.openxmlformats.org/drawingml/2006/picture">
                 <pic:pic>
                   <pic:nvPicPr>
-                    <pic:cNvPr id="0" name="14_hierarchy_import_error.png"/>
+                    <pic:cNvPr id="0" name="12_hierarchy_import_empty.png"/>
                     <pic:cNvPicPr/>
                   </pic:nvPicPr>
                   <pic:blipFill>
@@ -6482,7 +6533,7 @@
           <w:color w:val="707070"/>
           <w:sz w:val="18"/>
         </w:rPr>
-        <w:t>Figure 12-2  With auto-numbering off, a duplicate folder name is flagged as an error</w:t>
+        <w:t>Figure 12-1  The hierarchy import dialog (initial state)</w:t>
       </w:r>
     </w:p>
     <w:p/>
@@ -6502,7 +6553,7 @@
               <a:graphicData uri="http://schemas.openxmlformats.org/drawingml/2006/picture">
                 <pic:pic>
                   <pic:nvPicPr>
-                    <pic:cNvPr id="0" name="15_hierarchy_import_dedupe_ok.png"/>
+                    <pic:cNvPr id="0" name="14_hierarchy_import_error.png"/>
                     <pic:cNvPicPr/>
                   </pic:nvPicPr>
                   <pic:blipFill>
@@ -6535,35 +6586,10 @@
           <w:color w:val="707070"/>
           <w:sz w:val="18"/>
         </w:rPr>
-        <w:t>Figure 12-3  With auto-numbering on, the duplicate name is numbered and passes validation</w:t>
+        <w:t>Figure 12-2  With auto-numbering off, a duplicate folder name is flagged as an error</w:t>
       </w:r>
     </w:p>
     <w:p/>
-    <w:p>
-      <w:pPr>
-        <w:pStyle w:val="ListNumber"/>
-        <w:ind w:left="360"/>
-      </w:pPr>
-      <w:r>
-        <w:t>Click Create; all folders appear in the tree immediately.</w:t>
-      </w:r>
-    </w:p>
-    <w:p>
-      <w:pPr>
-        <w:pStyle w:val="Heading2"/>
-      </w:pPr>
-      <w:r>
-        <w:rPr>
-          <w:color w:val="1D4E89"/>
-        </w:rPr>
-        <w:t>12.9  Downloading This Manual from Inside the App</w:t>
-      </w:r>
-    </w:p>
-    <w:p>
-      <w:r>
-        <w:t>Click Project, then Download User Manual (.docx) under the Downloads section, to get the same manual you're reading now, generated fresh from inside the running app.</w:t>
-      </w:r>
-    </w:p>
     <w:p>
       <w:pPr>
         <w:jc w:val="center"/>
@@ -6580,7 +6606,7 @@
               <a:graphicData uri="http://schemas.openxmlformats.org/drawingml/2006/picture">
                 <pic:pic>
                   <pic:nvPicPr>
-                    <pic:cNvPr id="0" name="11_project_menu.png"/>
+                    <pic:cNvPr id="0" name="15_hierarchy_import_dedupe_ok.png"/>
                     <pic:cNvPicPr/>
                   </pic:nvPicPr>
                   <pic:blipFill>
@@ -6613,24 +6639,17 @@
           <w:color w:val="707070"/>
           <w:sz w:val="18"/>
         </w:rPr>
-        <w:t>Figure 12-4  The Project menu: export, import, and settings</w:t>
+        <w:t>Figure 12-3  With auto-numbering on, the duplicate name is numbered and passes validation</w:t>
       </w:r>
     </w:p>
     <w:p/>
     <w:p>
-      <w:r>
-        <w:br w:type="page"/>
-      </w:r>
-    </w:p>
-    <w:p>
-      <w:pPr>
-        <w:pStyle w:val="Heading1"/>
-      </w:pPr>
-      <w:r>
-        <w:rPr>
-          <w:color w:val="1E40AF"/>
-        </w:rPr>
-        <w:t>13  Cloud Sync and Email</w:t>
+      <w:pPr>
+        <w:pStyle w:val="ListNumber"/>
+        <w:ind w:left="360"/>
+      </w:pPr>
+      <w:r>
+        <w:t>Click Create; all folders appear in the tree immediately.</w:t>
       </w:r>
     </w:p>
     <w:p>
@@ -6641,71 +6660,12 @@
         <w:rPr>
           <w:color w:val="1D4E89"/>
         </w:rPr>
-        <w:t>13.1  Using OneDrive to Sync Storage</w:t>
-      </w:r>
-    </w:p>
-    <w:p>
-      <w:r>
-        <w:t>Pointing your DMS storage folder at a location synced by OneDrive (or a similar cloud-sync service) gives you automatic off-site backup with no extra steps - every change DMS makes on disk gets picked up and uploaded by the sync client in the background, the same as any other file in that folder.</w:t>
-      </w:r>
-    </w:p>
-    <w:p>
-      <w:pPr>
-        <w:ind w:left="576" w:right="576"/>
-        <w:shd w:val="clear" w:color="auto" w:fill="FFF8E1"/>
-      </w:pPr>
-      <w:r>
-        <w:rPr>
-          <w:b/>
-          <w:color w:val="924E00"/>
-        </w:rPr>
-        <w:t xml:space="preserve">Note: </w:t>
-      </w:r>
-      <w:r>
-        <w:t>Very large libraries, or a very slow internet connection, can make cloud sync lag behind your local changes; this is a property of the sync client, not of DMS.</w:t>
-      </w:r>
-    </w:p>
-    <w:p>
-      <w:pPr>
-        <w:pStyle w:val="Heading2"/>
-      </w:pPr>
-      <w:r>
-        <w:rPr>
-          <w:color w:val="1D4E89"/>
-        </w:rPr>
-        <w:t>13.2  Email Sending Setup</w:t>
-      </w:r>
-    </w:p>
-    <w:p>
-      <w:r>
-        <w:t>To use the “email” action on a document card, configure an SMTP account first.</w:t>
-      </w:r>
-    </w:p>
-    <w:p>
-      <w:pPr>
-        <w:pStyle w:val="ListNumber"/>
-        <w:ind w:left="360"/>
-      </w:pPr>
-      <w:r>
-        <w:t>Click Project, then Email Sending Setup.</w:t>
-      </w:r>
-    </w:p>
-    <w:p>
-      <w:pPr>
-        <w:pStyle w:val="ListNumber"/>
-        <w:ind w:left="360"/>
-      </w:pPr>
-      <w:r>
-        <w:t>Enter your SMTP server, port, username, and password (an app-specific password is usually required for Gmail/Outlook accounts with two-factor authentication).</w:t>
-      </w:r>
-    </w:p>
-    <w:p>
-      <w:pPr>
-        <w:pStyle w:val="ListNumber"/>
-        <w:ind w:left="360"/>
-      </w:pPr>
-      <w:r>
-        <w:t>Save the settings; DMS uses them to send documents as attachments going forward.</w:t>
+        <w:t>12.9  Downloading This Manual from Inside the App</w:t>
+      </w:r>
+    </w:p>
+    <w:p>
+      <w:r>
+        <w:t>Click Project, then Download User Manual (.docx) under the Downloads section, to get the same manual you're reading now, generated fresh from inside the running app.</w:t>
       </w:r>
     </w:p>
     <w:p>
@@ -6724,7 +6684,7 @@
               <a:graphicData uri="http://schemas.openxmlformats.org/drawingml/2006/picture">
                 <pic:pic>
                   <pic:nvPicPr>
-                    <pic:cNvPr id="0" name="20_email_settings.png"/>
+                    <pic:cNvPr id="0" name="11_project_menu.png"/>
                     <pic:cNvPicPr/>
                   </pic:nvPicPr>
                   <pic:blipFill>
@@ -6757,10 +6717,42 @@
           <w:color w:val="707070"/>
           <w:sz w:val="18"/>
         </w:rPr>
-        <w:t>Figure 13-1  Email sending (SMTP) settings dialog</w:t>
+        <w:t>Figure 12-4  The Project menu: export, import, and settings</w:t>
       </w:r>
     </w:p>
     <w:p/>
+    <w:p>
+      <w:r>
+        <w:br w:type="page"/>
+      </w:r>
+    </w:p>
+    <w:p>
+      <w:pPr>
+        <w:pStyle w:val="Heading1"/>
+      </w:pPr>
+      <w:r>
+        <w:rPr>
+          <w:color w:val="1E40AF"/>
+        </w:rPr>
+        <w:t>13  Cloud Sync and Email</w:t>
+      </w:r>
+    </w:p>
+    <w:p>
+      <w:pPr>
+        <w:pStyle w:val="Heading2"/>
+      </w:pPr>
+      <w:r>
+        <w:rPr>
+          <w:color w:val="1D4E89"/>
+        </w:rPr>
+        <w:t>13.1  Using OneDrive to Sync Storage</w:t>
+      </w:r>
+    </w:p>
+    <w:p>
+      <w:r>
+        <w:t>Pointing your DMS storage folder at a location synced by OneDrive (or a similar cloud-sync service) gives you automatic off-site backup with no extra steps - every change DMS makes on disk gets picked up and uploaded by the sync client in the background, the same as any other file in that folder.</w:t>
+      </w:r>
+    </w:p>
     <w:p>
       <w:pPr>
         <w:ind w:left="576" w:right="576"/>
@@ -6774,33 +6766,23 @@
         <w:t xml:space="preserve">Note: </w:t>
       </w:r>
       <w:r>
-        <w:t>On Mac, if SMTP hasn't been configured, clicking the email action instead opens your system Mail app with the document attached, so the feature still works without any setup.</w:t>
-      </w:r>
-    </w:p>
-    <w:p>
-      <w:r>
-        <w:br w:type="page"/>
-      </w:r>
-    </w:p>
-    <w:p>
-      <w:pPr>
-        <w:pStyle w:val="Heading1"/>
+        <w:t>Very large libraries, or a very slow internet connection, can make cloud sync lag behind your local changes; this is a property of the sync client, not of DMS.</w:t>
+      </w:r>
+    </w:p>
+    <w:p>
+      <w:pPr>
+        <w:pStyle w:val="Heading2"/>
       </w:pPr>
       <w:r>
         <w:rPr>
-          <w:color w:val="1E40AF"/>
+          <w:color w:val="1D4E89"/>
         </w:rPr>
-        <w:t>14  Password Protection</w:t>
-      </w:r>
-    </w:p>
-    <w:p>
-      <w:r>
-        <w:t>You can protect DMS with a password so that only authorized users can access the data - strongly recommended once you've enabled LAN access, remote upload, or saved any website login credentials (section 3.6).</w:t>
-      </w:r>
-    </w:p>
-    <w:p>
-      <w:r>
-        <w:t>Set a password:</w:t>
+        <w:t>13.2  Email Sending Setup</w:t>
+      </w:r>
+    </w:p>
+    <w:p>
+      <w:r>
+        <w:t>To use the “email” action on a document card, configure an SMTP account first.</w:t>
       </w:r>
     </w:p>
     <w:p>
@@ -6809,7 +6791,7 @@
         <w:ind w:left="360"/>
       </w:pPr>
       <w:r>
-        <w:t>Click Project, then Set Password.</w:t>
+        <w:t>Click Project, then Email Sending Setup.</w:t>
       </w:r>
     </w:p>
     <w:p>
@@ -6818,7 +6800,7 @@
         <w:ind w:left="360"/>
       </w:pPr>
       <w:r>
-        <w:t>Enter and confirm your chosen password.</w:t>
+        <w:t>Enter your SMTP server, port, username, and password (an app-specific password is usually required for Gmail/Outlook accounts with two-factor authentication).</w:t>
       </w:r>
     </w:p>
     <w:p>
@@ -6827,87 +6809,7 @@
         <w:ind w:left="360"/>
       </w:pPr>
       <w:r>
-        <w:t>Click Set.</w:t>
-      </w:r>
-    </w:p>
-    <w:p>
-      <w:pPr>
-        <w:pStyle w:val="ListNumber"/>
-        <w:ind w:left="360"/>
-      </w:pPr>
-      <w:r>
-        <w:t>On the next DMS startup, a login screen appears before the main interface.</w:t>
-      </w:r>
-    </w:p>
-    <w:p>
-      <w:r>
-        <w:t>Remove the password:</w:t>
-      </w:r>
-    </w:p>
-    <w:p>
-      <w:pPr>
-        <w:pStyle w:val="ListNumber"/>
-        <w:ind w:left="360"/>
-      </w:pPr>
-      <w:r>
-        <w:t>Click Project, then Change Password.</w:t>
-      </w:r>
-    </w:p>
-    <w:p>
-      <w:pPr>
-        <w:pStyle w:val="ListNumber"/>
-        <w:ind w:left="360"/>
-      </w:pPr>
-      <w:r>
-        <w:t>Enter your current password to confirm, then leave the new password fields blank.</w:t>
-      </w:r>
-    </w:p>
-    <w:p>
-      <w:pPr>
-        <w:pStyle w:val="ListNumber"/>
-        <w:ind w:left="360"/>
-      </w:pPr>
-      <w:r>
-        <w:t>Click Set to remove password protection.</w:t>
-      </w:r>
-    </w:p>
-    <w:p>
-      <w:r>
-        <w:t>Logout:</w:t>
-      </w:r>
-    </w:p>
-    <w:p>
-      <w:pPr>
-        <w:pStyle w:val="ListBullet"/>
-        <w:ind w:left="360"/>
-      </w:pPr>
-      <w:r>
-        <w:t>Click Logout in the header bar.</w:t>
-      </w:r>
-    </w:p>
-    <w:p>
-      <w:pPr>
-        <w:pStyle w:val="ListBullet"/>
-        <w:ind w:left="360"/>
-      </w:pPr>
-      <w:r>
-        <w:t>DMS returns to the login screen. The server keeps running; only the browser session ends.</w:t>
-      </w:r>
-    </w:p>
-    <w:p>
-      <w:pPr>
-        <w:ind w:left="576" w:right="576"/>
-        <w:shd w:val="clear" w:color="auto" w:fill="FFF8E1"/>
-      </w:pPr>
-      <w:r>
-        <w:rPr>
-          <w:b/>
-          <w:color w:val="924E00"/>
-        </w:rPr>
-        <w:t xml:space="preserve">Note: </w:t>
-      </w:r>
-      <w:r>
-        <w:t>The password is stored as a salted hash on the server (SHA-256, 100,000 iterations) - never in plain text. A folder's saved website login password (section 3.6) uses a separate, independent reversible-encryption scheme; the two don't affect each other.</w:t>
+        <w:t>Save the settings; DMS uses them to send documents as attachments going forward.</w:t>
       </w:r>
     </w:p>
     <w:p>
@@ -6926,11 +6828,213 @@
               <a:graphicData uri="http://schemas.openxmlformats.org/drawingml/2006/picture">
                 <pic:pic>
                   <pic:nvPicPr>
+                    <pic:cNvPr id="0" name="20_email_settings.png"/>
+                    <pic:cNvPicPr/>
+                  </pic:nvPicPr>
+                  <pic:blipFill>
+                    <a:blip r:embed="rId40"/>
+                    <a:stretch>
+                      <a:fillRect/>
+                    </a:stretch>
+                  </pic:blipFill>
+                  <pic:spPr>
+                    <a:xfrm>
+                      <a:off x="0" y="0"/>
+                      <a:ext cx="5486400" cy="3429000"/>
+                    </a:xfrm>
+                    <a:prstGeom prst="rect"/>
+                  </pic:spPr>
+                </pic:pic>
+              </a:graphicData>
+            </a:graphic>
+          </wp:inline>
+        </w:drawing>
+      </w:r>
+    </w:p>
+    <w:p>
+      <w:pPr>
+        <w:jc w:val="center"/>
+      </w:pPr>
+      <w:r>
+        <w:rPr>
+          <w:i/>
+          <w:color w:val="707070"/>
+          <w:sz w:val="18"/>
+        </w:rPr>
+        <w:t>Figure 13-1  Email sending (SMTP) settings dialog</w:t>
+      </w:r>
+    </w:p>
+    <w:p/>
+    <w:p>
+      <w:pPr>
+        <w:ind w:left="576" w:right="576"/>
+        <w:shd w:val="clear" w:color="auto" w:fill="FFF8E1"/>
+      </w:pPr>
+      <w:r>
+        <w:rPr>
+          <w:b/>
+          <w:color w:val="924E00"/>
+        </w:rPr>
+        <w:t xml:space="preserve">Note: </w:t>
+      </w:r>
+      <w:r>
+        <w:t>On Mac, if SMTP hasn't been configured, clicking the email action instead opens your system Mail app with the document attached, so the feature still works without any setup.</w:t>
+      </w:r>
+    </w:p>
+    <w:p>
+      <w:r>
+        <w:br w:type="page"/>
+      </w:r>
+    </w:p>
+    <w:p>
+      <w:pPr>
+        <w:pStyle w:val="Heading1"/>
+      </w:pPr>
+      <w:r>
+        <w:rPr>
+          <w:color w:val="1E40AF"/>
+        </w:rPr>
+        <w:t>14  Password Protection</w:t>
+      </w:r>
+    </w:p>
+    <w:p>
+      <w:r>
+        <w:t>You can protect DMS with a password so that only authorized users can access the data - strongly recommended once you've enabled LAN access, remote upload, or saved any website login credentials (section 3.6).</w:t>
+      </w:r>
+    </w:p>
+    <w:p>
+      <w:r>
+        <w:t>Set a password:</w:t>
+      </w:r>
+    </w:p>
+    <w:p>
+      <w:pPr>
+        <w:pStyle w:val="ListNumber"/>
+        <w:ind w:left="360"/>
+      </w:pPr>
+      <w:r>
+        <w:t>Click Project, then Set Password.</w:t>
+      </w:r>
+    </w:p>
+    <w:p>
+      <w:pPr>
+        <w:pStyle w:val="ListNumber"/>
+        <w:ind w:left="360"/>
+      </w:pPr>
+      <w:r>
+        <w:t>Enter and confirm your chosen password.</w:t>
+      </w:r>
+    </w:p>
+    <w:p>
+      <w:pPr>
+        <w:pStyle w:val="ListNumber"/>
+        <w:ind w:left="360"/>
+      </w:pPr>
+      <w:r>
+        <w:t>Click Set.</w:t>
+      </w:r>
+    </w:p>
+    <w:p>
+      <w:pPr>
+        <w:pStyle w:val="ListNumber"/>
+        <w:ind w:left="360"/>
+      </w:pPr>
+      <w:r>
+        <w:t>On the next DMS startup, a login screen appears before the main interface.</w:t>
+      </w:r>
+    </w:p>
+    <w:p>
+      <w:r>
+        <w:t>Remove the password:</w:t>
+      </w:r>
+    </w:p>
+    <w:p>
+      <w:pPr>
+        <w:pStyle w:val="ListNumber"/>
+        <w:ind w:left="360"/>
+      </w:pPr>
+      <w:r>
+        <w:t>Click Project, then Change Password.</w:t>
+      </w:r>
+    </w:p>
+    <w:p>
+      <w:pPr>
+        <w:pStyle w:val="ListNumber"/>
+        <w:ind w:left="360"/>
+      </w:pPr>
+      <w:r>
+        <w:t>Enter your current password to confirm, then leave the new password fields blank.</w:t>
+      </w:r>
+    </w:p>
+    <w:p>
+      <w:pPr>
+        <w:pStyle w:val="ListNumber"/>
+        <w:ind w:left="360"/>
+      </w:pPr>
+      <w:r>
+        <w:t>Click Set to remove password protection.</w:t>
+      </w:r>
+    </w:p>
+    <w:p>
+      <w:r>
+        <w:t>Logout:</w:t>
+      </w:r>
+    </w:p>
+    <w:p>
+      <w:pPr>
+        <w:pStyle w:val="ListBullet"/>
+        <w:ind w:left="360"/>
+      </w:pPr>
+      <w:r>
+        <w:t>Click Logout in the header bar.</w:t>
+      </w:r>
+    </w:p>
+    <w:p>
+      <w:pPr>
+        <w:pStyle w:val="ListBullet"/>
+        <w:ind w:left="360"/>
+      </w:pPr>
+      <w:r>
+        <w:t>DMS returns to the login screen. The server keeps running; only the browser session ends.</w:t>
+      </w:r>
+    </w:p>
+    <w:p>
+      <w:pPr>
+        <w:ind w:left="576" w:right="576"/>
+        <w:shd w:val="clear" w:color="auto" w:fill="FFF8E1"/>
+      </w:pPr>
+      <w:r>
+        <w:rPr>
+          <w:b/>
+          <w:color w:val="924E00"/>
+        </w:rPr>
+        <w:t xml:space="preserve">Note: </w:t>
+      </w:r>
+      <w:r>
+        <w:t>The password is stored as a salted hash on the server (SHA-256, 100,000 iterations) - never in plain text. A folder's saved website login password (section 3.6) uses a separate, independent reversible-encryption scheme; the two don't affect each other.</w:t>
+      </w:r>
+    </w:p>
+    <w:p>
+      <w:pPr>
+        <w:jc w:val="center"/>
+      </w:pPr>
+      <w:r>
+        <w:drawing>
+          <wp:inline xmlns:a="http://schemas.openxmlformats.org/drawingml/2006/main" xmlns:pic="http://schemas.openxmlformats.org/drawingml/2006/picture">
+            <wp:extent cx="5486400" cy="3429000"/>
+            <wp:docPr id="33" name="Picture 33"/>
+            <wp:cNvGraphicFramePr>
+              <a:graphicFrameLocks noChangeAspect="1"/>
+            </wp:cNvGraphicFramePr>
+            <a:graphic>
+              <a:graphicData uri="http://schemas.openxmlformats.org/drawingml/2006/picture">
+                <pic:pic>
+                  <pic:nvPicPr>
                     <pic:cNvPr id="0" name="19_password_dialog.png"/>
                     <pic:cNvPicPr/>
                   </pic:nvPicPr>
                   <pic:blipFill>
-                    <a:blip r:embed="rId40"/>
+                    <a:blip r:embed="rId41"/>
                     <a:stretch>
                       <a:fillRect/>
                     </a:stretch>
@@ -7350,7 +7454,7 @@
         <w:drawing>
           <wp:inline xmlns:a="http://schemas.openxmlformats.org/drawingml/2006/main" xmlns:pic="http://schemas.openxmlformats.org/drawingml/2006/picture">
             <wp:extent cx="5486400" cy="2741275"/>
-            <wp:docPr id="33" name="Picture 33"/>
+            <wp:docPr id="34" name="Picture 34"/>
             <wp:cNvGraphicFramePr>
               <a:graphicFrameLocks noChangeAspect="1"/>
             </wp:cNvGraphicFramePr>
@@ -7362,7 +7466,7 @@
                     <pic:cNvPicPr/>
                   </pic:nvPicPr>
                   <pic:blipFill>
-                    <a:blip r:embed="rId41"/>
+                    <a:blip r:embed="rId42"/>
                     <a:stretch>
                       <a:fillRect/>
                     </a:stretch>
@@ -7520,7 +7624,7 @@
         <w:drawing>
           <wp:inline xmlns:a="http://schemas.openxmlformats.org/drawingml/2006/main" xmlns:pic="http://schemas.openxmlformats.org/drawingml/2006/picture">
             <wp:extent cx="5486400" cy="2737425"/>
-            <wp:docPr id="34" name="Picture 34"/>
+            <wp:docPr id="35" name="Picture 35"/>
             <wp:cNvGraphicFramePr>
               <a:graphicFrameLocks noChangeAspect="1"/>
             </wp:cNvGraphicFramePr>
@@ -7532,7 +7636,7 @@
                     <pic:cNvPicPr/>
                   </pic:nvPicPr>
                   <pic:blipFill>
-                    <a:blip r:embed="rId42"/>
+                    <a:blip r:embed="rId43"/>
                     <a:stretch>
                       <a:fillRect/>
                     </a:stretch>
@@ -7649,7 +7753,7 @@
         <w:drawing>
           <wp:inline xmlns:a="http://schemas.openxmlformats.org/drawingml/2006/main" xmlns:pic="http://schemas.openxmlformats.org/drawingml/2006/picture">
             <wp:extent cx="5486400" cy="2578748"/>
-            <wp:docPr id="35" name="Picture 35"/>
+            <wp:docPr id="36" name="Picture 36"/>
             <wp:cNvGraphicFramePr>
               <a:graphicFrameLocks noChangeAspect="1"/>
             </wp:cNvGraphicFramePr>
@@ -7661,7 +7765,7 @@
                     <pic:cNvPicPr/>
                   </pic:nvPicPr>
                   <pic:blipFill>
-                    <a:blip r:embed="rId43"/>
+                    <a:blip r:embed="rId44"/>
                     <a:stretch>
                       <a:fillRect/>
                     </a:stretch>

</xml_diff>

<commit_message>
Fill remaining feature-parity gaps found by auditing the app against both manuals
Audited every backend route and frontend UI element in dms_server.py/dms.html
against the manuals and documented what was missing: the photo-root folder
context-menu action, the document-list batch toolbar (multi-select
download/unlink, AI-fill-parameter, date+location batch rename, near-duplicate
photo detection), Gemini trend-chart analysis, mid-session storage-path
changes, mid-session blank-project creation, left/right arrow-key document
navigation, backup encryption when a project password is set, and the
setup-guide download links in the AI/SMTP/face-recognition dialogs.

Co-Authored-By: Claude Sonnet 5 <noreply@anthropic.com>
</commit_message>
<xml_diff>
--- a/PMS_User_Manual.docx
+++ b/PMS_User_Manual.docx
@@ -236,6 +236,14 @@
     </w:p>
     <w:p>
       <w:pPr>
+        <w:ind w:left="576"/>
+      </w:pPr>
+      <w:r>
+        <w:t>3.9  Setting a Photo Root Folder</w:t>
+      </w:r>
+    </w:p>
+    <w:p>
+      <w:pPr>
         <w:ind w:left="0"/>
       </w:pPr>
       <w:r>
@@ -335,6 +343,14 @@
     </w:p>
     <w:p>
       <w:pPr>
+        <w:ind w:left="576"/>
+      </w:pPr>
+      <w:r>
+        <w:t>4.12  Batch Document Actions (Multi-select: Download, Batch Rename, Find Near-Duplicates)</w:t>
+      </w:r>
+    </w:p>
+    <w:p>
+      <w:pPr>
         <w:ind w:left="0"/>
       </w:pPr>
       <w:r>
@@ -417,6 +433,14 @@
       </w:pPr>
       <w:r>
         <w:t>6.5  Parameter Trend Charts and Snapshots</w:t>
+      </w:r>
+    </w:p>
+    <w:p>
+      <w:pPr>
+        <w:ind w:left="576"/>
+      </w:pPr>
+      <w:r>
+        <w:t>6.6  Batch AI Parameter Extraction (Multi-select Documents)</w:t>
       </w:r>
     </w:p>
     <w:p>
@@ -1500,6 +1524,25 @@
           <w:color w:val="333333"/>
         </w:rPr>
         <w:t>Drag the vertical divider between the sidebar and the content panel to resize either side. Double-click the divider to reset to the default width.</w:t>
+      </w:r>
+    </w:p>
+    <w:p>
+      <w:pPr>
+        <w:ind w:left="576" w:right="576"/>
+        <w:shd w:val="clear" w:color="auto" w:fill="E6F4EA"/>
+      </w:pPr>
+      <w:r>
+        <w:rPr>
+          <w:b/>
+          <w:color w:val="056F00"/>
+        </w:rPr>
+        <w:t xml:space="preserve">Tip: </w:t>
+      </w:r>
+      <w:r>
+        <w:rPr>
+          <w:color w:val="333333"/>
+        </w:rPr>
+        <w:t>The storage path shown in the middle of the header bar is itself a button - click it anytime to open a Change storage location dialog and point DMS at a different folder on your computer, no restart and no need to go back through the section 1.3 startup screen (see section 1.3 for the first-time setup).</w:t>
       </w:r>
     </w:p>
     <w:p>
@@ -2794,6 +2837,130 @@
     </w:p>
     <w:p/>
     <w:p>
+      <w:pPr>
+        <w:pStyle w:val="Heading2"/>
+      </w:pPr>
+      <w:r>
+        <w:rPr>
+          <w:color w:val="1D4E89"/>
+        </w:rPr>
+        <w:t>3.9  Setting a Photo Root Folder</w:t>
+      </w:r>
+    </w:p>
+    <w:p>
+      <w:r>
+        <w:t>Section 4.1 explains that uploading a photo automatically creates “year/month” subfolders under the current folder. If you'd rather have every photo in the whole project archived by year/month under one fixed location - instead of scattered under whichever folder you happened to upload into - you can designate a “photo root” folder:</w:t>
+      </w:r>
+    </w:p>
+    <w:p>
+      <w:pPr>
+        <w:pStyle w:val="ListNumber"/>
+        <w:ind w:left="360"/>
+      </w:pPr>
+      <w:r>
+        <w:t>Right-click the folder you want to use as the root, and choose Set as photo root folder.</w:t>
+      </w:r>
+    </w:p>
+    <w:p>
+      <w:pPr>
+        <w:pStyle w:val="ListNumber"/>
+        <w:ind w:left="360"/>
+      </w:pPr>
+      <w:r>
+        <w:t>That folder gets a small camera-icon marker in the tree.</w:t>
+      </w:r>
+    </w:p>
+    <w:p>
+      <w:pPr>
+        <w:pStyle w:val="ListNumber"/>
+        <w:ind w:left="360"/>
+      </w:pPr>
+      <w:r>
+        <w:t>From then on, uploading a photo anywhere in the tree (as long as you're not using the “current folder” upload mode) creates its year/month subfolders under this designated root, not under whatever folder you uploaded into.</w:t>
+      </w:r>
+    </w:p>
+    <w:p>
+      <w:pPr>
+        <w:pStyle w:val="ListNumber"/>
+        <w:ind w:left="360"/>
+      </w:pPr>
+      <w:r>
+        <w:t>To undo it, right-click the marked folder and choose Unset photo root folder.</w:t>
+      </w:r>
+    </w:p>
+    <w:p>
+      <w:pPr>
+        <w:jc w:val="center"/>
+      </w:pPr>
+      <w:r>
+        <w:drawing>
+          <wp:inline xmlns:a="http://schemas.openxmlformats.org/drawingml/2006/main" xmlns:pic="http://schemas.openxmlformats.org/drawingml/2006/picture">
+            <wp:extent cx="5486400" cy="2936720"/>
+            <wp:docPr id="10" name="Picture 10"/>
+            <wp:cNvGraphicFramePr>
+              <a:graphicFrameLocks noChangeAspect="1"/>
+            </wp:cNvGraphicFramePr>
+            <a:graphic>
+              <a:graphicData uri="http://schemas.openxmlformats.org/drawingml/2006/picture">
+                <pic:pic>
+                  <pic:nvPicPr>
+                    <pic:cNvPr id="0" name="39_photo_root_context_menu.png"/>
+                    <pic:cNvPicPr/>
+                  </pic:nvPicPr>
+                  <pic:blipFill>
+                    <a:blip r:embed="rId18"/>
+                    <a:stretch>
+                      <a:fillRect/>
+                    </a:stretch>
+                  </pic:blipFill>
+                  <pic:spPr>
+                    <a:xfrm>
+                      <a:off x="0" y="0"/>
+                      <a:ext cx="5486400" cy="2936720"/>
+                    </a:xfrm>
+                    <a:prstGeom prst="rect"/>
+                  </pic:spPr>
+                </pic:pic>
+              </a:graphicData>
+            </a:graphic>
+          </wp:inline>
+        </w:drawing>
+      </w:r>
+    </w:p>
+    <w:p>
+      <w:pPr>
+        <w:jc w:val="center"/>
+      </w:pPr>
+      <w:r>
+        <w:rPr>
+          <w:i/>
+          <w:color w:val="707070"/>
+          <w:sz w:val="18"/>
+        </w:rPr>
+        <w:t>Figure 3-8  Folder right-click menu: Set/Unset photo root folder</w:t>
+      </w:r>
+    </w:p>
+    <w:p/>
+    <w:p>
+      <w:pPr>
+        <w:ind w:left="576" w:right="576"/>
+        <w:shd w:val="clear" w:color="auto" w:fill="E6F4EA"/>
+      </w:pPr>
+      <w:r>
+        <w:rPr>
+          <w:b/>
+          <w:color w:val="056F00"/>
+        </w:rPr>
+        <w:t xml:space="preserve">Tip: </w:t>
+      </w:r>
+      <w:r>
+        <w:rPr>
+          <w:color w:val="333333"/>
+        </w:rPr>
+        <w:t>Handy for funneling every photo from every device and every folder into one central “Photo Library” folder organized by year/month, while each business folder keeps only the documents relevant to it, unmixed with photos.</w:t>
+      </w:r>
+    </w:p>
+    <w:p>
       <w:r>
         <w:br w:type="page"/>
       </w:r>
@@ -3362,7 +3529,7 @@
         <w:drawing>
           <wp:inline xmlns:a="http://schemas.openxmlformats.org/drawingml/2006/main" xmlns:pic="http://schemas.openxmlformats.org/drawingml/2006/picture">
             <wp:extent cx="5486400" cy="3429000"/>
-            <wp:docPr id="10" name="Picture 10"/>
+            <wp:docPr id="11" name="Picture 11"/>
             <wp:cNvGraphicFramePr>
               <a:graphicFrameLocks noChangeAspect="1"/>
             </wp:cNvGraphicFramePr>
@@ -3371,59 +3538,6 @@
                 <pic:pic>
                   <pic:nvPicPr>
                     <pic:cNvPr id="0" name="05_doc_viewer_pdf.png"/>
-                    <pic:cNvPicPr/>
-                  </pic:nvPicPr>
-                  <pic:blipFill>
-                    <a:blip r:embed="rId18"/>
-                    <a:stretch>
-                      <a:fillRect/>
-                    </a:stretch>
-                  </pic:blipFill>
-                  <pic:spPr>
-                    <a:xfrm>
-                      <a:off x="0" y="0"/>
-                      <a:ext cx="5486400" cy="3429000"/>
-                    </a:xfrm>
-                    <a:prstGeom prst="rect"/>
-                  </pic:spPr>
-                </pic:pic>
-              </a:graphicData>
-            </a:graphic>
-          </wp:inline>
-        </w:drawing>
-      </w:r>
-    </w:p>
-    <w:p>
-      <w:pPr>
-        <w:jc w:val="center"/>
-      </w:pPr>
-      <w:r>
-        <w:rPr>
-          <w:i/>
-          <w:color w:val="707070"/>
-          <w:sz w:val="18"/>
-        </w:rPr>
-        <w:t>Figure 4-1  The PDF document viewer</w:t>
-      </w:r>
-    </w:p>
-    <w:p/>
-    <w:p>
-      <w:pPr>
-        <w:jc w:val="center"/>
-      </w:pPr>
-      <w:r>
-        <w:drawing>
-          <wp:inline xmlns:a="http://schemas.openxmlformats.org/drawingml/2006/main" xmlns:pic="http://schemas.openxmlformats.org/drawingml/2006/picture">
-            <wp:extent cx="5486400" cy="3429000"/>
-            <wp:docPr id="11" name="Picture 11"/>
-            <wp:cNvGraphicFramePr>
-              <a:graphicFrameLocks noChangeAspect="1"/>
-            </wp:cNvGraphicFramePr>
-            <a:graphic>
-              <a:graphicData uri="http://schemas.openxmlformats.org/drawingml/2006/picture">
-                <pic:pic>
-                  <pic:nvPicPr>
-                    <pic:cNvPr id="0" name="06_doc_viewer_image.png"/>
                     <pic:cNvPicPr/>
                   </pic:nvPicPr>
                   <pic:blipFill>
@@ -3456,6 +3570,59 @@
           <w:color w:val="707070"/>
           <w:sz w:val="18"/>
         </w:rPr>
+        <w:t>Figure 4-1  The PDF document viewer</w:t>
+      </w:r>
+    </w:p>
+    <w:p/>
+    <w:p>
+      <w:pPr>
+        <w:jc w:val="center"/>
+      </w:pPr>
+      <w:r>
+        <w:drawing>
+          <wp:inline xmlns:a="http://schemas.openxmlformats.org/drawingml/2006/main" xmlns:pic="http://schemas.openxmlformats.org/drawingml/2006/picture">
+            <wp:extent cx="5486400" cy="3429000"/>
+            <wp:docPr id="12" name="Picture 12"/>
+            <wp:cNvGraphicFramePr>
+              <a:graphicFrameLocks noChangeAspect="1"/>
+            </wp:cNvGraphicFramePr>
+            <a:graphic>
+              <a:graphicData uri="http://schemas.openxmlformats.org/drawingml/2006/picture">
+                <pic:pic>
+                  <pic:nvPicPr>
+                    <pic:cNvPr id="0" name="06_doc_viewer_image.png"/>
+                    <pic:cNvPicPr/>
+                  </pic:nvPicPr>
+                  <pic:blipFill>
+                    <a:blip r:embed="rId20"/>
+                    <a:stretch>
+                      <a:fillRect/>
+                    </a:stretch>
+                  </pic:blipFill>
+                  <pic:spPr>
+                    <a:xfrm>
+                      <a:off x="0" y="0"/>
+                      <a:ext cx="5486400" cy="3429000"/>
+                    </a:xfrm>
+                    <a:prstGeom prst="rect"/>
+                  </pic:spPr>
+                </pic:pic>
+              </a:graphicData>
+            </a:graphic>
+          </wp:inline>
+        </w:drawing>
+      </w:r>
+    </w:p>
+    <w:p>
+      <w:pPr>
+        <w:jc w:val="center"/>
+      </w:pPr>
+      <w:r>
+        <w:rPr>
+          <w:i/>
+          <w:color w:val="707070"/>
+          <w:sz w:val="18"/>
+        </w:rPr>
         <w:t>Figure 4-2  The image document viewer</w:t>
       </w:r>
     </w:p>
@@ -3468,7 +3635,7 @@
         <w:drawing>
           <wp:inline xmlns:a="http://schemas.openxmlformats.org/drawingml/2006/main" xmlns:pic="http://schemas.openxmlformats.org/drawingml/2006/picture">
             <wp:extent cx="5486400" cy="2741275"/>
-            <wp:docPr id="12" name="Picture 12"/>
+            <wp:docPr id="13" name="Picture 13"/>
             <wp:cNvGraphicFramePr>
               <a:graphicFrameLocks noChangeAspect="1"/>
             </wp:cNvGraphicFramePr>
@@ -3480,7 +3647,7 @@
                     <pic:cNvPicPr/>
                   </pic:nvPicPr>
                   <pic:blipFill>
-                    <a:blip r:embed="rId20"/>
+                    <a:blip r:embed="rId21"/>
                     <a:stretch>
                       <a:fillRect/>
                     </a:stretch>
@@ -3810,7 +3977,7 @@
         <w:drawing>
           <wp:inline xmlns:a="http://schemas.openxmlformats.org/drawingml/2006/main" xmlns:pic="http://schemas.openxmlformats.org/drawingml/2006/picture">
             <wp:extent cx="5486400" cy="2253343"/>
-            <wp:docPr id="13" name="Picture 13"/>
+            <wp:docPr id="14" name="Picture 14"/>
             <wp:cNvGraphicFramePr>
               <a:graphicFrameLocks noChangeAspect="1"/>
             </wp:cNvGraphicFramePr>
@@ -3822,7 +3989,7 @@
                     <pic:cNvPicPr/>
                   </pic:nvPicPr>
                   <pic:blipFill>
-                    <a:blip r:embed="rId21"/>
+                    <a:blip r:embed="rId22"/>
                     <a:stretch>
                       <a:fillRect/>
                     </a:stretch>
@@ -3950,7 +4117,7 @@
         <w:drawing>
           <wp:inline xmlns:a="http://schemas.openxmlformats.org/drawingml/2006/main" xmlns:pic="http://schemas.openxmlformats.org/drawingml/2006/picture">
             <wp:extent cx="5486400" cy="2741275"/>
-            <wp:docPr id="14" name="Picture 14"/>
+            <wp:docPr id="15" name="Picture 15"/>
             <wp:cNvGraphicFramePr>
               <a:graphicFrameLocks noChangeAspect="1"/>
             </wp:cNvGraphicFramePr>
@@ -3959,116 +4126,6 @@
                 <pic:pic>
                   <pic:nvPicPr>
                     <pic:cNvPr id="0" name="30_doc_ask_ai.png"/>
-                    <pic:cNvPicPr/>
-                  </pic:nvPicPr>
-                  <pic:blipFill>
-                    <a:blip r:embed="rId22"/>
-                    <a:stretch>
-                      <a:fillRect/>
-                    </a:stretch>
-                  </pic:blipFill>
-                  <pic:spPr>
-                    <a:xfrm>
-                      <a:off x="0" y="0"/>
-                      <a:ext cx="5486400" cy="2741275"/>
-                    </a:xfrm>
-                    <a:prstGeom prst="rect"/>
-                  </pic:spPr>
-                </pic:pic>
-              </a:graphicData>
-            </a:graphic>
-          </wp:inline>
-        </w:drawing>
-      </w:r>
-    </w:p>
-    <w:p>
-      <w:pPr>
-        <w:jc w:val="center"/>
-      </w:pPr>
-      <w:r>
-        <w:rPr>
-          <w:i/>
-          <w:color w:val="707070"/>
-          <w:sz w:val="18"/>
-        </w:rPr>
-        <w:t>Figure 4-5  Asking AI about a single document (needs a Gemini or DeepSeek API key - section 6.4)</w:t>
-      </w:r>
-    </w:p>
-    <w:p/>
-    <w:p>
-      <w:r>
-        <w:t>The description panel's AI Cleanup button works the same way for a single document's description: choose “Organize / Polish wording / Make concise,” and the AI tidies up rough or dictated text while keeping all the information; the result previews first, and only replaces your text once you click Apply.</w:t>
-      </w:r>
-    </w:p>
-    <w:p>
-      <w:pPr>
-        <w:pStyle w:val="Heading2"/>
-      </w:pPr>
-      <w:r>
-        <w:rPr>
-          <w:color w:val="1D4E89"/>
-        </w:rPr>
-        <w:t>4.10  Convert to PDF (Batch)</w:t>
-      </w:r>
-    </w:p>
-    <w:p>
-      <w:r>
-        <w:t>Need to convert a batch of photos or existing PDFs into a consistent, cleanly named set? You don't have to save each one individually.</w:t>
-      </w:r>
-    </w:p>
-    <w:p>
-      <w:pPr>
-        <w:pStyle w:val="ListNumber"/>
-        <w:ind w:left="360"/>
-      </w:pPr>
-      <w:r>
-        <w:t>Check the images and/or PDFs you want to convert in the folder (use Multi-select, or check them inside the dialog that opens).</w:t>
-      </w:r>
-    </w:p>
-    <w:p>
-      <w:pPr>
-        <w:pStyle w:val="ListNumber"/>
-        <w:ind w:left="360"/>
-      </w:pPr>
-      <w:r>
-        <w:t>Click Convert to PDF; the dialog lists the checked documents and their sizes.</w:t>
-      </w:r>
-    </w:p>
-    <w:p>
-      <w:pPr>
-        <w:pStyle w:val="ListNumber"/>
-        <w:ind w:left="360"/>
-      </w:pPr>
-      <w:r>
-        <w:t>Click Convert N document(s) to PDF.</w:t>
-      </w:r>
-    </w:p>
-    <w:p>
-      <w:pPr>
-        <w:pStyle w:val="ListNumber"/>
-        <w:ind w:left="360"/>
-      </w:pPr>
-      <w:r>
-        <w:t>Each document is converted into its own separate PDF (named with a “YYYY-MM-DD-” prefix whenever a date is known); the originals are moved to “Deleted files” (a soft delete - recoverable, see section 3.2).</w:t>
-      </w:r>
-    </w:p>
-    <w:p>
-      <w:pPr>
-        <w:jc w:val="center"/>
-      </w:pPr>
-      <w:r>
-        <w:drawing>
-          <wp:inline xmlns:a="http://schemas.openxmlformats.org/drawingml/2006/main" xmlns:pic="http://schemas.openxmlformats.org/drawingml/2006/picture">
-            <wp:extent cx="5486400" cy="2741275"/>
-            <wp:docPr id="15" name="Picture 15"/>
-            <wp:cNvGraphicFramePr>
-              <a:graphicFrameLocks noChangeAspect="1"/>
-            </wp:cNvGraphicFramePr>
-            <a:graphic>
-              <a:graphicData uri="http://schemas.openxmlformats.org/drawingml/2006/picture">
-                <pic:pic>
-                  <pic:nvPicPr>
-                    <pic:cNvPr id="0" name="33_convert_to_pdf.png"/>
                     <pic:cNvPicPr/>
                   </pic:nvPicPr>
                   <pic:blipFill>
@@ -4101,6 +4158,116 @@
           <w:color w:val="707070"/>
           <w:sz w:val="18"/>
         </w:rPr>
+        <w:t>Figure 4-5  Asking AI about a single document (needs a Gemini or DeepSeek API key - section 6.4)</w:t>
+      </w:r>
+    </w:p>
+    <w:p/>
+    <w:p>
+      <w:r>
+        <w:t>The description panel's AI Cleanup button works the same way for a single document's description: choose “Organize / Polish wording / Make concise,” and the AI tidies up rough or dictated text while keeping all the information; the result previews first, and only replaces your text once you click Apply.</w:t>
+      </w:r>
+    </w:p>
+    <w:p>
+      <w:pPr>
+        <w:pStyle w:val="Heading2"/>
+      </w:pPr>
+      <w:r>
+        <w:rPr>
+          <w:color w:val="1D4E89"/>
+        </w:rPr>
+        <w:t>4.10  Convert to PDF (Batch)</w:t>
+      </w:r>
+    </w:p>
+    <w:p>
+      <w:r>
+        <w:t>Need to convert a batch of photos or existing PDFs into a consistent, cleanly named set? You don't have to save each one individually.</w:t>
+      </w:r>
+    </w:p>
+    <w:p>
+      <w:pPr>
+        <w:pStyle w:val="ListNumber"/>
+        <w:ind w:left="360"/>
+      </w:pPr>
+      <w:r>
+        <w:t>Check the images and/or PDFs you want to convert in the folder (use Multi-select, or check them inside the dialog that opens).</w:t>
+      </w:r>
+    </w:p>
+    <w:p>
+      <w:pPr>
+        <w:pStyle w:val="ListNumber"/>
+        <w:ind w:left="360"/>
+      </w:pPr>
+      <w:r>
+        <w:t>Click Convert to PDF; the dialog lists the checked documents and their sizes.</w:t>
+      </w:r>
+    </w:p>
+    <w:p>
+      <w:pPr>
+        <w:pStyle w:val="ListNumber"/>
+        <w:ind w:left="360"/>
+      </w:pPr>
+      <w:r>
+        <w:t>Click Convert N document(s) to PDF.</w:t>
+      </w:r>
+    </w:p>
+    <w:p>
+      <w:pPr>
+        <w:pStyle w:val="ListNumber"/>
+        <w:ind w:left="360"/>
+      </w:pPr>
+      <w:r>
+        <w:t>Each document is converted into its own separate PDF (named with a “YYYY-MM-DD-” prefix whenever a date is known); the originals are moved to “Deleted files” (a soft delete - recoverable, see section 3.2).</w:t>
+      </w:r>
+    </w:p>
+    <w:p>
+      <w:pPr>
+        <w:jc w:val="center"/>
+      </w:pPr>
+      <w:r>
+        <w:drawing>
+          <wp:inline xmlns:a="http://schemas.openxmlformats.org/drawingml/2006/main" xmlns:pic="http://schemas.openxmlformats.org/drawingml/2006/picture">
+            <wp:extent cx="5486400" cy="2741275"/>
+            <wp:docPr id="16" name="Picture 16"/>
+            <wp:cNvGraphicFramePr>
+              <a:graphicFrameLocks noChangeAspect="1"/>
+            </wp:cNvGraphicFramePr>
+            <a:graphic>
+              <a:graphicData uri="http://schemas.openxmlformats.org/drawingml/2006/picture">
+                <pic:pic>
+                  <pic:nvPicPr>
+                    <pic:cNvPr id="0" name="33_convert_to_pdf.png"/>
+                    <pic:cNvPicPr/>
+                  </pic:nvPicPr>
+                  <pic:blipFill>
+                    <a:blip r:embed="rId24"/>
+                    <a:stretch>
+                      <a:fillRect/>
+                    </a:stretch>
+                  </pic:blipFill>
+                  <pic:spPr>
+                    <a:xfrm>
+                      <a:off x="0" y="0"/>
+                      <a:ext cx="5486400" cy="2741275"/>
+                    </a:xfrm>
+                    <a:prstGeom prst="rect"/>
+                  </pic:spPr>
+                </pic:pic>
+              </a:graphicData>
+            </a:graphic>
+          </wp:inline>
+        </w:drawing>
+      </w:r>
+    </w:p>
+    <w:p>
+      <w:pPr>
+        <w:jc w:val="center"/>
+      </w:pPr>
+      <w:r>
+        <w:rPr>
+          <w:i/>
+          <w:color w:val="707070"/>
+          <w:sz w:val="18"/>
+        </w:rPr>
         <w:t>Figure 4-6  The Convert to PDF dialog, with one document selected</w:t>
       </w:r>
     </w:p>
@@ -4146,6 +4313,164 @@
       </w:pPr>
       <w:r>
         <w:t>Before any change to a project's folder structure (adding/removing folders, moving things, batch operations), DMS automatically saves a snapshot of the structure at that moment; if a particular change ever leaves the structure in a bad state, that snapshot can be used to roll back. This safety net runs entirely in the background - you won't see any UI for it during normal use.</w:t>
+      </w:r>
+    </w:p>
+    <w:p>
+      <w:pPr>
+        <w:pStyle w:val="Heading2"/>
+      </w:pPr>
+      <w:r>
+        <w:rPr>
+          <w:color w:val="1D4E89"/>
+        </w:rPr>
+        <w:t>4.12  Batch Document Actions (Multi-select: Download, Batch Rename, Find Near-Duplicates)</w:t>
+      </w:r>
+    </w:p>
+    <w:p>
+      <w:r>
+        <w:t>The document list has a row of batch-action buttons above it that work on every document in the current folder, without needing to pop out the grid-view window first (Section 19 covers the pop-out window's own batch actions - the two can be used together):</w:t>
+      </w:r>
+    </w:p>
+    <w:p>
+      <w:pPr>
+        <w:jc w:val="center"/>
+      </w:pPr>
+      <w:r>
+        <w:drawing>
+          <wp:inline xmlns:a="http://schemas.openxmlformats.org/drawingml/2006/main" xmlns:pic="http://schemas.openxmlformats.org/drawingml/2006/picture">
+            <wp:extent cx="5486400" cy="2936720"/>
+            <wp:docPr id="17" name="Picture 17"/>
+            <wp:cNvGraphicFramePr>
+              <a:graphicFrameLocks noChangeAspect="1"/>
+            </wp:cNvGraphicFramePr>
+            <a:graphic>
+              <a:graphicData uri="http://schemas.openxmlformats.org/drawingml/2006/picture">
+                <pic:pic>
+                  <pic:nvPicPr>
+                    <pic:cNvPr id="0" name="40_multiselect_toolbar.png"/>
+                    <pic:cNvPicPr/>
+                  </pic:nvPicPr>
+                  <pic:blipFill>
+                    <a:blip r:embed="rId25"/>
+                    <a:stretch>
+                      <a:fillRect/>
+                    </a:stretch>
+                  </pic:blipFill>
+                  <pic:spPr>
+                    <a:xfrm>
+                      <a:off x="0" y="0"/>
+                      <a:ext cx="5486400" cy="2936720"/>
+                    </a:xfrm>
+                    <a:prstGeom prst="rect"/>
+                  </pic:spPr>
+                </pic:pic>
+              </a:graphicData>
+            </a:graphic>
+          </wp:inline>
+        </w:drawing>
+      </w:r>
+    </w:p>
+    <w:p>
+      <w:pPr>
+        <w:jc w:val="center"/>
+      </w:pPr>
+      <w:r>
+        <w:rPr>
+          <w:i/>
+          <w:color w:val="707070"/>
+          <w:sz w:val="18"/>
+        </w:rPr>
+        <w:t>Figure 4-7  Document list toolbar: Select, AI-fill parameter, Batch rename, Find near-duplicates</w:t>
+      </w:r>
+    </w:p>
+    <w:p/>
+    <w:p>
+      <w:pPr>
+        <w:pStyle w:val="ListBullet"/>
+        <w:ind w:left="360"/>
+      </w:pPr>
+      <w:r>
+        <w:t>Select - check one or more documents, then either Download them to a folder (defaults to your Downloads folder) or Unlink them from the current folder (the documents themselves are soft-deleted - see section 3.2).</w:t>
+      </w:r>
+    </w:p>
+    <w:p>
+      <w:pPr>
+        <w:pStyle w:val="ListBullet"/>
+        <w:ind w:left="360"/>
+      </w:pPr>
+      <w:r>
+        <w:t>AI-fill parameter - multi-select documents and have AI read one parameter's value off each and fill it in for all of them at once; see section 6.6 for the full flow.</w:t>
+      </w:r>
+    </w:p>
+    <w:p>
+      <w:pPr>
+        <w:pStyle w:val="ListBullet"/>
+        <w:ind w:left="360"/>
+      </w:pPr>
+      <w:r>
+        <w:t>Batch rename - renames every document in the current folder to “date + location - original name” (the date comes from the document's own capture/archive date, and documents where no date can be resolved are skipped; the location comes from the document's location metadata and is omitted if there isn't one). The actual file on disk is renamed too. Clicking it shows a preview first; nothing changes until you confirm.</w:t>
+      </w:r>
+    </w:p>
+    <w:p>
+      <w:pPr>
+        <w:jc w:val="center"/>
+      </w:pPr>
+      <w:r>
+        <w:drawing>
+          <wp:inline xmlns:a="http://schemas.openxmlformats.org/drawingml/2006/main" xmlns:pic="http://schemas.openxmlformats.org/drawingml/2006/picture">
+            <wp:extent cx="5486400" cy="2936720"/>
+            <wp:docPr id="18" name="Picture 18"/>
+            <wp:cNvGraphicFramePr>
+              <a:graphicFrameLocks noChangeAspect="1"/>
+            </wp:cNvGraphicFramePr>
+            <a:graphic>
+              <a:graphicData uri="http://schemas.openxmlformats.org/drawingml/2006/picture">
+                <pic:pic>
+                  <pic:nvPicPr>
+                    <pic:cNvPr id="0" name="42_batch_rename_preview.png"/>
+                    <pic:cNvPicPr/>
+                  </pic:nvPicPr>
+                  <pic:blipFill>
+                    <a:blip r:embed="rId26"/>
+                    <a:stretch>
+                      <a:fillRect/>
+                    </a:stretch>
+                  </pic:blipFill>
+                  <pic:spPr>
+                    <a:xfrm>
+                      <a:off x="0" y="0"/>
+                      <a:ext cx="5486400" cy="2936720"/>
+                    </a:xfrm>
+                    <a:prstGeom prst="rect"/>
+                  </pic:spPr>
+                </pic:pic>
+              </a:graphicData>
+            </a:graphic>
+          </wp:inline>
+        </w:drawing>
+      </w:r>
+    </w:p>
+    <w:p>
+      <w:pPr>
+        <w:jc w:val="center"/>
+      </w:pPr>
+      <w:r>
+        <w:rPr>
+          <w:i/>
+          <w:color w:val="707070"/>
+          <w:sz w:val="18"/>
+        </w:rPr>
+        <w:t>Figure 4-8  Batch rename preview: nothing is renamed until you confirm</w:t>
+      </w:r>
+    </w:p>
+    <w:p/>
+    <w:p>
+      <w:pPr>
+        <w:pStyle w:val="ListBullet"/>
+        <w:ind w:left="360"/>
+      </w:pPr>
+      <w:r>
+        <w:t>Find near-duplicates - check a few photos (or click Select all photos to grab every photo in the folder), then drag the Similarity threshold slider (50%-100%); DMS compares the selected photos pairwise and flags ones that look highly similar to each other (e.g. several near-identical burst-mode shots), making it easy to spot redundant photos to clean up. This is a “looks similar” fuzzy match, a different mechanism from section 4.7's exact filename-and-size match at upload time.</w:t>
       </w:r>
     </w:p>
     <w:p>
@@ -4684,7 +5009,7 @@
         <w:drawing>
           <wp:inline xmlns:a="http://schemas.openxmlformats.org/drawingml/2006/main" xmlns:pic="http://schemas.openxmlformats.org/drawingml/2006/picture">
             <wp:extent cx="5486400" cy="3429000"/>
-            <wp:docPr id="16" name="Picture 16"/>
+            <wp:docPr id="19" name="Picture 19"/>
             <wp:cNvGraphicFramePr>
               <a:graphicFrameLocks noChangeAspect="1"/>
             </wp:cNvGraphicFramePr>
@@ -4696,7 +5021,7 @@
                     <pic:cNvPicPr/>
                   </pic:nvPicPr>
                   <pic:blipFill>
-                    <a:blip r:embed="rId24"/>
+                    <a:blip r:embed="rId27"/>
                     <a:stretch>
                       <a:fillRect/>
                     </a:stretch>
@@ -4780,7 +5105,7 @@
         <w:drawing>
           <wp:inline xmlns:a="http://schemas.openxmlformats.org/drawingml/2006/main" xmlns:pic="http://schemas.openxmlformats.org/drawingml/2006/picture">
             <wp:extent cx="5486400" cy="2741275"/>
-            <wp:docPr id="17" name="Picture 17"/>
+            <wp:docPr id="20" name="Picture 20"/>
             <wp:cNvGraphicFramePr>
               <a:graphicFrameLocks noChangeAspect="1"/>
             </wp:cNvGraphicFramePr>
@@ -4792,7 +5117,7 @@
                     <pic:cNvPicPr/>
                   </pic:nvPicPr>
                   <pic:blipFill>
-                    <a:blip r:embed="rId25"/>
+                    <a:blip r:embed="rId28"/>
                     <a:stretch>
                       <a:fillRect/>
                     </a:stretch>
@@ -4843,6 +5168,25 @@
     </w:p>
     <w:p>
       <w:pPr>
+        <w:ind w:left="576" w:right="576"/>
+        <w:shd w:val="clear" w:color="auto" w:fill="E6F4EA"/>
+      </w:pPr>
+      <w:r>
+        <w:rPr>
+          <w:b/>
+          <w:color w:val="056F00"/>
+        </w:rPr>
+        <w:t xml:space="preserve">Tip: </w:t>
+      </w:r>
+      <w:r>
+        <w:rPr>
+          <w:color w:val="333333"/>
+        </w:rPr>
+        <w:t>Next to “Detailed Gemini setup steps (including how to get a free/paid key)” in the dialog is a Download setup guide (.docx) link, with screenshots showing how to sign up for a Google account and request a free Gemini API key - handy if you've never gotten one before.</w:t>
+      </w:r>
+    </w:p>
+    <w:p>
+      <w:pPr>
         <w:pStyle w:val="Heading2"/>
       </w:pPr>
       <w:r>
@@ -4883,7 +5227,7 @@
         <w:drawing>
           <wp:inline xmlns:a="http://schemas.openxmlformats.org/drawingml/2006/main" xmlns:pic="http://schemas.openxmlformats.org/drawingml/2006/picture">
             <wp:extent cx="5486400" cy="2741275"/>
-            <wp:docPr id="18" name="Picture 18"/>
+            <wp:docPr id="21" name="Picture 21"/>
             <wp:cNvGraphicFramePr>
               <a:graphicFrameLocks noChangeAspect="1"/>
             </wp:cNvGraphicFramePr>
@@ -4895,7 +5239,7 @@
                     <pic:cNvPicPr/>
                   </pic:nvPicPr>
                   <pic:blipFill>
-                    <a:blip r:embed="rId26"/>
+                    <a:blip r:embed="rId29"/>
                     <a:stretch>
                       <a:fillRect/>
                     </a:stretch>
@@ -4966,19 +5310,12 @@
       </w:r>
     </w:p>
     <w:p>
-      <w:r>
-        <w:br w:type="page"/>
-      </w:r>
-    </w:p>
-    <w:p>
-      <w:pPr>
-        <w:pStyle w:val="Heading1"/>
-      </w:pPr>
-      <w:r>
-        <w:rPr>
-          <w:color w:val="1E40AF"/>
-        </w:rPr>
-        <w:t>7  Searching Documents</w:t>
+      <w:pPr>
+        <w:pStyle w:val="ListNumber"/>
+        <w:ind w:left="360"/>
+      </w:pPr>
+      <w:r>
+        <w:t>Once there are enough data points, click Fit with Gemini in the chart window (it becomes Re-analyze once you have a result) to have Gemini fit a trend line across the values and comment on it in plain language (e.g. “overall upward trend; the latest reading is slightly above average”). Needs a Gemini API key configured first (section 6.4).</w:t>
       </w:r>
     </w:p>
     <w:p>
@@ -4989,7 +5326,12 @@
         <w:rPr>
           <w:color w:val="1D4E89"/>
         </w:rPr>
-        <w:t>7.1  Basic Search</w:t>
+        <w:t>6.6  Batch AI Parameter Extraction (Multi-select Documents)</w:t>
+      </w:r>
+    </w:p>
+    <w:p>
+      <w:r>
+        <w:t>Section 6.2 covers opening one document and manually checking parameters to extract them one at a time. To fill in the same parameter across a whole batch of documents at once, use AI-fill parameter in the document list toolbar instead - no need to open each document individually.</w:t>
       </w:r>
     </w:p>
     <w:p>
@@ -4998,7 +5340,7 @@
         <w:ind w:left="360"/>
       </w:pPr>
       <w:r>
-        <w:t>Click the Search tab in the sidebar.</w:t>
+        <w:t>Above a folder's document list, click AI-fill parameter; the toolbar switches to multi-select mode.</w:t>
       </w:r>
     </w:p>
     <w:p>
@@ -5007,7 +5349,7 @@
         <w:ind w:left="360"/>
       </w:pPr>
       <w:r>
-        <w:t>Type a word or phrase in the search box.</w:t>
+        <w:t>Check the documents to process (or click Select all), then click AI-extract parameter on the right.</w:t>
       </w:r>
     </w:p>
     <w:p>
@@ -5016,52 +5358,69 @@
         <w:ind w:left="360"/>
       </w:pPr>
       <w:r>
-        <w:t>Results appear instantly as cards showing:</w:t>
-      </w:r>
-    </w:p>
-    <w:p>
-      <w:pPr>
-        <w:pStyle w:val="ListBullet"/>
+        <w:t>In the dialog, pick an existing key parameter from the dropdown, or type a new parameter name below it.</w:t>
+      </w:r>
+    </w:p>
+    <w:p>
+      <w:pPr>
+        <w:jc w:val="center"/>
+      </w:pPr>
+      <w:r>
+        <w:drawing>
+          <wp:inline xmlns:a="http://schemas.openxmlformats.org/drawingml/2006/main" xmlns:pic="http://schemas.openxmlformats.org/drawingml/2006/picture">
+            <wp:extent cx="5486400" cy="2936720"/>
+            <wp:docPr id="22" name="Picture 22"/>
+            <wp:cNvGraphicFramePr>
+              <a:graphicFrameLocks noChangeAspect="1"/>
+            </wp:cNvGraphicFramePr>
+            <a:graphic>
+              <a:graphicData uri="http://schemas.openxmlformats.org/drawingml/2006/picture">
+                <pic:pic>
+                  <pic:nvPicPr>
+                    <pic:cNvPr id="0" name="41_ai_fill_parameter.png"/>
+                    <pic:cNvPicPr/>
+                  </pic:nvPicPr>
+                  <pic:blipFill>
+                    <a:blip r:embed="rId30"/>
+                    <a:stretch>
+                      <a:fillRect/>
+                    </a:stretch>
+                  </pic:blipFill>
+                  <pic:spPr>
+                    <a:xfrm>
+                      <a:off x="0" y="0"/>
+                      <a:ext cx="5486400" cy="2936720"/>
+                    </a:xfrm>
+                    <a:prstGeom prst="rect"/>
+                  </pic:spPr>
+                </pic:pic>
+              </a:graphicData>
+            </a:graphic>
+          </wp:inline>
+        </w:drawing>
+      </w:r>
+    </w:p>
+    <w:p>
+      <w:pPr>
+        <w:jc w:val="center"/>
+      </w:pPr>
+      <w:r>
+        <w:rPr>
+          <w:i/>
+          <w:color w:val="707070"/>
+          <w:sz w:val="18"/>
+        </w:rPr>
+        <w:t>Figure 6-4  The AI-extract parameter dialog: choose a parameter, with the document count checked</w:t>
+      </w:r>
+    </w:p>
+    <w:p/>
+    <w:p>
+      <w:pPr>
+        <w:pStyle w:val="ListNumber"/>
         <w:ind w:left="360"/>
       </w:pPr>
       <w:r>
-        <w:t>Document name and file type icon.</w:t>
-      </w:r>
-    </w:p>
-    <w:p>
-      <w:pPr>
-        <w:pStyle w:val="ListBullet"/>
-        <w:ind w:left="360"/>
-      </w:pPr>
-      <w:r>
-        <w:t>Upload date, file size, document ID.</w:t>
-      </w:r>
-    </w:p>
-    <w:p>
-      <w:pPr>
-        <w:pStyle w:val="ListBullet"/>
-        <w:ind w:left="360"/>
-      </w:pPr>
-      <w:r>
-        <w:t>All metadata fields (parameter name / value).</w:t>
-      </w:r>
-    </w:p>
-    <w:p>
-      <w:pPr>
-        <w:pStyle w:val="ListBullet"/>
-        <w:ind w:left="360"/>
-      </w:pPr>
-      <w:r>
-        <w:t>GPS-derived location (if available).</w:t>
-      </w:r>
-    </w:p>
-    <w:p>
-      <w:pPr>
-        <w:pStyle w:val="ListBullet"/>
-        <w:ind w:left="360"/>
-      </w:pPr>
-      <w:r>
-        <w:t>Which folders reference this document.</w:t>
+        <w:t>Click Start extracting. DMS reads each selected document's page images to find that parameter's value (it doesn't need to match the document's text verbatim); results are listed for you to review first, and only get written into each document's “Actual Value” once you click Apply.</w:t>
       </w:r>
     </w:p>
     <w:p>
@@ -5077,6 +5436,121 @@
         <w:t xml:space="preserve">Note: </w:t>
       </w:r>
       <w:r>
+        <w:t>Because this reads the page images themselves, it works just as well on scans and photos with no text layer. Needs a Gemini API key configured first (section 6.4).</w:t>
+      </w:r>
+    </w:p>
+    <w:p>
+      <w:r>
+        <w:br w:type="page"/>
+      </w:r>
+    </w:p>
+    <w:p>
+      <w:pPr>
+        <w:pStyle w:val="Heading1"/>
+      </w:pPr>
+      <w:r>
+        <w:rPr>
+          <w:color w:val="1E40AF"/>
+        </w:rPr>
+        <w:t>7  Searching Documents</w:t>
+      </w:r>
+    </w:p>
+    <w:p>
+      <w:pPr>
+        <w:pStyle w:val="Heading2"/>
+      </w:pPr>
+      <w:r>
+        <w:rPr>
+          <w:color w:val="1D4E89"/>
+        </w:rPr>
+        <w:t>7.1  Basic Search</w:t>
+      </w:r>
+    </w:p>
+    <w:p>
+      <w:pPr>
+        <w:pStyle w:val="ListNumber"/>
+        <w:ind w:left="360"/>
+      </w:pPr>
+      <w:r>
+        <w:t>Click the Search tab in the sidebar.</w:t>
+      </w:r>
+    </w:p>
+    <w:p>
+      <w:pPr>
+        <w:pStyle w:val="ListNumber"/>
+        <w:ind w:left="360"/>
+      </w:pPr>
+      <w:r>
+        <w:t>Type a word or phrase in the search box.</w:t>
+      </w:r>
+    </w:p>
+    <w:p>
+      <w:pPr>
+        <w:pStyle w:val="ListNumber"/>
+        <w:ind w:left="360"/>
+      </w:pPr>
+      <w:r>
+        <w:t>Results appear instantly as cards showing:</w:t>
+      </w:r>
+    </w:p>
+    <w:p>
+      <w:pPr>
+        <w:pStyle w:val="ListBullet"/>
+        <w:ind w:left="360"/>
+      </w:pPr>
+      <w:r>
+        <w:t>Document name and file type icon.</w:t>
+      </w:r>
+    </w:p>
+    <w:p>
+      <w:pPr>
+        <w:pStyle w:val="ListBullet"/>
+        <w:ind w:left="360"/>
+      </w:pPr>
+      <w:r>
+        <w:t>Upload date, file size, document ID.</w:t>
+      </w:r>
+    </w:p>
+    <w:p>
+      <w:pPr>
+        <w:pStyle w:val="ListBullet"/>
+        <w:ind w:left="360"/>
+      </w:pPr>
+      <w:r>
+        <w:t>All metadata fields (parameter name / value).</w:t>
+      </w:r>
+    </w:p>
+    <w:p>
+      <w:pPr>
+        <w:pStyle w:val="ListBullet"/>
+        <w:ind w:left="360"/>
+      </w:pPr>
+      <w:r>
+        <w:t>GPS-derived location (if available).</w:t>
+      </w:r>
+    </w:p>
+    <w:p>
+      <w:pPr>
+        <w:pStyle w:val="ListBullet"/>
+        <w:ind w:left="360"/>
+      </w:pPr>
+      <w:r>
+        <w:t>Which folders reference this document.</w:t>
+      </w:r>
+    </w:p>
+    <w:p>
+      <w:pPr>
+        <w:ind w:left="576" w:right="576"/>
+        <w:shd w:val="clear" w:color="auto" w:fill="FFF8E1"/>
+      </w:pPr>
+      <w:r>
+        <w:rPr>
+          <w:b/>
+          <w:color w:val="924E00"/>
+        </w:rPr>
+        <w:t xml:space="preserve">Note: </w:t>
+      </w:r>
+      <w:r>
         <w:t>Search is case-insensitive and partial-match - typing “pump” will find “Pump Assembly,” “centrifugal pump,” and so on.</w:t>
       </w:r>
     </w:p>
@@ -5120,7 +5594,7 @@
         <w:drawing>
           <wp:inline xmlns:a="http://schemas.openxmlformats.org/drawingml/2006/main" xmlns:pic="http://schemas.openxmlformats.org/drawingml/2006/picture">
             <wp:extent cx="5486400" cy="2936720"/>
-            <wp:docPr id="19" name="Picture 19"/>
+            <wp:docPr id="23" name="Picture 23"/>
             <wp:cNvGraphicFramePr>
               <a:graphicFrameLocks noChangeAspect="1"/>
             </wp:cNvGraphicFramePr>
@@ -5132,7 +5606,7 @@
                     <pic:cNvPicPr/>
                   </pic:nvPicPr>
                   <pic:blipFill>
-                    <a:blip r:embed="rId27"/>
+                    <a:blip r:embed="rId31"/>
                     <a:stretch>
                       <a:fillRect/>
                     </a:stretch>
@@ -5313,7 +5787,7 @@
         <w:drawing>
           <wp:inline xmlns:a="http://schemas.openxmlformats.org/drawingml/2006/main" xmlns:pic="http://schemas.openxmlformats.org/drawingml/2006/picture">
             <wp:extent cx="5486400" cy="3429000"/>
-            <wp:docPr id="20" name="Picture 20"/>
+            <wp:docPr id="24" name="Picture 24"/>
             <wp:cNvGraphicFramePr>
               <a:graphicFrameLocks noChangeAspect="1"/>
             </wp:cNvGraphicFramePr>
@@ -5322,545 +5796,6 @@
                 <pic:pic>
                   <pic:nvPicPr>
                     <pic:cNvPr id="0" name="07_search.png"/>
-                    <pic:cNvPicPr/>
-                  </pic:nvPicPr>
-                  <pic:blipFill>
-                    <a:blip r:embed="rId28"/>
-                    <a:stretch>
-                      <a:fillRect/>
-                    </a:stretch>
-                  </pic:blipFill>
-                  <pic:spPr>
-                    <a:xfrm>
-                      <a:off x="0" y="0"/>
-                      <a:ext cx="5486400" cy="3429000"/>
-                    </a:xfrm>
-                    <a:prstGeom prst="rect"/>
-                  </pic:spPr>
-                </pic:pic>
-              </a:graphicData>
-            </a:graphic>
-          </wp:inline>
-        </w:drawing>
-      </w:r>
-    </w:p>
-    <w:p>
-      <w:pPr>
-        <w:jc w:val="center"/>
-      </w:pPr>
-      <w:r>
-        <w:rPr>
-          <w:i/>
-          <w:color w:val="707070"/>
-          <w:sz w:val="18"/>
-        </w:rPr>
-        <w:t>Figure 7-1  Example search results</w:t>
-      </w:r>
-    </w:p>
-    <w:p/>
-    <w:p>
-      <w:pPr>
-        <w:pStyle w:val="Heading2"/>
-      </w:pPr>
-      <w:r>
-        <w:rPr>
-          <w:color w:val="1D4E89"/>
-        </w:rPr>
-        <w:t>7.3  Opening and Jumping to Results</w:t>
-      </w:r>
-    </w:p>
-    <w:p>
-      <w:pPr>
-        <w:pStyle w:val="ListBullet"/>
-        <w:ind w:left="360"/>
-      </w:pPr>
-      <w:r>
-        <w:t>Click a result card to open the Document Viewer for that document.</w:t>
-      </w:r>
-    </w:p>
-    <w:p>
-      <w:pPr>
-        <w:pStyle w:val="ListBullet"/>
-        <w:ind w:left="360"/>
-      </w:pPr>
-      <w:r>
-        <w:t>Double-click a result card to switch to the Tree tab and jump straight to the folder containing that document.</w:t>
-      </w:r>
-    </w:p>
-    <w:p>
-      <w:r>
-        <w:br w:type="page"/>
-      </w:r>
-    </w:p>
-    <w:p>
-      <w:pPr>
-        <w:pStyle w:val="Heading1"/>
-      </w:pPr>
-      <w:r>
-        <w:rPr>
-          <w:color w:val="1E40AF"/>
-        </w:rPr>
-        <w:t>8  Generating a Databook (PDF / Word)</w:t>
-      </w:r>
-    </w:p>
-    <w:p>
-      <w:r>
-        <w:t>The Databook feature combines selected documents into a single, professional document with a cover page, table of contents, section headers, and page numbers. Two modes are available: manually checking documents to build a PDF (8.1-8.2), or automatically generating an editable Word document from a folder's structure (8.3).</w:t>
-      </w:r>
-    </w:p>
-    <w:p>
-      <w:pPr>
-        <w:pStyle w:val="Heading2"/>
-      </w:pPr>
-      <w:r>
-        <w:rPr>
-          <w:color w:val="1D4E89"/>
-        </w:rPr>
-        <w:t>8.1  Selecting Documents (PDF mode)</w:t>
-      </w:r>
-    </w:p>
-    <w:p>
-      <w:pPr>
-        <w:pStyle w:val="ListNumber"/>
-        <w:ind w:left="360"/>
-      </w:pPr>
-      <w:r>
-        <w:t>Click the Databook tab in the sidebar.</w:t>
-      </w:r>
-    </w:p>
-    <w:p>
-      <w:pPr>
-        <w:pStyle w:val="ListNumber"/>
-        <w:ind w:left="360"/>
-      </w:pPr>
-      <w:r>
-        <w:t>The tree is shown with a checkbox next to each folder, plus a Select All link.</w:t>
-      </w:r>
-    </w:p>
-    <w:p>
-      <w:pPr>
-        <w:pStyle w:val="ListNumber"/>
-        <w:ind w:left="360"/>
-      </w:pPr>
-      <w:r>
-        <w:t>Check individual documents, or use the shortcuts:</w:t>
-      </w:r>
-    </w:p>
-    <w:p>
-      <w:pPr>
-        <w:pStyle w:val="ListBullet"/>
-        <w:ind w:left="360"/>
-      </w:pPr>
-      <w:r>
-        <w:t>Click Select All next to a folder to select every document in that folder (optionally including sub-folders).</w:t>
-      </w:r>
-    </w:p>
-    <w:p>
-      <w:pPr>
-        <w:pStyle w:val="ListBullet"/>
-        <w:ind w:left="360"/>
-      </w:pPr>
-      <w:r>
-        <w:t>Click Clear to deselect everything.</w:t>
-      </w:r>
-    </w:p>
-    <w:p>
-      <w:pPr>
-        <w:ind w:left="576" w:right="576"/>
-        <w:shd w:val="clear" w:color="auto" w:fill="E6F4EA"/>
-      </w:pPr>
-      <w:r>
-        <w:rPr>
-          <w:b/>
-          <w:color w:val="056F00"/>
-        </w:rPr>
-        <w:t xml:space="preserve">Tip: </w:t>
-      </w:r>
-      <w:r>
-        <w:rPr>
-          <w:color w:val="333333"/>
-        </w:rPr>
-        <w:t>Your selection is saved automatically - close and reopen DMS and it will still be there.</w:t>
-      </w:r>
-    </w:p>
-    <w:p>
-      <w:pPr>
-        <w:jc w:val="center"/>
-      </w:pPr>
-      <w:r>
-        <w:drawing>
-          <wp:inline xmlns:a="http://schemas.openxmlformats.org/drawingml/2006/main" xmlns:pic="http://schemas.openxmlformats.org/drawingml/2006/picture">
-            <wp:extent cx="5486400" cy="3429000"/>
-            <wp:docPr id="21" name="Picture 21"/>
-            <wp:cNvGraphicFramePr>
-              <a:graphicFrameLocks noChangeAspect="1"/>
-            </wp:cNvGraphicFramePr>
-            <a:graphic>
-              <a:graphicData uri="http://schemas.openxmlformats.org/drawingml/2006/picture">
-                <pic:pic>
-                  <pic:nvPicPr>
-                    <pic:cNvPr id="0" name="08_databook_tab.png"/>
-                    <pic:cNvPicPr/>
-                  </pic:nvPicPr>
-                  <pic:blipFill>
-                    <a:blip r:embed="rId29"/>
-                    <a:stretch>
-                      <a:fillRect/>
-                    </a:stretch>
-                  </pic:blipFill>
-                  <pic:spPr>
-                    <a:xfrm>
-                      <a:off x="0" y="0"/>
-                      <a:ext cx="5486400" cy="3429000"/>
-                    </a:xfrm>
-                    <a:prstGeom prst="rect"/>
-                  </pic:spPr>
-                </pic:pic>
-              </a:graphicData>
-            </a:graphic>
-          </wp:inline>
-        </w:drawing>
-      </w:r>
-    </w:p>
-    <w:p>
-      <w:pPr>
-        <w:jc w:val="center"/>
-      </w:pPr>
-      <w:r>
-        <w:rPr>
-          <w:i/>
-          <w:color w:val="707070"/>
-          <w:sz w:val="18"/>
-        </w:rPr>
-        <w:t>Figure 8-1  The Databook tab: checking documents to include</w:t>
-      </w:r>
-    </w:p>
-    <w:p/>
-    <w:p>
-      <w:pPr>
-        <w:pStyle w:val="Heading2"/>
-      </w:pPr>
-      <w:r>
-        <w:rPr>
-          <w:color w:val="1D4E89"/>
-        </w:rPr>
-        <w:t>8.2  Generating the PDF</w:t>
-      </w:r>
-    </w:p>
-    <w:p>
-      <w:pPr>
-        <w:pStyle w:val="ListNumber"/>
-        <w:ind w:left="360"/>
-      </w:pPr>
-      <w:r>
-        <w:t>After selecting documents, click Generate Databook.</w:t>
-      </w:r>
-    </w:p>
-    <w:p>
-      <w:pPr>
-        <w:pStyle w:val="ListNumber"/>
-        <w:ind w:left="360"/>
-      </w:pPr>
-      <w:r>
-        <w:t>In the dialog, enter a Title (the main heading on the cover page) and a Subtitle (a secondary line, e.g. project name or revision number).</w:t>
-      </w:r>
-    </w:p>
-    <w:p>
-      <w:pPr>
-        <w:pStyle w:val="ListNumber"/>
-        <w:ind w:left="360"/>
-      </w:pPr>
-      <w:r>
-        <w:t>Click Generate and Download.</w:t>
-      </w:r>
-    </w:p>
-    <w:p>
-      <w:pPr>
-        <w:pStyle w:val="ListNumber"/>
-        <w:ind w:left="360"/>
-      </w:pPr>
-      <w:r>
-        <w:t>DMS generates the PDF on the server and your browser downloads it automatically.</w:t>
-      </w:r>
-    </w:p>
-    <w:p>
-      <w:r>
-        <w:t>The generated PDF includes: a cover page (title, subtitle, date), a table of contents with clickable bookmarks, section-header pages, all selected documents in tree order, and page numbers/footers throughout.</w:t>
-      </w:r>
-    </w:p>
-    <w:p>
-      <w:pPr>
-        <w:jc w:val="center"/>
-      </w:pPr>
-      <w:r>
-        <w:drawing>
-          <wp:inline xmlns:a="http://schemas.openxmlformats.org/drawingml/2006/main" xmlns:pic="http://schemas.openxmlformats.org/drawingml/2006/picture">
-            <wp:extent cx="5486400" cy="3429000"/>
-            <wp:docPr id="22" name="Picture 22"/>
-            <wp:cNvGraphicFramePr>
-              <a:graphicFrameLocks noChangeAspect="1"/>
-            </wp:cNvGraphicFramePr>
-            <a:graphic>
-              <a:graphicData uri="http://schemas.openxmlformats.org/drawingml/2006/picture">
-                <pic:pic>
-                  <pic:nvPicPr>
-                    <pic:cNvPr id="0" name="09_databook_dialog.png"/>
-                    <pic:cNvPicPr/>
-                  </pic:nvPicPr>
-                  <pic:blipFill>
-                    <a:blip r:embed="rId30"/>
-                    <a:stretch>
-                      <a:fillRect/>
-                    </a:stretch>
-                  </pic:blipFill>
-                  <pic:spPr>
-                    <a:xfrm>
-                      <a:off x="0" y="0"/>
-                      <a:ext cx="5486400" cy="3429000"/>
-                    </a:xfrm>
-                    <a:prstGeom prst="rect"/>
-                  </pic:spPr>
-                </pic:pic>
-              </a:graphicData>
-            </a:graphic>
-          </wp:inline>
-        </w:drawing>
-      </w:r>
-    </w:p>
-    <w:p>
-      <w:pPr>
-        <w:jc w:val="center"/>
-      </w:pPr>
-      <w:r>
-        <w:rPr>
-          <w:i/>
-          <w:color w:val="707070"/>
-          <w:sz w:val="18"/>
-        </w:rPr>
-        <w:t>Figure 8-2  The Generate Databook dialog</w:t>
-      </w:r>
-    </w:p>
-    <w:p/>
-    <w:p>
-      <w:pPr>
-        <w:pStyle w:val="Heading2"/>
-      </w:pPr>
-      <w:r>
-        <w:rPr>
-          <w:color w:val="1D4E89"/>
-        </w:rPr>
-        <w:t>8.3  Auto-Generating a Word Databook from a Folder</w:t>
-      </w:r>
-    </w:p>
-    <w:p>
-      <w:r>
-        <w:t>Instead of hand-checking individual documents, this mode only needs you to pick one “top” folder - DMS automatically turns the folder structure into chapters, producing a .docx file you can keep editing and reformatting in Word - useful when you need to tweak layout before submitting it, or the recipient specifically wants Word rather than PDF.</w:t>
-      </w:r>
-    </w:p>
-    <w:p>
-      <w:pPr>
-        <w:pStyle w:val="ListNumber"/>
-        <w:ind w:left="360"/>
-      </w:pPr>
-      <w:r>
-        <w:t>Click the Databook tab in the sidebar, then switch to Auto-Generate by Folder (Word).</w:t>
-      </w:r>
-    </w:p>
-    <w:p>
-      <w:pPr>
-        <w:pStyle w:val="ListNumber"/>
-        <w:ind w:left="360"/>
-      </w:pPr>
-      <w:r>
-        <w:t>Check one folder - each of its sub-folders (nesting to any depth) becomes a chapter, documents within a chapter keep their existing folder order, and each document is followed by its own description text.</w:t>
-      </w:r>
-    </w:p>
-    <w:p>
-      <w:pPr>
-        <w:pStyle w:val="ListNumber"/>
-        <w:ind w:left="360"/>
-      </w:pPr>
-      <w:r>
-        <w:t>Click the generate button; DMS builds the .docx file on the server and your browser downloads it.</w:t>
-      </w:r>
-    </w:p>
-    <w:p>
-      <w:pPr>
-        <w:jc w:val="center"/>
-      </w:pPr>
-      <w:r>
-        <w:drawing>
-          <wp:inline xmlns:a="http://schemas.openxmlformats.org/drawingml/2006/main" xmlns:pic="http://schemas.openxmlformats.org/drawingml/2006/picture">
-            <wp:extent cx="5486400" cy="2741275"/>
-            <wp:docPr id="23" name="Picture 23"/>
-            <wp:cNvGraphicFramePr>
-              <a:graphicFrameLocks noChangeAspect="1"/>
-            </wp:cNvGraphicFramePr>
-            <a:graphic>
-              <a:graphicData uri="http://schemas.openxmlformats.org/drawingml/2006/picture">
-                <pic:pic>
-                  <pic:nvPicPr>
-                    <pic:cNvPr id="0" name="34_databook_docx.png"/>
-                    <pic:cNvPicPr/>
-                  </pic:nvPicPr>
-                  <pic:blipFill>
-                    <a:blip r:embed="rId31"/>
-                    <a:stretch>
-                      <a:fillRect/>
-                    </a:stretch>
-                  </pic:blipFill>
-                  <pic:spPr>
-                    <a:xfrm>
-                      <a:off x="0" y="0"/>
-                      <a:ext cx="5486400" cy="2741275"/>
-                    </a:xfrm>
-                    <a:prstGeom prst="rect"/>
-                  </pic:spPr>
-                </pic:pic>
-              </a:graphicData>
-            </a:graphic>
-          </wp:inline>
-        </w:drawing>
-      </w:r>
-    </w:p>
-    <w:p>
-      <w:pPr>
-        <w:jc w:val="center"/>
-      </w:pPr>
-      <w:r>
-        <w:rPr>
-          <w:i/>
-          <w:color w:val="707070"/>
-          <w:sz w:val="18"/>
-        </w:rPr>
-        <w:t>Figure 8-3  The Databook tab's two modes: “Manual selection (PDF)” and “Auto-generate by folder (Word)”</w:t>
-      </w:r>
-    </w:p>
-    <w:p/>
-    <w:p>
-      <w:pPr>
-        <w:ind w:left="576" w:right="576"/>
-        <w:shd w:val="clear" w:color="auto" w:fill="FFF8E1"/>
-      </w:pPr>
-      <w:r>
-        <w:rPr>
-          <w:b/>
-          <w:color w:val="924E00"/>
-        </w:rPr>
-        <w:t xml:space="preserve">Note: </w:t>
-      </w:r>
-      <w:r>
-        <w:t>Both modes create a brand-new file and never modify the original documents in your folders. The Word mode's tables, headings, and body text are native, editable Word content - not PDF pages pasted in as images - so you can freely add, remove, or reformat text afterward.</w:t>
-      </w:r>
-    </w:p>
-    <w:p>
-      <w:r>
-        <w:br w:type="page"/>
-      </w:r>
-    </w:p>
-    <w:p>
-      <w:pPr>
-        <w:pStyle w:val="Heading1"/>
-      </w:pPr>
-      <w:r>
-        <w:rPr>
-          <w:color w:val="1E40AF"/>
-        </w:rPr>
-        <w:t>9  Merging Documents into a Single PDF</w:t>
-      </w:r>
-    </w:p>
-    <w:p>
-      <w:r>
-        <w:t>Merge combines multiple PDFs and images from a folder into one PDF file, which is then added back into that folder.</w:t>
-      </w:r>
-    </w:p>
-    <w:p>
-      <w:pPr>
-        <w:pStyle w:val="ListNumber"/>
-        <w:ind w:left="360"/>
-      </w:pPr>
-      <w:r>
-        <w:t>Select a folder in the Tree tab.</w:t>
-      </w:r>
-    </w:p>
-    <w:p>
-      <w:pPr>
-        <w:pStyle w:val="ListNumber"/>
-        <w:ind w:left="360"/>
-      </w:pPr>
-      <w:r>
-        <w:t>Click Merge Documents in the main content panel.</w:t>
-      </w:r>
-    </w:p>
-    <w:p>
-      <w:pPr>
-        <w:pStyle w:val="ListNumber"/>
-        <w:ind w:left="360"/>
-      </w:pPr>
-      <w:r>
-        <w:t>A dialog opens listing the documents in the folder.</w:t>
-      </w:r>
-    </w:p>
-    <w:p>
-      <w:pPr>
-        <w:pStyle w:val="ListNumber"/>
-        <w:ind w:left="360"/>
-      </w:pPr>
-      <w:r>
-        <w:t>Check the documents to merge (or click Select All).</w:t>
-      </w:r>
-    </w:p>
-    <w:p>
-      <w:pPr>
-        <w:pStyle w:val="ListNumber"/>
-        <w:ind w:left="360"/>
-      </w:pPr>
-      <w:r>
-        <w:t>Click Merge.</w:t>
-      </w:r>
-    </w:p>
-    <w:p>
-      <w:pPr>
-        <w:pStyle w:val="ListNumber"/>
-        <w:ind w:left="360"/>
-      </w:pPr>
-      <w:r>
-        <w:t>DMS creates the merged PDF and adds it to the current folder.</w:t>
-      </w:r>
-    </w:p>
-    <w:p>
-      <w:pPr>
-        <w:ind w:left="576" w:right="576"/>
-        <w:shd w:val="clear" w:color="auto" w:fill="FFF8E1"/>
-      </w:pPr>
-      <w:r>
-        <w:rPr>
-          <w:b/>
-          <w:color w:val="924E00"/>
-        </w:rPr>
-        <w:t xml:space="preserve">Note: </w:t>
-      </w:r>
-      <w:r>
-        <w:t>Merging only supports PDF and image formats; Word/Excel/PowerPoint and other formats should be saved as PDF first, then uploaded and merged. The original documents remain in the folder afterward - unlink them manually if you no longer need the individual copies.</w:t>
-      </w:r>
-    </w:p>
-    <w:p>
-      <w:pPr>
-        <w:jc w:val="center"/>
-      </w:pPr>
-      <w:r>
-        <w:drawing>
-          <wp:inline xmlns:a="http://schemas.openxmlformats.org/drawingml/2006/main" xmlns:pic="http://schemas.openxmlformats.org/drawingml/2006/picture">
-            <wp:extent cx="5486400" cy="3429000"/>
-            <wp:docPr id="24" name="Picture 24"/>
-            <wp:cNvGraphicFramePr>
-              <a:graphicFrameLocks noChangeAspect="1"/>
-            </wp:cNvGraphicFramePr>
-            <a:graphic>
-              <a:graphicData uri="http://schemas.openxmlformats.org/drawingml/2006/picture">
-                <pic:pic>
-                  <pic:nvPicPr>
-                    <pic:cNvPr id="0" name="10_combine_dialog.png"/>
                     <pic:cNvPicPr/>
                   </pic:nvPicPr>
                   <pic:blipFill>
@@ -5893,10 +5828,39 @@
           <w:color w:val="707070"/>
           <w:sz w:val="18"/>
         </w:rPr>
-        <w:t>Figure 9-1  The merge-documents dialog</w:t>
+        <w:t>Figure 7-1  Example search results</w:t>
       </w:r>
     </w:p>
     <w:p/>
+    <w:p>
+      <w:pPr>
+        <w:pStyle w:val="Heading2"/>
+      </w:pPr>
+      <w:r>
+        <w:rPr>
+          <w:color w:val="1D4E89"/>
+        </w:rPr>
+        <w:t>7.3  Opening and Jumping to Results</w:t>
+      </w:r>
+    </w:p>
+    <w:p>
+      <w:pPr>
+        <w:pStyle w:val="ListBullet"/>
+        <w:ind w:left="360"/>
+      </w:pPr>
+      <w:r>
+        <w:t>Click a result card to open the Document Viewer for that document.</w:t>
+      </w:r>
+    </w:p>
+    <w:p>
+      <w:pPr>
+        <w:pStyle w:val="ListBullet"/>
+        <w:ind w:left="360"/>
+      </w:pPr>
+      <w:r>
+        <w:t>Double-click a result card to switch to the Tree tab and jump straight to the folder containing that document.</w:t>
+      </w:r>
+    </w:p>
     <w:p>
       <w:r>
         <w:br w:type="page"/>
@@ -5910,12 +5874,12 @@
         <w:rPr>
           <w:color w:val="1E40AF"/>
         </w:rPr>
-        <w:t>10  Face Recognition</w:t>
-      </w:r>
-    </w:p>
-    <w:p>
-      <w:r>
-        <w:t>The optional face-recognition component lets you tag faces in your photos and later browse them by person, with DMS automatically matching new photos of people it already knows.</w:t>
+        <w:t>8  Generating a Databook (PDF / Word)</w:t>
+      </w:r>
+    </w:p>
+    <w:p>
+      <w:r>
+        <w:t>The Databook feature combines selected documents into a single, professional document with a cover page, table of contents, section headers, and page numbers. Two modes are available: manually checking documents to build a PDF (8.1-8.2), or automatically generating an editable Word document from a folder's structure (8.3).</w:t>
       </w:r>
     </w:p>
     <w:p>
@@ -5926,7 +5890,7 @@
         <w:rPr>
           <w:color w:val="1D4E89"/>
         </w:rPr>
-        <w:t>10.1  Installing the Face Recognition Component</w:t>
+        <w:t>8.1  Selecting Documents (PDF mode)</w:t>
       </w:r>
     </w:p>
     <w:p>
@@ -5935,7 +5899,7 @@
         <w:ind w:left="360"/>
       </w:pPr>
       <w:r>
-        <w:t>Click the Faces tab in the sidebar.</w:t>
+        <w:t>Click the Databook tab in the sidebar.</w:t>
       </w:r>
     </w:p>
     <w:p>
@@ -5944,7 +5908,7 @@
         <w:ind w:left="360"/>
       </w:pPr>
       <w:r>
-        <w:t>If the component (deepface) isn't installed yet, a prompt explains this and offers an Auto-install deepface button.</w:t>
+        <w:t>The tree is shown with a checkbox next to each folder, plus a Select All link.</w:t>
       </w:r>
     </w:p>
     <w:p>
@@ -5953,7 +5917,44 @@
         <w:ind w:left="360"/>
       </w:pPr>
       <w:r>
-        <w:t>Click it and wait - this downloads TensorFlow and related libraries in the background and can take several minutes on a slow connection; you can keep using the rest of the app meanwhile.</w:t>
+        <w:t>Check individual documents, or use the shortcuts:</w:t>
+      </w:r>
+    </w:p>
+    <w:p>
+      <w:pPr>
+        <w:pStyle w:val="ListBullet"/>
+        <w:ind w:left="360"/>
+      </w:pPr>
+      <w:r>
+        <w:t>Click Select All next to a folder to select every document in that folder (optionally including sub-folders).</w:t>
+      </w:r>
+    </w:p>
+    <w:p>
+      <w:pPr>
+        <w:pStyle w:val="ListBullet"/>
+        <w:ind w:left="360"/>
+      </w:pPr>
+      <w:r>
+        <w:t>Click Clear to deselect everything.</w:t>
+      </w:r>
+    </w:p>
+    <w:p>
+      <w:pPr>
+        <w:ind w:left="576" w:right="576"/>
+        <w:shd w:val="clear" w:color="auto" w:fill="E6F4EA"/>
+      </w:pPr>
+      <w:r>
+        <w:rPr>
+          <w:b/>
+          <w:color w:val="056F00"/>
+        </w:rPr>
+        <w:t xml:space="preserve">Tip: </w:t>
+      </w:r>
+      <w:r>
+        <w:rPr>
+          <w:color w:val="333333"/>
+        </w:rPr>
+        <w:t>Your selection is saved automatically - close and reopen DMS and it will still be there.</w:t>
       </w:r>
     </w:p>
     <w:p>
@@ -5972,7 +5973,7 @@
               <a:graphicData uri="http://schemas.openxmlformats.org/drawingml/2006/picture">
                 <pic:pic>
                   <pic:nvPicPr>
-                    <pic:cNvPr id="0" name="16_face_tab.png"/>
+                    <pic:cNvPr id="0" name="08_databook_tab.png"/>
                     <pic:cNvPicPr/>
                   </pic:nvPicPr>
                   <pic:blipFill>
@@ -6005,7 +6006,7 @@
           <w:color w:val="707070"/>
           <w:sz w:val="18"/>
         </w:rPr>
-        <w:t>Figure 10-1  The Faces tab (shown here with the component already installed, hence the empty state; before installing, you'd instead see a prompt with an Auto-install deepface button)</w:t>
+        <w:t>Figure 8-1  The Databook tab: checking documents to include</w:t>
       </w:r>
     </w:p>
     <w:p/>
@@ -6017,7 +6018,7 @@
         <w:rPr>
           <w:color w:val="1D4E89"/>
         </w:rPr>
-        <w:t>10.2  Tagging Faces</w:t>
+        <w:t>8.2  Generating the PDF</w:t>
       </w:r>
     </w:p>
     <w:p>
@@ -6026,7 +6027,7 @@
         <w:ind w:left="360"/>
       </w:pPr>
       <w:r>
-        <w:t>From a folder, click Tag Faces to enter selection mode.</w:t>
+        <w:t>After selecting documents, click Generate Databook.</w:t>
       </w:r>
     </w:p>
     <w:p>
@@ -6035,7 +6036,30 @@
         <w:ind w:left="360"/>
       </w:pPr>
       <w:r>
-        <w:t>Check the photos you want DMS to scan for faces.</w:t>
+        <w:t>In the dialog, enter a Title (the main heading on the cover page) and a Subtitle (a secondary line, e.g. project name or revision number).</w:t>
+      </w:r>
+    </w:p>
+    <w:p>
+      <w:pPr>
+        <w:pStyle w:val="ListNumber"/>
+        <w:ind w:left="360"/>
+      </w:pPr>
+      <w:r>
+        <w:t>Click Generate and Download.</w:t>
+      </w:r>
+    </w:p>
+    <w:p>
+      <w:pPr>
+        <w:pStyle w:val="ListNumber"/>
+        <w:ind w:left="360"/>
+      </w:pPr>
+      <w:r>
+        <w:t>DMS generates the PDF on the server and your browser downloads it automatically.</w:t>
+      </w:r>
+    </w:p>
+    <w:p>
+      <w:r>
+        <w:t>The generated PDF includes: a cover page (title, subtitle, date), a table of contents with clickable bookmarks, section-header pages, all selected documents in tree order, and page numbers/footers throughout.</w:t>
       </w:r>
     </w:p>
     <w:p>
@@ -6054,7 +6078,7 @@
               <a:graphicData uri="http://schemas.openxmlformats.org/drawingml/2006/picture">
                 <pic:pic>
                   <pic:nvPicPr>
-                    <pic:cNvPr id="0" name="21_face_select_mode.png"/>
+                    <pic:cNvPr id="0" name="09_databook_dialog.png"/>
                     <pic:cNvPicPr/>
                   </pic:nvPicPr>
                   <pic:blipFill>
@@ -6087,17 +6111,51 @@
           <w:color w:val="707070"/>
           <w:sz w:val="18"/>
         </w:rPr>
-        <w:t>Figure 10-2  Selection mode: photos checked for face detection</w:t>
+        <w:t>Figure 8-2  The Generate Databook dialog</w:t>
       </w:r>
     </w:p>
     <w:p/>
+    <w:p>
+      <w:pPr>
+        <w:pStyle w:val="Heading2"/>
+      </w:pPr>
+      <w:r>
+        <w:rPr>
+          <w:color w:val="1D4E89"/>
+        </w:rPr>
+        <w:t>8.3  Auto-Generating a Word Databook from a Folder</w:t>
+      </w:r>
+    </w:p>
+    <w:p>
+      <w:r>
+        <w:t>Instead of hand-checking individual documents, this mode only needs you to pick one “top” folder - DMS automatically turns the folder structure into chapters, producing a .docx file you can keep editing and reformatting in Word - useful when you need to tweak layout before submitting it, or the recipient specifically wants Word rather than PDF.</w:t>
+      </w:r>
+    </w:p>
     <w:p>
       <w:pPr>
         <w:pStyle w:val="ListNumber"/>
         <w:ind w:left="360"/>
       </w:pPr>
       <w:r>
-        <w:t>Click to run detection; DMS finds faces in the checked photos.</w:t>
+        <w:t>Click the Databook tab in the sidebar, then switch to Auto-Generate by Folder (Word).</w:t>
+      </w:r>
+    </w:p>
+    <w:p>
+      <w:pPr>
+        <w:pStyle w:val="ListNumber"/>
+        <w:ind w:left="360"/>
+      </w:pPr>
+      <w:r>
+        <w:t>Check one folder - each of its sub-folders (nesting to any depth) becomes a chapter, documents within a chapter keep their existing folder order, and each document is followed by its own description text.</w:t>
+      </w:r>
+    </w:p>
+    <w:p>
+      <w:pPr>
+        <w:pStyle w:val="ListNumber"/>
+        <w:ind w:left="360"/>
+      </w:pPr>
+      <w:r>
+        <w:t>Click the generate button; DMS builds the .docx file on the server and your browser downloads it.</w:t>
       </w:r>
     </w:p>
     <w:p>
@@ -6107,7 +6165,7 @@
       <w:r>
         <w:drawing>
           <wp:inline xmlns:a="http://schemas.openxmlformats.org/drawingml/2006/main" xmlns:pic="http://schemas.openxmlformats.org/drawingml/2006/picture">
-            <wp:extent cx="5486400" cy="3429000"/>
+            <wp:extent cx="5486400" cy="2741275"/>
             <wp:docPr id="27" name="Picture 27"/>
             <wp:cNvGraphicFramePr>
               <a:graphicFrameLocks noChangeAspect="1"/>
@@ -6116,7 +6174,7 @@
               <a:graphicData uri="http://schemas.openxmlformats.org/drawingml/2006/picture">
                 <pic:pic>
                   <pic:nvPicPr>
-                    <pic:cNvPr id="0" name="22_face_tagging_dialog.png"/>
+                    <pic:cNvPr id="0" name="34_databook_docx.png"/>
                     <pic:cNvPicPr/>
                   </pic:nvPicPr>
                   <pic:blipFill>
@@ -6128,7 +6186,7 @@
                   <pic:spPr>
                     <a:xfrm>
                       <a:off x="0" y="0"/>
-                      <a:ext cx="5486400" cy="3429000"/>
+                      <a:ext cx="5486400" cy="2741275"/>
                     </a:xfrm>
                     <a:prstGeom prst="rect"/>
                   </pic:spPr>
@@ -6149,83 +6207,10 @@
           <w:color w:val="707070"/>
           <w:sz w:val="18"/>
         </w:rPr>
-        <w:t>Figure 10-3  Face detection in progress</w:t>
+        <w:t>Figure 8-3  The Databook tab's two modes: “Manual selection (PDF)” and “Auto-generate by folder (Word)”</w:t>
       </w:r>
     </w:p>
     <w:p/>
-    <w:p>
-      <w:pPr>
-        <w:pStyle w:val="ListNumber"/>
-        <w:ind w:left="360"/>
-      </w:pPr>
-      <w:r>
-        <w:t>For each detected face, type a person's name (or pick an existing one) to tag it.</w:t>
-      </w:r>
-    </w:p>
-    <w:p>
-      <w:pPr>
-        <w:pStyle w:val="Heading2"/>
-      </w:pPr>
-      <w:r>
-        <w:rPr>
-          <w:color w:val="1D4E89"/>
-        </w:rPr>
-        <w:t>10.3  Browsing by Person / Auto-Matching</w:t>
-      </w:r>
-    </w:p>
-    <w:p>
-      <w:r>
-        <w:t>Once some faces are tagged, the Faces tab lets you browse photos grouped by person. New photos you tag later are automatically compared against known faces and suggested matches, so you don't have to name every single photo of the same person from scratch.</w:t>
-      </w:r>
-    </w:p>
-    <w:p>
-      <w:r>
-        <w:br w:type="page"/>
-      </w:r>
-    </w:p>
-    <w:p>
-      <w:pPr>
-        <w:pStyle w:val="Heading1"/>
-      </w:pPr>
-      <w:r>
-        <w:rPr>
-          <w:color w:val="1E40AF"/>
-        </w:rPr>
-        <w:t>11  Remote and Mobile Upload</w:t>
-      </w:r>
-    </w:p>
-    <w:p>
-      <w:pPr>
-        <w:pStyle w:val="Heading2"/>
-      </w:pPr>
-      <w:r>
-        <w:rPr>
-          <w:color w:val="1D4E89"/>
-        </w:rPr>
-        <w:t>11.1  Sending a Single Document to a Phone</w:t>
-      </w:r>
-    </w:p>
-    <w:p>
-      <w:r>
-        <w:t>Click the “send to phone” icon on any document card to generate a link that opens the document directly on a phone's browser - share it by SMS/iMessage, or copy the link and send it any way you like.</w:t>
-      </w:r>
-    </w:p>
-    <w:p>
-      <w:pPr>
-        <w:pStyle w:val="Heading2"/>
-      </w:pPr>
-      <w:r>
-        <w:rPr>
-          <w:color w:val="1D4E89"/>
-        </w:rPr>
-        <w:t>11.2  Remote Upload (QR-Code Batch Intake)</w:t>
-      </w:r>
-    </w:p>
-    <w:p>
-      <w:r>
-        <w:t>To receive a batch of photos or files from someone else's phone (or your own) without emailing them one by one, use Remote Upload from the desktop launcher: it shows a QR code that, once scanned, opens an upload page on the phone's browser, and anything uploaded there lands directly in the folder you chose on the desktop.</w:t>
-      </w:r>
-    </w:p>
     <w:p>
       <w:pPr>
         <w:ind w:left="576" w:right="576"/>
@@ -6239,7 +6224,7 @@
         <w:t xml:space="preserve">Note: </w:t>
       </w:r>
       <w:r>
-        <w:t>Remote upload works over your local network by default; sending or receiving across the open internet requires the tunnel/ngrok setup described alongside that feature in the app, which is outside the scope of this manual section.</w:t>
+        <w:t>Both modes create a brand-new file and never modify the original documents in your folders. The Word mode's tables, headings, and body text are native, editable Word content - not PDF pages pasted in as images - so you can freely add, remove, or reformat text afterward.</w:t>
       </w:r>
     </w:p>
     <w:p>
@@ -6255,106 +6240,12 @@
         <w:rPr>
           <w:color w:val="1E40AF"/>
         </w:rPr>
-        <w:t>12  Project Management</w:t>
-      </w:r>
-    </w:p>
-    <w:p>
-      <w:r>
-        <w:t>The Project menu (in the header bar) provides tools for backing up, restoring, merging, and importing data.</w:t>
-      </w:r>
-    </w:p>
-    <w:p>
-      <w:pPr>
-        <w:pStyle w:val="Heading2"/>
-      </w:pPr>
-      <w:r>
-        <w:rPr>
-          <w:color w:val="1D4E89"/>
-        </w:rPr>
-        <w:t>12.1  Export Index Backup (METADATA)</w:t>
-      </w:r>
-    </w:p>
-    <w:p>
-      <w:r>
-        <w:t>Backs up only the folder-tree structure and metadata (not the actual document files) as a .dms file, named with a METADATA- prefix. Much smaller and faster than a full backup - useful for structural snapshots.</w:t>
-      </w:r>
-    </w:p>
-    <w:p>
-      <w:pPr>
-        <w:pStyle w:val="Heading2"/>
-      </w:pPr>
-      <w:r>
-        <w:rPr>
-          <w:color w:val="1D4E89"/>
-        </w:rPr>
-        <w:t>12.2  Export Full Backup (COMP)</w:t>
-      </w:r>
-    </w:p>
-    <w:p>
-      <w:r>
-        <w:t>Backs up the entire folder tree and every document file, packaged as a .dms file with a COMP- prefix. This is a complete, self-contained backup of the project.</w:t>
-      </w:r>
-    </w:p>
-    <w:p>
-      <w:pPr>
-        <w:ind w:left="576" w:right="576"/>
-        <w:shd w:val="clear" w:color="auto" w:fill="E6F4EA"/>
-      </w:pPr>
-      <w:r>
-        <w:rPr>
-          <w:b/>
-          <w:color w:val="056F00"/>
-        </w:rPr>
-        <w:t xml:space="preserve">Tip: </w:t>
-      </w:r>
-      <w:r>
-        <w:rPr>
-          <w:color w:val="333333"/>
-        </w:rPr>
-        <w:t>Save this file to a USB drive or cloud storage as a regular backup.</w:t>
-      </w:r>
-    </w:p>
-    <w:p>
-      <w:pPr>
-        <w:pStyle w:val="Heading2"/>
-      </w:pPr>
-      <w:r>
-        <w:rPr>
-          <w:color w:val="1D4E89"/>
-        </w:rPr>
-        <w:t>12.3  Export Selected Folders (PART)</w:t>
-      </w:r>
-    </w:p>
-    <w:p>
-      <w:r>
-        <w:t>Lets you pick specific folders to export (with their files), producing a .dms file with a PART- prefix - useful for sharing or archiving just part of a project.</w:t>
-      </w:r>
-    </w:p>
-    <w:p>
-      <w:pPr>
-        <w:pStyle w:val="Heading2"/>
-      </w:pPr>
-      <w:r>
-        <w:rPr>
-          <w:color w:val="1D4E89"/>
-        </w:rPr>
-        <w:t>12.4  Backup Retention Rules</w:t>
-      </w:r>
-    </w:p>
-    <w:p>
-      <w:r>
-        <w:t>The project keeps the 10 most recent .dms backups in the project's root folder; older ones are automatically moved into a “Not Shown in The Tree” archive folder at the root of the storage directory (not to be confused with the similarly named “Not Show in Tree” node inside the document tree from section 3.2, which holds soft-deleted documents instead).</w:t>
-      </w:r>
-    </w:p>
-    <w:p>
-      <w:pPr>
-        <w:pStyle w:val="Heading2"/>
-      </w:pPr>
-      <w:r>
-        <w:rPr>
-          <w:color w:val="1D4E89"/>
-        </w:rPr>
-        <w:t>12.5  Import a Project (.dms)</w:t>
+        <w:t>9  Merging Documents into a Single PDF</w:t>
+      </w:r>
+    </w:p>
+    <w:p>
+      <w:r>
+        <w:t>Merge combines multiple PDFs and images from a folder into one PDF file, which is then added back into that folder.</w:t>
       </w:r>
     </w:p>
     <w:p>
@@ -6363,7 +6254,7 @@
         <w:ind w:left="360"/>
       </w:pPr>
       <w:r>
-        <w:t>Click Project, then Import Project (.dms) and select the file.</w:t>
+        <w:t>Select a folder in the Tree tab.</w:t>
       </w:r>
     </w:p>
     <w:p>
@@ -6372,7 +6263,7 @@
         <w:ind w:left="360"/>
       </w:pPr>
       <w:r>
-        <w:t>Choose a destination folder for the import (a new, empty folder is recommended).</w:t>
+        <w:t>Click Merge Documents in the main content panel.</w:t>
       </w:r>
     </w:p>
     <w:p>
@@ -6381,7 +6272,7 @@
         <w:ind w:left="360"/>
       </w:pPr>
       <w:r>
-        <w:t>Click Import and Switch.</w:t>
+        <w:t>A dialog opens listing the documents in the folder.</w:t>
       </w:r>
     </w:p>
     <w:p>
@@ -6390,7 +6281,25 @@
         <w:ind w:left="360"/>
       </w:pPr>
       <w:r>
-        <w:t>DMS extracts the files and rebuilds the tree structure, and switches the active project to it.</w:t>
+        <w:t>Check the documents to merge (or click Select All).</w:t>
+      </w:r>
+    </w:p>
+    <w:p>
+      <w:pPr>
+        <w:pStyle w:val="ListNumber"/>
+        <w:ind w:left="360"/>
+      </w:pPr>
+      <w:r>
+        <w:t>Click Merge.</w:t>
+      </w:r>
+    </w:p>
+    <w:p>
+      <w:pPr>
+        <w:pStyle w:val="ListNumber"/>
+        <w:ind w:left="360"/>
+      </w:pPr>
+      <w:r>
+        <w:t>DMS creates the merged PDF and adds it to the current folder.</w:t>
       </w:r>
     </w:p>
     <w:p>
@@ -6406,82 +6315,7 @@
         <w:t xml:space="preserve">Note: </w:t>
       </w:r>
       <w:r>
-        <w:t>Importing only restores the folder-tree structure; it never deletes files already on disk.</w:t>
-      </w:r>
-    </w:p>
-    <w:p>
-      <w:pPr>
-        <w:pStyle w:val="Heading2"/>
-      </w:pPr>
-      <w:r>
-        <w:rPr>
-          <w:color w:val="1D4E89"/>
-        </w:rPr>
-        <w:t>12.6  CSV Export</w:t>
-      </w:r>
-    </w:p>
-    <w:p>
-      <w:r>
-        <w:t>Click Project, then Export Metadata (CSV) to download a spreadsheet with one row per document, including document ID, name, size, upload date, and metadata fields. Open it in Excel or Google Sheets for analysis or sharing.</w:t>
-      </w:r>
-    </w:p>
-    <w:p>
-      <w:pPr>
-        <w:pStyle w:val="Heading2"/>
-      </w:pPr>
-      <w:r>
-        <w:rPr>
-          <w:color w:val="1D4E89"/>
-        </w:rPr>
-        <w:t>12.7  Batch ZIP Import</w:t>
-      </w:r>
-    </w:p>
-    <w:p>
-      <w:r>
-        <w:t>Upload many files at once from a ZIP archive and have DMS automatically sort them into matching folders by filename prefix. Folders referenced by a filename must already exist in the tree; documents with an unrecognized folder name are left unlinked.</w:t>
-      </w:r>
-    </w:p>
-    <w:p>
-      <w:pPr>
-        <w:pStyle w:val="Heading2"/>
-      </w:pPr>
-      <w:r>
-        <w:rPr>
-          <w:color w:val="1D4E89"/>
-        </w:rPr>
-        <w:t>12.8  Hierarchy Import (with auto de-duplication)</w:t>
-      </w:r>
-    </w:p>
-    <w:p>
-      <w:r>
-        <w:t>Builds a folder tree quickly from a plain text file.</w:t>
-      </w:r>
-    </w:p>
-    <w:p>
-      <w:pPr>
-        <w:pStyle w:val="ListNumber"/>
-        <w:ind w:left="360"/>
-      </w:pPr>
-      <w:r>
-        <w:t>Prepare a text file with 2-3 comma-separated columns per line: folder name, parent folder name, description (optional). The first line is the root folder, with the parent-folder column omitted for it.</w:t>
-      </w:r>
-    </w:p>
-    <w:p>
-      <w:pPr>
-        <w:pStyle w:val="ListNumber"/>
-        <w:ind w:left="360"/>
-      </w:pPr>
-      <w:r>
-        <w:t>Click Project, then Create Folder Tree from Hierarchy, and upload (or paste) the text.</w:t>
-      </w:r>
-    </w:p>
-    <w:p>
-      <w:pPr>
-        <w:pStyle w:val="ListNumber"/>
-        <w:ind w:left="360"/>
-      </w:pPr>
-      <w:r>
-        <w:t>DMS validates the structure and shows a preview, including any errors.</w:t>
+        <w:t>Merging only supports PDF and image formats; Word/Excel/PowerPoint and other formats should be saved as PDF first, then uploaded and merged. The original documents remain in the folder afterward - unlink them manually if you no longer need the individual copies.</w:t>
       </w:r>
     </w:p>
     <w:p>
@@ -6500,7 +6334,7 @@
               <a:graphicData uri="http://schemas.openxmlformats.org/drawingml/2006/picture">
                 <pic:pic>
                   <pic:nvPicPr>
-                    <pic:cNvPr id="0" name="12_hierarchy_import_empty.png"/>
+                    <pic:cNvPr id="0" name="10_combine_dialog.png"/>
                     <pic:cNvPicPr/>
                   </pic:nvPicPr>
                   <pic:blipFill>
@@ -6533,10 +6367,69 @@
           <w:color w:val="707070"/>
           <w:sz w:val="18"/>
         </w:rPr>
-        <w:t>Figure 12-1  The hierarchy import dialog (initial state)</w:t>
+        <w:t>Figure 9-1  The merge-documents dialog</w:t>
       </w:r>
     </w:p>
     <w:p/>
+    <w:p>
+      <w:r>
+        <w:br w:type="page"/>
+      </w:r>
+    </w:p>
+    <w:p>
+      <w:pPr>
+        <w:pStyle w:val="Heading1"/>
+      </w:pPr>
+      <w:r>
+        <w:rPr>
+          <w:color w:val="1E40AF"/>
+        </w:rPr>
+        <w:t>10  Face Recognition</w:t>
+      </w:r>
+    </w:p>
+    <w:p>
+      <w:r>
+        <w:t>The optional face-recognition component lets you tag faces in your photos and later browse them by person, with DMS automatically matching new photos of people it already knows.</w:t>
+      </w:r>
+    </w:p>
+    <w:p>
+      <w:pPr>
+        <w:pStyle w:val="Heading2"/>
+      </w:pPr>
+      <w:r>
+        <w:rPr>
+          <w:color w:val="1D4E89"/>
+        </w:rPr>
+        <w:t>10.1  Installing the Face Recognition Component</w:t>
+      </w:r>
+    </w:p>
+    <w:p>
+      <w:pPr>
+        <w:pStyle w:val="ListNumber"/>
+        <w:ind w:left="360"/>
+      </w:pPr>
+      <w:r>
+        <w:t>Click the Faces tab in the sidebar.</w:t>
+      </w:r>
+    </w:p>
+    <w:p>
+      <w:pPr>
+        <w:pStyle w:val="ListNumber"/>
+        <w:ind w:left="360"/>
+      </w:pPr>
+      <w:r>
+        <w:t>If the component (deepface) isn't installed yet, a prompt explains this and offers an Auto-install deepface button.</w:t>
+      </w:r>
+    </w:p>
+    <w:p>
+      <w:pPr>
+        <w:pStyle w:val="ListNumber"/>
+        <w:ind w:left="360"/>
+      </w:pPr>
+      <w:r>
+        <w:t>Click it and wait - this downloads TensorFlow and related libraries in the background and can take several minutes on a slow connection; you can keep using the rest of the app meanwhile.</w:t>
+      </w:r>
+    </w:p>
     <w:p>
       <w:pPr>
         <w:jc w:val="center"/>
@@ -6553,7 +6446,7 @@
               <a:graphicData uri="http://schemas.openxmlformats.org/drawingml/2006/picture">
                 <pic:pic>
                   <pic:nvPicPr>
-                    <pic:cNvPr id="0" name="14_hierarchy_import_error.png"/>
+                    <pic:cNvPr id="0" name="16_face_tab.png"/>
                     <pic:cNvPicPr/>
                   </pic:nvPicPr>
                   <pic:blipFill>
@@ -6586,10 +6479,58 @@
           <w:color w:val="707070"/>
           <w:sz w:val="18"/>
         </w:rPr>
-        <w:t>Figure 12-2  With auto-numbering off, a duplicate folder name is flagged as an error</w:t>
+        <w:t>Figure 10-1  The Faces tab (shown here with the component already installed, hence the empty state; before installing, you'd instead see a prompt with an Auto-install deepface button)</w:t>
       </w:r>
     </w:p>
     <w:p/>
+    <w:p>
+      <w:pPr>
+        <w:ind w:left="576" w:right="576"/>
+        <w:shd w:val="clear" w:color="auto" w:fill="E6F4EA"/>
+      </w:pPr>
+      <w:r>
+        <w:rPr>
+          <w:b/>
+          <w:color w:val="056F00"/>
+        </w:rPr>
+        <w:t xml:space="preserve">Tip: </w:t>
+      </w:r>
+      <w:r>
+        <w:rPr>
+          <w:color w:val="333333"/>
+        </w:rPr>
+        <w:t>If auto-install keeps failing (more common on Windows), download the Face Recognition Install Guide (.txt) - Windows from the Project menu's Downloads group for manual, step-by-step instructions for installing Python 3.12 and deepface.</w:t>
+      </w:r>
+    </w:p>
+    <w:p>
+      <w:pPr>
+        <w:pStyle w:val="Heading2"/>
+      </w:pPr>
+      <w:r>
+        <w:rPr>
+          <w:color w:val="1D4E89"/>
+        </w:rPr>
+        <w:t>10.2  Tagging Faces</w:t>
+      </w:r>
+    </w:p>
+    <w:p>
+      <w:pPr>
+        <w:pStyle w:val="ListNumber"/>
+        <w:ind w:left="360"/>
+      </w:pPr>
+      <w:r>
+        <w:t>From a folder, click Tag Faces to enter selection mode.</w:t>
+      </w:r>
+    </w:p>
+    <w:p>
+      <w:pPr>
+        <w:pStyle w:val="ListNumber"/>
+        <w:ind w:left="360"/>
+      </w:pPr>
+      <w:r>
+        <w:t>Check the photos you want DMS to scan for faces.</w:t>
+      </w:r>
+    </w:p>
     <w:p>
       <w:pPr>
         <w:jc w:val="center"/>
@@ -6606,7 +6547,7 @@
               <a:graphicData uri="http://schemas.openxmlformats.org/drawingml/2006/picture">
                 <pic:pic>
                   <pic:nvPicPr>
-                    <pic:cNvPr id="0" name="15_hierarchy_import_dedupe_ok.png"/>
+                    <pic:cNvPr id="0" name="21_face_select_mode.png"/>
                     <pic:cNvPicPr/>
                   </pic:nvPicPr>
                   <pic:blipFill>
@@ -6639,7 +6580,7 @@
           <w:color w:val="707070"/>
           <w:sz w:val="18"/>
         </w:rPr>
-        <w:t>Figure 12-3  With auto-numbering on, the duplicate name is numbered and passes validation</w:t>
+        <w:t>Figure 10-2  Selection mode: photos checked for face detection</w:t>
       </w:r>
     </w:p>
     <w:p/>
@@ -6649,23 +6590,7 @@
         <w:ind w:left="360"/>
       </w:pPr>
       <w:r>
-        <w:t>Click Create; all folders appear in the tree immediately.</w:t>
-      </w:r>
-    </w:p>
-    <w:p>
-      <w:pPr>
-        <w:pStyle w:val="Heading2"/>
-      </w:pPr>
-      <w:r>
-        <w:rPr>
-          <w:color w:val="1D4E89"/>
-        </w:rPr>
-        <w:t>12.9  Downloading This Manual from Inside the App</w:t>
-      </w:r>
-    </w:p>
-    <w:p>
-      <w:r>
-        <w:t>Click Project, then Download User Manual (.docx) under the Downloads section, to get the same manual you're reading now, generated fresh from inside the running app.</w:t>
+        <w:t>Click to run detection; DMS finds faces in the checked photos.</w:t>
       </w:r>
     </w:p>
     <w:p>
@@ -6684,7 +6609,7 @@
               <a:graphicData uri="http://schemas.openxmlformats.org/drawingml/2006/picture">
                 <pic:pic>
                   <pic:nvPicPr>
-                    <pic:cNvPr id="0" name="11_project_menu.png"/>
+                    <pic:cNvPr id="0" name="22_face_tagging_dialog.png"/>
                     <pic:cNvPicPr/>
                   </pic:nvPicPr>
                   <pic:blipFill>
@@ -6717,10 +6642,35 @@
           <w:color w:val="707070"/>
           <w:sz w:val="18"/>
         </w:rPr>
-        <w:t>Figure 12-4  The Project menu: export, import, and settings</w:t>
+        <w:t>Figure 10-3  Face detection in progress</w:t>
       </w:r>
     </w:p>
     <w:p/>
+    <w:p>
+      <w:pPr>
+        <w:pStyle w:val="ListNumber"/>
+        <w:ind w:left="360"/>
+      </w:pPr>
+      <w:r>
+        <w:t>For each detected face, type a person's name (or pick an existing one) to tag it.</w:t>
+      </w:r>
+    </w:p>
+    <w:p>
+      <w:pPr>
+        <w:pStyle w:val="Heading2"/>
+      </w:pPr>
+      <w:r>
+        <w:rPr>
+          <w:color w:val="1D4E89"/>
+        </w:rPr>
+        <w:t>10.3  Browsing by Person / Auto-Matching</w:t>
+      </w:r>
+    </w:p>
+    <w:p>
+      <w:r>
+        <w:t>Once some faces are tagged, the Faces tab lets you browse photos grouped by person. New photos you tag later are automatically compared against known faces and suggested matches, so you don't have to name every single photo of the same person from scratch.</w:t>
+      </w:r>
+    </w:p>
     <w:p>
       <w:r>
         <w:br w:type="page"/>
@@ -6734,7 +6684,7 @@
         <w:rPr>
           <w:color w:val="1E40AF"/>
         </w:rPr>
-        <w:t>13  Cloud Sync and Email</w:t>
+        <w:t>11  Remote and Mobile Upload</w:t>
       </w:r>
     </w:p>
     <w:p>
@@ -6745,12 +6695,28 @@
         <w:rPr>
           <w:color w:val="1D4E89"/>
         </w:rPr>
-        <w:t>13.1  Using OneDrive to Sync Storage</w:t>
-      </w:r>
-    </w:p>
-    <w:p>
-      <w:r>
-        <w:t>Pointing your DMS storage folder at a location synced by OneDrive (or a similar cloud-sync service) gives you automatic off-site backup with no extra steps - every change DMS makes on disk gets picked up and uploaded by the sync client in the background, the same as any other file in that folder.</w:t>
+        <w:t>11.1  Sending a Single Document to a Phone</w:t>
+      </w:r>
+    </w:p>
+    <w:p>
+      <w:r>
+        <w:t>Click the “send to phone” icon on any document card to generate a link that opens the document directly on a phone's browser - share it by SMS/iMessage, or copy the link and send it any way you like.</w:t>
+      </w:r>
+    </w:p>
+    <w:p>
+      <w:pPr>
+        <w:pStyle w:val="Heading2"/>
+      </w:pPr>
+      <w:r>
+        <w:rPr>
+          <w:color w:val="1D4E89"/>
+        </w:rPr>
+        <w:t>11.2  Remote Upload (QR-Code Batch Intake)</w:t>
+      </w:r>
+    </w:p>
+    <w:p>
+      <w:r>
+        <w:t>To receive a batch of photos or files from someone else's phone (or your own) without emailing them one by one, use Remote Upload from the desktop launcher: it shows a QR code that, once scanned, opens an upload page on the phone's browser, and anything uploaded there lands directly in the folder you chose on the desktop.</w:t>
       </w:r>
     </w:p>
     <w:p>
@@ -6766,7 +6732,44 @@
         <w:t xml:space="preserve">Note: </w:t>
       </w:r>
       <w:r>
-        <w:t>Very large libraries, or a very slow internet connection, can make cloud sync lag behind your local changes; this is a property of the sync client, not of DMS.</w:t>
+        <w:t>Remote upload works over your local network by default; sending or receiving across the open internet requires the tunnel/ngrok setup described alongside that feature in the app, which is outside the scope of this manual section.</w:t>
+      </w:r>
+    </w:p>
+    <w:p>
+      <w:r>
+        <w:br w:type="page"/>
+      </w:r>
+    </w:p>
+    <w:p>
+      <w:pPr>
+        <w:pStyle w:val="Heading1"/>
+      </w:pPr>
+      <w:r>
+        <w:rPr>
+          <w:color w:val="1E40AF"/>
+        </w:rPr>
+        <w:t>12  Project Management</w:t>
+      </w:r>
+    </w:p>
+    <w:p>
+      <w:r>
+        <w:t>The Project menu (in the header bar) provides tools for backing up, restoring, merging, and importing data.</w:t>
+      </w:r>
+    </w:p>
+    <w:p>
+      <w:pPr>
+        <w:ind w:left="576" w:right="576"/>
+        <w:shd w:val="clear" w:color="auto" w:fill="FFF8E1"/>
+      </w:pPr>
+      <w:r>
+        <w:rPr>
+          <w:b/>
+          <w:color w:val="924E00"/>
+        </w:rPr>
+        <w:t xml:space="preserve">Note: </w:t>
+      </w:r>
+      <w:r>
+        <w:t>If you've set an access password (Chapter 14), all three export types (METADATA / COMP / PART) show an “Automatically encrypted with the project password” note in the menu - the exported .dms file is encrypted with that password, and the same password is needed to decrypt it when importing on another machine. Without a password set, exported backups are not encrypted.</w:t>
       </w:r>
     </w:p>
     <w:p>
@@ -6777,12 +6780,90 @@
         <w:rPr>
           <w:color w:val="1D4E89"/>
         </w:rPr>
-        <w:t>13.2  Email Sending Setup</w:t>
-      </w:r>
-    </w:p>
-    <w:p>
-      <w:r>
-        <w:t>To use the “email” action on a document card, configure an SMTP account first.</w:t>
+        <w:t>12.1  Export Index Backup (METADATA)</w:t>
+      </w:r>
+    </w:p>
+    <w:p>
+      <w:r>
+        <w:t>Backs up only the folder-tree structure and metadata (not the actual document files) as a .dms file, named with a METADATA- prefix. Much smaller and faster than a full backup - useful for structural snapshots.</w:t>
+      </w:r>
+    </w:p>
+    <w:p>
+      <w:pPr>
+        <w:pStyle w:val="Heading2"/>
+      </w:pPr>
+      <w:r>
+        <w:rPr>
+          <w:color w:val="1D4E89"/>
+        </w:rPr>
+        <w:t>12.2  Export Full Backup (COMP)</w:t>
+      </w:r>
+    </w:p>
+    <w:p>
+      <w:r>
+        <w:t>Backs up the entire folder tree and every document file, packaged as a .dms file with a COMP- prefix. This is a complete, self-contained backup of the project.</w:t>
+      </w:r>
+    </w:p>
+    <w:p>
+      <w:pPr>
+        <w:ind w:left="576" w:right="576"/>
+        <w:shd w:val="clear" w:color="auto" w:fill="E6F4EA"/>
+      </w:pPr>
+      <w:r>
+        <w:rPr>
+          <w:b/>
+          <w:color w:val="056F00"/>
+        </w:rPr>
+        <w:t xml:space="preserve">Tip: </w:t>
+      </w:r>
+      <w:r>
+        <w:rPr>
+          <w:color w:val="333333"/>
+        </w:rPr>
+        <w:t>Save this file to a USB drive or cloud storage as a regular backup.</w:t>
+      </w:r>
+    </w:p>
+    <w:p>
+      <w:pPr>
+        <w:pStyle w:val="Heading2"/>
+      </w:pPr>
+      <w:r>
+        <w:rPr>
+          <w:color w:val="1D4E89"/>
+        </w:rPr>
+        <w:t>12.3  Export Selected Folders (PART)</w:t>
+      </w:r>
+    </w:p>
+    <w:p>
+      <w:r>
+        <w:t>Lets you pick specific folders to export (with their files), producing a .dms file with a PART- prefix - useful for sharing or archiving just part of a project.</w:t>
+      </w:r>
+    </w:p>
+    <w:p>
+      <w:pPr>
+        <w:pStyle w:val="Heading2"/>
+      </w:pPr>
+      <w:r>
+        <w:rPr>
+          <w:color w:val="1D4E89"/>
+        </w:rPr>
+        <w:t>12.4  Backup Retention Rules</w:t>
+      </w:r>
+    </w:p>
+    <w:p>
+      <w:r>
+        <w:t>The project keeps the 10 most recent .dms backups in the project's root folder; older ones are automatically moved into a “Not Shown in The Tree” archive folder at the root of the storage directory (not to be confused with the similarly named “Not Show in Tree” node inside the document tree from section 3.2, which holds soft-deleted documents instead).</w:t>
+      </w:r>
+    </w:p>
+    <w:p>
+      <w:pPr>
+        <w:pStyle w:val="Heading2"/>
+      </w:pPr>
+      <w:r>
+        <w:rPr>
+          <w:color w:val="1D4E89"/>
+        </w:rPr>
+        <w:t>12.5  Import a Project (.dms)</w:t>
       </w:r>
     </w:p>
     <w:p>
@@ -6791,7 +6872,7 @@
         <w:ind w:left="360"/>
       </w:pPr>
       <w:r>
-        <w:t>Click Project, then Email Sending Setup.</w:t>
+        <w:t>Click Project, then Import Project (.dms) and select the file.</w:t>
       </w:r>
     </w:p>
     <w:p>
@@ -6800,7 +6881,7 @@
         <w:ind w:left="360"/>
       </w:pPr>
       <w:r>
-        <w:t>Enter your SMTP server, port, username, and password (an app-specific password is usually required for Gmail/Outlook accounts with two-factor authentication).</w:t>
+        <w:t>Choose a destination folder for the import (a new, empty folder is recommended).</w:t>
       </w:r>
     </w:p>
     <w:p>
@@ -6809,7 +6890,107 @@
         <w:ind w:left="360"/>
       </w:pPr>
       <w:r>
-        <w:t>Save the settings; DMS uses them to send documents as attachments going forward.</w:t>
+        <w:t>Click Import and Switch.</w:t>
+      </w:r>
+    </w:p>
+    <w:p>
+      <w:pPr>
+        <w:pStyle w:val="ListNumber"/>
+        <w:ind w:left="360"/>
+      </w:pPr>
+      <w:r>
+        <w:t>DMS extracts the files and rebuilds the tree structure, and switches the active project to it.</w:t>
+      </w:r>
+    </w:p>
+    <w:p>
+      <w:pPr>
+        <w:ind w:left="576" w:right="576"/>
+        <w:shd w:val="clear" w:color="auto" w:fill="FFF8E1"/>
+      </w:pPr>
+      <w:r>
+        <w:rPr>
+          <w:b/>
+          <w:color w:val="924E00"/>
+        </w:rPr>
+        <w:t xml:space="preserve">Note: </w:t>
+      </w:r>
+      <w:r>
+        <w:t>Importing only restores the folder-tree structure; it never deletes files already on disk.</w:t>
+      </w:r>
+    </w:p>
+    <w:p>
+      <w:pPr>
+        <w:pStyle w:val="Heading2"/>
+      </w:pPr>
+      <w:r>
+        <w:rPr>
+          <w:color w:val="1D4E89"/>
+        </w:rPr>
+        <w:t>12.6  CSV Export</w:t>
+      </w:r>
+    </w:p>
+    <w:p>
+      <w:r>
+        <w:t>Click Project, then Export Metadata (CSV) to download a spreadsheet with one row per document, including document ID, name, size, upload date, and metadata fields. Open it in Excel or Google Sheets for analysis or sharing.</w:t>
+      </w:r>
+    </w:p>
+    <w:p>
+      <w:pPr>
+        <w:pStyle w:val="Heading2"/>
+      </w:pPr>
+      <w:r>
+        <w:rPr>
+          <w:color w:val="1D4E89"/>
+        </w:rPr>
+        <w:t>12.7  Batch ZIP Import</w:t>
+      </w:r>
+    </w:p>
+    <w:p>
+      <w:r>
+        <w:t>Upload many files at once from a ZIP archive and have DMS automatically sort them into matching folders by filename prefix. Folders referenced by a filename must already exist in the tree; documents with an unrecognized folder name are left unlinked.</w:t>
+      </w:r>
+    </w:p>
+    <w:p>
+      <w:pPr>
+        <w:pStyle w:val="Heading2"/>
+      </w:pPr>
+      <w:r>
+        <w:rPr>
+          <w:color w:val="1D4E89"/>
+        </w:rPr>
+        <w:t>12.8  Hierarchy Import (with auto de-duplication)</w:t>
+      </w:r>
+    </w:p>
+    <w:p>
+      <w:r>
+        <w:t>Builds a folder tree quickly from a plain text file.</w:t>
+      </w:r>
+    </w:p>
+    <w:p>
+      <w:pPr>
+        <w:pStyle w:val="ListNumber"/>
+        <w:ind w:left="360"/>
+      </w:pPr>
+      <w:r>
+        <w:t>Prepare a text file with 2-3 comma-separated columns per line: folder name, parent folder name, description (optional). The first line is the root folder, with the parent-folder column omitted for it.</w:t>
+      </w:r>
+    </w:p>
+    <w:p>
+      <w:pPr>
+        <w:pStyle w:val="ListNumber"/>
+        <w:ind w:left="360"/>
+      </w:pPr>
+      <w:r>
+        <w:t>Click Project, then Create Folder Tree from Hierarchy, and upload (or paste) the text.</w:t>
+      </w:r>
+    </w:p>
+    <w:p>
+      <w:pPr>
+        <w:pStyle w:val="ListNumber"/>
+        <w:ind w:left="360"/>
+      </w:pPr>
+      <w:r>
+        <w:t>DMS validates the structure and shows a preview, including any errors.</w:t>
       </w:r>
     </w:p>
     <w:p>
@@ -6828,7 +7009,7 @@
               <a:graphicData uri="http://schemas.openxmlformats.org/drawingml/2006/picture">
                 <pic:pic>
                   <pic:nvPicPr>
-                    <pic:cNvPr id="0" name="20_email_settings.png"/>
+                    <pic:cNvPr id="0" name="12_hierarchy_import_empty.png"/>
                     <pic:cNvPicPr/>
                   </pic:nvPicPr>
                   <pic:blipFill>
@@ -6861,159 +7042,10 @@
           <w:color w:val="707070"/>
           <w:sz w:val="18"/>
         </w:rPr>
-        <w:t>Figure 13-1  Email sending (SMTP) settings dialog</w:t>
+        <w:t>Figure 12-1  The hierarchy import dialog (initial state)</w:t>
       </w:r>
     </w:p>
     <w:p/>
-    <w:p>
-      <w:pPr>
-        <w:ind w:left="576" w:right="576"/>
-        <w:shd w:val="clear" w:color="auto" w:fill="FFF8E1"/>
-      </w:pPr>
-      <w:r>
-        <w:rPr>
-          <w:b/>
-          <w:color w:val="924E00"/>
-        </w:rPr>
-        <w:t xml:space="preserve">Note: </w:t>
-      </w:r>
-      <w:r>
-        <w:t>On Mac, if SMTP hasn't been configured, clicking the email action instead opens your system Mail app with the document attached, so the feature still works without any setup.</w:t>
-      </w:r>
-    </w:p>
-    <w:p>
-      <w:r>
-        <w:br w:type="page"/>
-      </w:r>
-    </w:p>
-    <w:p>
-      <w:pPr>
-        <w:pStyle w:val="Heading1"/>
-      </w:pPr>
-      <w:r>
-        <w:rPr>
-          <w:color w:val="1E40AF"/>
-        </w:rPr>
-        <w:t>14  Password Protection</w:t>
-      </w:r>
-    </w:p>
-    <w:p>
-      <w:r>
-        <w:t>You can protect DMS with a password so that only authorized users can access the data - strongly recommended once you've enabled LAN access, remote upload, or saved any website login credentials (section 3.6).</w:t>
-      </w:r>
-    </w:p>
-    <w:p>
-      <w:r>
-        <w:t>Set a password:</w:t>
-      </w:r>
-    </w:p>
-    <w:p>
-      <w:pPr>
-        <w:pStyle w:val="ListNumber"/>
-        <w:ind w:left="360"/>
-      </w:pPr>
-      <w:r>
-        <w:t>Click Project, then Set Password.</w:t>
-      </w:r>
-    </w:p>
-    <w:p>
-      <w:pPr>
-        <w:pStyle w:val="ListNumber"/>
-        <w:ind w:left="360"/>
-      </w:pPr>
-      <w:r>
-        <w:t>Enter and confirm your chosen password.</w:t>
-      </w:r>
-    </w:p>
-    <w:p>
-      <w:pPr>
-        <w:pStyle w:val="ListNumber"/>
-        <w:ind w:left="360"/>
-      </w:pPr>
-      <w:r>
-        <w:t>Click Set.</w:t>
-      </w:r>
-    </w:p>
-    <w:p>
-      <w:pPr>
-        <w:pStyle w:val="ListNumber"/>
-        <w:ind w:left="360"/>
-      </w:pPr>
-      <w:r>
-        <w:t>On the next DMS startup, a login screen appears before the main interface.</w:t>
-      </w:r>
-    </w:p>
-    <w:p>
-      <w:r>
-        <w:t>Remove the password:</w:t>
-      </w:r>
-    </w:p>
-    <w:p>
-      <w:pPr>
-        <w:pStyle w:val="ListNumber"/>
-        <w:ind w:left="360"/>
-      </w:pPr>
-      <w:r>
-        <w:t>Click Project, then Change Password.</w:t>
-      </w:r>
-    </w:p>
-    <w:p>
-      <w:pPr>
-        <w:pStyle w:val="ListNumber"/>
-        <w:ind w:left="360"/>
-      </w:pPr>
-      <w:r>
-        <w:t>Enter your current password to confirm, then leave the new password fields blank.</w:t>
-      </w:r>
-    </w:p>
-    <w:p>
-      <w:pPr>
-        <w:pStyle w:val="ListNumber"/>
-        <w:ind w:left="360"/>
-      </w:pPr>
-      <w:r>
-        <w:t>Click Set to remove password protection.</w:t>
-      </w:r>
-    </w:p>
-    <w:p>
-      <w:r>
-        <w:t>Logout:</w:t>
-      </w:r>
-    </w:p>
-    <w:p>
-      <w:pPr>
-        <w:pStyle w:val="ListBullet"/>
-        <w:ind w:left="360"/>
-      </w:pPr>
-      <w:r>
-        <w:t>Click Logout in the header bar.</w:t>
-      </w:r>
-    </w:p>
-    <w:p>
-      <w:pPr>
-        <w:pStyle w:val="ListBullet"/>
-        <w:ind w:left="360"/>
-      </w:pPr>
-      <w:r>
-        <w:t>DMS returns to the login screen. The server keeps running; only the browser session ends.</w:t>
-      </w:r>
-    </w:p>
-    <w:p>
-      <w:pPr>
-        <w:ind w:left="576" w:right="576"/>
-        <w:shd w:val="clear" w:color="auto" w:fill="FFF8E1"/>
-      </w:pPr>
-      <w:r>
-        <w:rPr>
-          <w:b/>
-          <w:color w:val="924E00"/>
-        </w:rPr>
-        <w:t xml:space="preserve">Note: </w:t>
-      </w:r>
-      <w:r>
-        <w:t>The password is stored as a salted hash on the server (SHA-256, 100,000 iterations) - never in plain text. A folder's saved website login password (section 3.6) uses a separate, independent reversible-encryption scheme; the two don't affect each other.</w:t>
-      </w:r>
-    </w:p>
     <w:p>
       <w:pPr>
         <w:jc w:val="center"/>
@@ -7030,11 +7062,507 @@
               <a:graphicData uri="http://schemas.openxmlformats.org/drawingml/2006/picture">
                 <pic:pic>
                   <pic:nvPicPr>
+                    <pic:cNvPr id="0" name="14_hierarchy_import_error.png"/>
+                    <pic:cNvPicPr/>
+                  </pic:nvPicPr>
+                  <pic:blipFill>
+                    <a:blip r:embed="rId41"/>
+                    <a:stretch>
+                      <a:fillRect/>
+                    </a:stretch>
+                  </pic:blipFill>
+                  <pic:spPr>
+                    <a:xfrm>
+                      <a:off x="0" y="0"/>
+                      <a:ext cx="5486400" cy="3429000"/>
+                    </a:xfrm>
+                    <a:prstGeom prst="rect"/>
+                  </pic:spPr>
+                </pic:pic>
+              </a:graphicData>
+            </a:graphic>
+          </wp:inline>
+        </w:drawing>
+      </w:r>
+    </w:p>
+    <w:p>
+      <w:pPr>
+        <w:jc w:val="center"/>
+      </w:pPr>
+      <w:r>
+        <w:rPr>
+          <w:i/>
+          <w:color w:val="707070"/>
+          <w:sz w:val="18"/>
+        </w:rPr>
+        <w:t>Figure 12-2  With auto-numbering off, a duplicate folder name is flagged as an error</w:t>
+      </w:r>
+    </w:p>
+    <w:p/>
+    <w:p>
+      <w:pPr>
+        <w:jc w:val="center"/>
+      </w:pPr>
+      <w:r>
+        <w:drawing>
+          <wp:inline xmlns:a="http://schemas.openxmlformats.org/drawingml/2006/main" xmlns:pic="http://schemas.openxmlformats.org/drawingml/2006/picture">
+            <wp:extent cx="5486400" cy="3429000"/>
+            <wp:docPr id="34" name="Picture 34"/>
+            <wp:cNvGraphicFramePr>
+              <a:graphicFrameLocks noChangeAspect="1"/>
+            </wp:cNvGraphicFramePr>
+            <a:graphic>
+              <a:graphicData uri="http://schemas.openxmlformats.org/drawingml/2006/picture">
+                <pic:pic>
+                  <pic:nvPicPr>
+                    <pic:cNvPr id="0" name="15_hierarchy_import_dedupe_ok.png"/>
+                    <pic:cNvPicPr/>
+                  </pic:nvPicPr>
+                  <pic:blipFill>
+                    <a:blip r:embed="rId42"/>
+                    <a:stretch>
+                      <a:fillRect/>
+                    </a:stretch>
+                  </pic:blipFill>
+                  <pic:spPr>
+                    <a:xfrm>
+                      <a:off x="0" y="0"/>
+                      <a:ext cx="5486400" cy="3429000"/>
+                    </a:xfrm>
+                    <a:prstGeom prst="rect"/>
+                  </pic:spPr>
+                </pic:pic>
+              </a:graphicData>
+            </a:graphic>
+          </wp:inline>
+        </w:drawing>
+      </w:r>
+    </w:p>
+    <w:p>
+      <w:pPr>
+        <w:jc w:val="center"/>
+      </w:pPr>
+      <w:r>
+        <w:rPr>
+          <w:i/>
+          <w:color w:val="707070"/>
+          <w:sz w:val="18"/>
+        </w:rPr>
+        <w:t>Figure 12-3  With auto-numbering on, the duplicate name is numbered and passes validation</w:t>
+      </w:r>
+    </w:p>
+    <w:p/>
+    <w:p>
+      <w:pPr>
+        <w:pStyle w:val="ListNumber"/>
+        <w:ind w:left="360"/>
+      </w:pPr>
+      <w:r>
+        <w:t>Click Create; all folders appear in the tree immediately.</w:t>
+      </w:r>
+    </w:p>
+    <w:p>
+      <w:pPr>
+        <w:pStyle w:val="Heading2"/>
+      </w:pPr>
+      <w:r>
+        <w:rPr>
+          <w:color w:val="1D4E89"/>
+        </w:rPr>
+        <w:t>12.9  Downloading This Manual from Inside the App</w:t>
+      </w:r>
+    </w:p>
+    <w:p>
+      <w:r>
+        <w:t>Click Project, then Download User Manual (.docx) under the Downloads section, to get the same manual you're reading now, generated fresh from inside the running app.</w:t>
+      </w:r>
+    </w:p>
+    <w:p>
+      <w:pPr>
+        <w:jc w:val="center"/>
+      </w:pPr>
+      <w:r>
+        <w:drawing>
+          <wp:inline xmlns:a="http://schemas.openxmlformats.org/drawingml/2006/main" xmlns:pic="http://schemas.openxmlformats.org/drawingml/2006/picture">
+            <wp:extent cx="5486400" cy="3429000"/>
+            <wp:docPr id="35" name="Picture 35"/>
+            <wp:cNvGraphicFramePr>
+              <a:graphicFrameLocks noChangeAspect="1"/>
+            </wp:cNvGraphicFramePr>
+            <a:graphic>
+              <a:graphicData uri="http://schemas.openxmlformats.org/drawingml/2006/picture">
+                <pic:pic>
+                  <pic:nvPicPr>
+                    <pic:cNvPr id="0" name="11_project_menu.png"/>
+                    <pic:cNvPicPr/>
+                  </pic:nvPicPr>
+                  <pic:blipFill>
+                    <a:blip r:embed="rId43"/>
+                    <a:stretch>
+                      <a:fillRect/>
+                    </a:stretch>
+                  </pic:blipFill>
+                  <pic:spPr>
+                    <a:xfrm>
+                      <a:off x="0" y="0"/>
+                      <a:ext cx="5486400" cy="3429000"/>
+                    </a:xfrm>
+                    <a:prstGeom prst="rect"/>
+                  </pic:spPr>
+                </pic:pic>
+              </a:graphicData>
+            </a:graphic>
+          </wp:inline>
+        </w:drawing>
+      </w:r>
+    </w:p>
+    <w:p>
+      <w:pPr>
+        <w:jc w:val="center"/>
+      </w:pPr>
+      <w:r>
+        <w:rPr>
+          <w:i/>
+          <w:color w:val="707070"/>
+          <w:sz w:val="18"/>
+        </w:rPr>
+        <w:t>Figure 12-4  The Project menu: export, import, and settings</w:t>
+      </w:r>
+    </w:p>
+    <w:p/>
+    <w:p>
+      <w:r>
+        <w:br w:type="page"/>
+      </w:r>
+    </w:p>
+    <w:p>
+      <w:pPr>
+        <w:pStyle w:val="Heading1"/>
+      </w:pPr>
+      <w:r>
+        <w:rPr>
+          <w:color w:val="1E40AF"/>
+        </w:rPr>
+        <w:t>13  Cloud Sync and Email</w:t>
+      </w:r>
+    </w:p>
+    <w:p>
+      <w:pPr>
+        <w:pStyle w:val="Heading2"/>
+      </w:pPr>
+      <w:r>
+        <w:rPr>
+          <w:color w:val="1D4E89"/>
+        </w:rPr>
+        <w:t>13.1  Using OneDrive to Sync Storage</w:t>
+      </w:r>
+    </w:p>
+    <w:p>
+      <w:r>
+        <w:t>Pointing your DMS storage folder at a location synced by OneDrive (or a similar cloud-sync service) gives you automatic off-site backup with no extra steps - every change DMS makes on disk gets picked up and uploaded by the sync client in the background, the same as any other file in that folder.</w:t>
+      </w:r>
+    </w:p>
+    <w:p>
+      <w:pPr>
+        <w:ind w:left="576" w:right="576"/>
+        <w:shd w:val="clear" w:color="auto" w:fill="FFF8E1"/>
+      </w:pPr>
+      <w:r>
+        <w:rPr>
+          <w:b/>
+          <w:color w:val="924E00"/>
+        </w:rPr>
+        <w:t xml:space="preserve">Note: </w:t>
+      </w:r>
+      <w:r>
+        <w:t>Very large libraries, or a very slow internet connection, can make cloud sync lag behind your local changes; this is a property of the sync client, not of DMS.</w:t>
+      </w:r>
+    </w:p>
+    <w:p>
+      <w:pPr>
+        <w:pStyle w:val="Heading2"/>
+      </w:pPr>
+      <w:r>
+        <w:rPr>
+          <w:color w:val="1D4E89"/>
+        </w:rPr>
+        <w:t>13.2  Email Sending Setup</w:t>
+      </w:r>
+    </w:p>
+    <w:p>
+      <w:r>
+        <w:t>To use the “email” action on a document card, configure an SMTP account first.</w:t>
+      </w:r>
+    </w:p>
+    <w:p>
+      <w:pPr>
+        <w:pStyle w:val="ListNumber"/>
+        <w:ind w:left="360"/>
+      </w:pPr>
+      <w:r>
+        <w:t>Click Project, then Email Sending Setup.</w:t>
+      </w:r>
+    </w:p>
+    <w:p>
+      <w:pPr>
+        <w:pStyle w:val="ListNumber"/>
+        <w:ind w:left="360"/>
+      </w:pPr>
+      <w:r>
+        <w:t>Enter your SMTP server, port, username, and password (an app-specific password is usually required for Gmail/Outlook accounts with two-factor authentication).</w:t>
+      </w:r>
+    </w:p>
+    <w:p>
+      <w:pPr>
+        <w:pStyle w:val="ListNumber"/>
+        <w:ind w:left="360"/>
+      </w:pPr>
+      <w:r>
+        <w:t>Save the settings; DMS uses them to send documents as attachments going forward.</w:t>
+      </w:r>
+    </w:p>
+    <w:p>
+      <w:pPr>
+        <w:jc w:val="center"/>
+      </w:pPr>
+      <w:r>
+        <w:drawing>
+          <wp:inline xmlns:a="http://schemas.openxmlformats.org/drawingml/2006/main" xmlns:pic="http://schemas.openxmlformats.org/drawingml/2006/picture">
+            <wp:extent cx="5486400" cy="3429000"/>
+            <wp:docPr id="36" name="Picture 36"/>
+            <wp:cNvGraphicFramePr>
+              <a:graphicFrameLocks noChangeAspect="1"/>
+            </wp:cNvGraphicFramePr>
+            <a:graphic>
+              <a:graphicData uri="http://schemas.openxmlformats.org/drawingml/2006/picture">
+                <pic:pic>
+                  <pic:nvPicPr>
+                    <pic:cNvPr id="0" name="20_email_settings.png"/>
+                    <pic:cNvPicPr/>
+                  </pic:nvPicPr>
+                  <pic:blipFill>
+                    <a:blip r:embed="rId44"/>
+                    <a:stretch>
+                      <a:fillRect/>
+                    </a:stretch>
+                  </pic:blipFill>
+                  <pic:spPr>
+                    <a:xfrm>
+                      <a:off x="0" y="0"/>
+                      <a:ext cx="5486400" cy="3429000"/>
+                    </a:xfrm>
+                    <a:prstGeom prst="rect"/>
+                  </pic:spPr>
+                </pic:pic>
+              </a:graphicData>
+            </a:graphic>
+          </wp:inline>
+        </w:drawing>
+      </w:r>
+    </w:p>
+    <w:p>
+      <w:pPr>
+        <w:jc w:val="center"/>
+      </w:pPr>
+      <w:r>
+        <w:rPr>
+          <w:i/>
+          <w:color w:val="707070"/>
+          <w:sz w:val="18"/>
+        </w:rPr>
+        <w:t>Figure 13-1  Email sending (SMTP) settings dialog</w:t>
+      </w:r>
+    </w:p>
+    <w:p/>
+    <w:p>
+      <w:pPr>
+        <w:ind w:left="576" w:right="576"/>
+        <w:shd w:val="clear" w:color="auto" w:fill="FFF8E1"/>
+      </w:pPr>
+      <w:r>
+        <w:rPr>
+          <w:b/>
+          <w:color w:val="924E00"/>
+        </w:rPr>
+        <w:t xml:space="preserve">Note: </w:t>
+      </w:r>
+      <w:r>
+        <w:t>On Mac, if SMTP hasn't been configured, clicking the email action instead opens your system Mail app with the document attached, so the feature still works without any setup.</w:t>
+      </w:r>
+    </w:p>
+    <w:p>
+      <w:pPr>
+        <w:ind w:left="576" w:right="576"/>
+        <w:shd w:val="clear" w:color="auto" w:fill="E6F4EA"/>
+      </w:pPr>
+      <w:r>
+        <w:rPr>
+          <w:b/>
+          <w:color w:val="056F00"/>
+        </w:rPr>
+        <w:t xml:space="preserve">Tip: </w:t>
+      </w:r>
+      <w:r>
+        <w:rPr>
+          <w:color w:val="333333"/>
+        </w:rPr>
+        <w:t>The Download setup guide (.docx) button in the dialog gives step-by-step, illustrated instructions for enabling SMTP and generating an app-specific password in common providers like Gmail and QQ Mail.</w:t>
+      </w:r>
+    </w:p>
+    <w:p>
+      <w:r>
+        <w:br w:type="page"/>
+      </w:r>
+    </w:p>
+    <w:p>
+      <w:pPr>
+        <w:pStyle w:val="Heading1"/>
+      </w:pPr>
+      <w:r>
+        <w:rPr>
+          <w:color w:val="1E40AF"/>
+        </w:rPr>
+        <w:t>14  Password Protection</w:t>
+      </w:r>
+    </w:p>
+    <w:p>
+      <w:r>
+        <w:t>You can protect DMS with a password so that only authorized users can access the data - strongly recommended once you've enabled LAN access, remote upload, or saved any website login credentials (section 3.6).</w:t>
+      </w:r>
+    </w:p>
+    <w:p>
+      <w:r>
+        <w:t>Set a password:</w:t>
+      </w:r>
+    </w:p>
+    <w:p>
+      <w:pPr>
+        <w:pStyle w:val="ListNumber"/>
+        <w:ind w:left="360"/>
+      </w:pPr>
+      <w:r>
+        <w:t>Click Project, then Set Password.</w:t>
+      </w:r>
+    </w:p>
+    <w:p>
+      <w:pPr>
+        <w:pStyle w:val="ListNumber"/>
+        <w:ind w:left="360"/>
+      </w:pPr>
+      <w:r>
+        <w:t>Enter and confirm your chosen password.</w:t>
+      </w:r>
+    </w:p>
+    <w:p>
+      <w:pPr>
+        <w:pStyle w:val="ListNumber"/>
+        <w:ind w:left="360"/>
+      </w:pPr>
+      <w:r>
+        <w:t>Click Set.</w:t>
+      </w:r>
+    </w:p>
+    <w:p>
+      <w:pPr>
+        <w:pStyle w:val="ListNumber"/>
+        <w:ind w:left="360"/>
+      </w:pPr>
+      <w:r>
+        <w:t>On the next DMS startup, a login screen appears before the main interface.</w:t>
+      </w:r>
+    </w:p>
+    <w:p>
+      <w:r>
+        <w:t>Remove the password:</w:t>
+      </w:r>
+    </w:p>
+    <w:p>
+      <w:pPr>
+        <w:pStyle w:val="ListNumber"/>
+        <w:ind w:left="360"/>
+      </w:pPr>
+      <w:r>
+        <w:t>Click Project, then Change Password.</w:t>
+      </w:r>
+    </w:p>
+    <w:p>
+      <w:pPr>
+        <w:pStyle w:val="ListNumber"/>
+        <w:ind w:left="360"/>
+      </w:pPr>
+      <w:r>
+        <w:t>Enter your current password to confirm, then leave the new password fields blank.</w:t>
+      </w:r>
+    </w:p>
+    <w:p>
+      <w:pPr>
+        <w:pStyle w:val="ListNumber"/>
+        <w:ind w:left="360"/>
+      </w:pPr>
+      <w:r>
+        <w:t>Click Set to remove password protection.</w:t>
+      </w:r>
+    </w:p>
+    <w:p>
+      <w:r>
+        <w:t>Logout:</w:t>
+      </w:r>
+    </w:p>
+    <w:p>
+      <w:pPr>
+        <w:pStyle w:val="ListBullet"/>
+        <w:ind w:left="360"/>
+      </w:pPr>
+      <w:r>
+        <w:t>Click Logout in the header bar.</w:t>
+      </w:r>
+    </w:p>
+    <w:p>
+      <w:pPr>
+        <w:pStyle w:val="ListBullet"/>
+        <w:ind w:left="360"/>
+      </w:pPr>
+      <w:r>
+        <w:t>DMS returns to the login screen. The server keeps running; only the browser session ends.</w:t>
+      </w:r>
+    </w:p>
+    <w:p>
+      <w:pPr>
+        <w:ind w:left="576" w:right="576"/>
+        <w:shd w:val="clear" w:color="auto" w:fill="FFF8E1"/>
+      </w:pPr>
+      <w:r>
+        <w:rPr>
+          <w:b/>
+          <w:color w:val="924E00"/>
+        </w:rPr>
+        <w:t xml:space="preserve">Note: </w:t>
+      </w:r>
+      <w:r>
+        <w:t>The password is stored as a salted hash on the server (SHA-256, 100,000 iterations) - never in plain text. A folder's saved website login password (section 3.6) uses a separate, independent reversible-encryption scheme; the two don't affect each other.</w:t>
+      </w:r>
+    </w:p>
+    <w:p>
+      <w:pPr>
+        <w:jc w:val="center"/>
+      </w:pPr>
+      <w:r>
+        <w:drawing>
+          <wp:inline xmlns:a="http://schemas.openxmlformats.org/drawingml/2006/main" xmlns:pic="http://schemas.openxmlformats.org/drawingml/2006/picture">
+            <wp:extent cx="5486400" cy="3429000"/>
+            <wp:docPr id="37" name="Picture 37"/>
+            <wp:cNvGraphicFramePr>
+              <a:graphicFrameLocks noChangeAspect="1"/>
+            </wp:cNvGraphicFramePr>
+            <a:graphic>
+              <a:graphicData uri="http://schemas.openxmlformats.org/drawingml/2006/picture">
+                <pic:pic>
+                  <pic:nvPicPr>
                     <pic:cNvPr id="0" name="19_password_dialog.png"/>
                     <pic:cNvPicPr/>
                   </pic:nvPicPr>
                   <pic:blipFill>
-                    <a:blip r:embed="rId41"/>
+                    <a:blip r:embed="rId45"/>
                     <a:stretch>
                       <a:fillRect/>
                     </a:stretch>
@@ -7323,6 +7851,28 @@
           </w:p>
         </w:tc>
       </w:tr>
+      <w:tr>
+        <w:tc>
+          <w:tcPr>
+            <w:tcW w:type="dxa" w:w="5040"/>
+          </w:tcPr>
+          <w:p>
+            <w:r>
+              <w:t>Jump to the previous/next document in the viewer</w:t>
+            </w:r>
+          </w:p>
+        </w:tc>
+        <w:tc>
+          <w:tcPr>
+            <w:tcW w:type="dxa" w:w="4320"/>
+          </w:tcPr>
+          <w:p>
+            <w:r>
+              <w:t>← / → (left/right arrow)</w:t>
+            </w:r>
+          </w:p>
+        </w:tc>
+      </w:tr>
     </w:tbl>
     <w:p/>
     <w:p>
@@ -7371,6 +7921,25 @@
       </w:pPr>
       <w:r>
         <w:t>Opening the same project folder again is detected, and DMS switches to the existing window for it instead of starting a duplicate service.</w:t>
+      </w:r>
+    </w:p>
+    <w:p>
+      <w:pPr>
+        <w:ind w:left="576" w:right="576"/>
+        <w:shd w:val="clear" w:color="auto" w:fill="E6F4EA"/>
+      </w:pPr>
+      <w:r>
+        <w:rPr>
+          <w:b/>
+          <w:color w:val="056F00"/>
+        </w:rPr>
+        <w:t xml:space="preserve">Tip: </w:t>
+      </w:r>
+      <w:r>
+        <w:rPr>
+          <w:color w:val="333333"/>
+        </w:rPr>
+        <w:t>Besides switching to an existing project, the Project menu's Settings group also has Create New Blank Project, which starts a brand-new, empty project in a new folder at any time - no restart, and no need to go through the section 1.3 startup screen.</w:t>
       </w:r>
     </w:p>
     <w:p>
@@ -7454,7 +8023,7 @@
         <w:drawing>
           <wp:inline xmlns:a="http://schemas.openxmlformats.org/drawingml/2006/main" xmlns:pic="http://schemas.openxmlformats.org/drawingml/2006/picture">
             <wp:extent cx="5486400" cy="2741275"/>
-            <wp:docPr id="34" name="Picture 34"/>
+            <wp:docPr id="38" name="Picture 38"/>
             <wp:cNvGraphicFramePr>
               <a:graphicFrameLocks noChangeAspect="1"/>
             </wp:cNvGraphicFramePr>
@@ -7466,7 +8035,7 @@
                     <pic:cNvPicPr/>
                   </pic:nvPicPr>
                   <pic:blipFill>
-                    <a:blip r:embed="rId42"/>
+                    <a:blip r:embed="rId46"/>
                     <a:stretch>
                       <a:fillRect/>
                     </a:stretch>
@@ -7624,7 +8193,7 @@
         <w:drawing>
           <wp:inline xmlns:a="http://schemas.openxmlformats.org/drawingml/2006/main" xmlns:pic="http://schemas.openxmlformats.org/drawingml/2006/picture">
             <wp:extent cx="5486400" cy="2737425"/>
-            <wp:docPr id="35" name="Picture 35"/>
+            <wp:docPr id="39" name="Picture 39"/>
             <wp:cNvGraphicFramePr>
               <a:graphicFrameLocks noChangeAspect="1"/>
             </wp:cNvGraphicFramePr>
@@ -7636,7 +8205,7 @@
                     <pic:cNvPicPr/>
                   </pic:nvPicPr>
                   <pic:blipFill>
-                    <a:blip r:embed="rId43"/>
+                    <a:blip r:embed="rId47"/>
                     <a:stretch>
                       <a:fillRect/>
                     </a:stretch>
@@ -7753,7 +8322,7 @@
         <w:drawing>
           <wp:inline xmlns:a="http://schemas.openxmlformats.org/drawingml/2006/main" xmlns:pic="http://schemas.openxmlformats.org/drawingml/2006/picture">
             <wp:extent cx="5486400" cy="2578748"/>
-            <wp:docPr id="36" name="Picture 36"/>
+            <wp:docPr id="40" name="Picture 40"/>
             <wp:cNvGraphicFramePr>
               <a:graphicFrameLocks noChangeAspect="1"/>
             </wp:cNvGraphicFramePr>
@@ -7765,7 +8334,7 @@
                     <pic:cNvPicPr/>
                   </pic:nvPicPr>
                   <pic:blipFill>
-                    <a:blip r:embed="rId44"/>
+                    <a:blip r:embed="rId48"/>
                     <a:stretch>
                       <a:fillRect/>
                     </a:stretch>

</xml_diff>

<commit_message>
Document upload-folder modes, free API key URLs, and CSV/ZIP import formats
Fixes four gaps found by spot-checking the app against both manuals:
- Section 4.2 was missing all three Upload Folder modes (year/month sort,
  mirror source structure, recreate picked folder) and the "add text to
  filenames" field entirely; added with a live screenshot.
- Section 6.4 only pointed at a downloadable setup guide instead of giving
  the actual free-signup URLs for Gemini and DeepSeek inline.
- Section 12.8's CSV column definitions were a single terse sentence (and
  missing from the English manual's dedup-checkbox explanation); expanded
  into an explicit column table plus the header/level-row auto-skip
  behavior, in both languages.
- Section 12.7 (ZIP import) gained the path-based ("Parent/Child#file.pdf")
  disambiguation syntax for duplicate folder names, which existed in the
  code but wasn't documented anywhere.

Co-Authored-By: Claude Sonnet 5 <noreply@anthropic.com>
</commit_message>
<xml_diff>
--- a/PMS_User_Manual.docx
+++ b/PMS_User_Manual.docx
@@ -3285,7 +3285,7 @@
         <w:ind w:left="360"/>
       </w:pPr>
       <w:r>
-        <w:t>Click Upload Folder.</w:t>
+        <w:t>Click Upload Folder - this opens the Upload Multiple Folders dialog.</w:t>
       </w:r>
     </w:p>
     <w:p>
@@ -3294,7 +3294,7 @@
         <w:ind w:left="360"/>
       </w:pPr>
       <w:r>
-        <w:t>Choose a folder on your computer in the dialog that appears.</w:t>
+        <w:t>Click + Add Folder and pick a folder on your computer; repeat to queue up several folders at once, each listed above with an × to remove it.</w:t>
       </w:r>
     </w:p>
     <w:p>
@@ -3303,23 +3303,34 @@
         <w:ind w:left="360"/>
       </w:pPr>
       <w:r>
-        <w:t>DMS uploads every file recursively, creating matching sub-folders in the tree.</w:t>
-      </w:r>
-    </w:p>
-    <w:p>
-      <w:pPr>
-        <w:pStyle w:val="Heading2"/>
-      </w:pPr>
-      <w:r>
-        <w:rPr>
-          <w:color w:val="1D4E89"/>
-        </w:rPr>
-        <w:t>4.3  Pasting Screenshots</w:t>
-      </w:r>
-    </w:p>
-    <w:p>
-      <w:r>
-        <w:t>You don't need to save a file first - a screenshot you just took, or an image copied from elsewhere, can be pasted straight into the current folder.</w:t>
+        <w:t>Choose one of three upload modes:</w:t>
+      </w:r>
+    </w:p>
+    <w:p>
+      <w:pPr>
+        <w:pStyle w:val="ListBullet"/>
+        <w:ind w:left="360"/>
+      </w:pPr>
+      <w:r>
+        <w:t>Sort into year/month folders (default) - every file in each picked folder (including its subfolders) is routed by capture/archive date into “year/month” folders, created automatically if they don't exist yet. The original subfolder structure is not kept.</w:t>
+      </w:r>
+    </w:p>
+    <w:p>
+      <w:pPr>
+        <w:pStyle w:val="ListBullet"/>
+        <w:ind w:left="360"/>
+      </w:pPr>
+      <w:r>
+        <w:t>Upload files and subfolders as the sources - subfolders inside each picked folder are recreated here exactly as they are, with no date-based year/month folders. Good for material that's already organized the way you want to keep it.</w:t>
+      </w:r>
+    </w:p>
+    <w:p>
+      <w:pPr>
+        <w:pStyle w:val="ListBullet"/>
+        <w:ind w:left="360"/>
+      </w:pPr>
+      <w:r>
+        <w:t>Recreate the picked folder under the current folder - unlike the other two modes, the picked folder itself also becomes a new subfolder here (not just its contents); every subfolder under it is rebuilt as-is, files land in their matching folders, and matching directories are created on the local drive too.</w:t>
       </w:r>
     </w:p>
     <w:p>
@@ -3328,197 +3339,7 @@
         <w:ind w:left="360"/>
       </w:pPr>
       <w:r>
-        <w:t>Select the destination folder in the Tree tab.</w:t>
-      </w:r>
-    </w:p>
-    <w:p>
-      <w:pPr>
-        <w:pStyle w:val="ListNumber"/>
-        <w:ind w:left="360"/>
-      </w:pPr>
-      <w:r>
-        <w:t>Take a screenshot (or copy an image) to the system clipboard.</w:t>
-      </w:r>
-    </w:p>
-    <w:p>
-      <w:pPr>
-        <w:pStyle w:val="ListNumber"/>
-        <w:ind w:left="360"/>
-      </w:pPr>
-      <w:r>
-        <w:t>Click Paste Screenshot, or simply press Ctrl+V (Windows) / Cmd+V (Mac).</w:t>
-      </w:r>
-    </w:p>
-    <w:p>
-      <w:pPr>
-        <w:pStyle w:val="ListNumber"/>
-        <w:ind w:left="360"/>
-      </w:pPr>
-      <w:r>
-        <w:t>DMS saves the clipboard image as a PDF and adds it to the current folder.</w:t>
-      </w:r>
-    </w:p>
-    <w:p>
-      <w:pPr>
-        <w:pStyle w:val="Heading2"/>
-      </w:pPr>
-      <w:r>
-        <w:rPr>
-          <w:color w:val="1D4E89"/>
-        </w:rPr>
-        <w:t>4.4  Linking Existing Documents</w:t>
-      </w:r>
-    </w:p>
-    <w:p>
-      <w:r>
-        <w:t>The same document can be linked into multiple folders without duplicating the file on disk.</w:t>
-      </w:r>
-    </w:p>
-    <w:p>
-      <w:pPr>
-        <w:pStyle w:val="ListNumber"/>
-        <w:ind w:left="360"/>
-      </w:pPr>
-      <w:r>
-        <w:t>Select the folder you want to link the document into.</w:t>
-      </w:r>
-    </w:p>
-    <w:p>
-      <w:pPr>
-        <w:pStyle w:val="ListNumber"/>
-        <w:ind w:left="360"/>
-      </w:pPr>
-      <w:r>
-        <w:t>Click Link Existing Document.</w:t>
-      </w:r>
-    </w:p>
-    <w:p>
-      <w:pPr>
-        <w:pStyle w:val="ListNumber"/>
-        <w:ind w:left="360"/>
-      </w:pPr>
-      <w:r>
-        <w:t>A dialog lists all documents in the system.</w:t>
-      </w:r>
-    </w:p>
-    <w:p>
-      <w:pPr>
-        <w:pStyle w:val="ListNumber"/>
-        <w:ind w:left="360"/>
-      </w:pPr>
-      <w:r>
-        <w:t>Check the document(s) you want and click Add Link.</w:t>
-      </w:r>
-    </w:p>
-    <w:p>
-      <w:pPr>
-        <w:pStyle w:val="ListNumber"/>
-        <w:ind w:left="360"/>
-      </w:pPr>
-      <w:r>
-        <w:t>The document now appears in both the original folder and the new folder.</w:t>
-      </w:r>
-    </w:p>
-    <w:p>
-      <w:pPr>
-        <w:ind w:left="576" w:right="576"/>
-        <w:shd w:val="clear" w:color="auto" w:fill="E6F4EA"/>
-      </w:pPr>
-      <w:r>
-        <w:rPr>
-          <w:b/>
-          <w:color w:val="056F00"/>
-        </w:rPr>
-        <w:t xml:space="preserve">Tip: </w:t>
-      </w:r>
-      <w:r>
-        <w:rPr>
-          <w:color w:val="333333"/>
-        </w:rPr>
-        <w:t>A faster way: just drag a document card and drop it directly onto the target folder in the left-hand tree. It has exactly the same effect as the steps above, without opening the picker dialog first.</w:t>
-      </w:r>
-    </w:p>
-    <w:p>
-      <w:pPr>
-        <w:pStyle w:val="Heading2"/>
-      </w:pPr>
-      <w:r>
-        <w:rPr>
-          <w:color w:val="1D4E89"/>
-        </w:rPr>
-        <w:t>4.5  Viewing a Document</w:t>
-      </w:r>
-    </w:p>
-    <w:p>
-      <w:pPr>
-        <w:pStyle w:val="ListNumber"/>
-        <w:ind w:left="360"/>
-      </w:pPr>
-      <w:r>
-        <w:t>Click the document name or thumbnail to open the Document Viewer.</w:t>
-      </w:r>
-    </w:p>
-    <w:p>
-      <w:pPr>
-        <w:pStyle w:val="ListNumber"/>
-        <w:ind w:left="360"/>
-      </w:pPr>
-      <w:r>
-        <w:t>The viewer opens as an overlay with the preview as its main content; you can drag its edges to resize it, drag the title bar to move it, or click Pop Out to turn the viewer into its own separate browser window (for example, to drag it to a second monitor). The divider between the preview and the info panel on the right can also be dragged to resize either side.</w:t>
-      </w:r>
-    </w:p>
-    <w:p>
-      <w:pPr>
-        <w:pStyle w:val="ListBullet"/>
-        <w:ind w:left="360"/>
-      </w:pPr>
-      <w:r>
-        <w:t>Images are shown inline.</w:t>
-      </w:r>
-    </w:p>
-    <w:p>
-      <w:pPr>
-        <w:pStyle w:val="ListBullet"/>
-        <w:ind w:left="360"/>
-      </w:pPr>
-      <w:r>
-        <w:t>PDFs open in an embedded viewer with scrolling and zoom.</w:t>
-      </w:r>
-    </w:p>
-    <w:p>
-      <w:pPr>
-        <w:pStyle w:val="ListBullet"/>
-        <w:ind w:left="360"/>
-      </w:pPr>
-      <w:r>
-        <w:t>Text files are shown in a readable monospace view.</w:t>
-      </w:r>
-    </w:p>
-    <w:p>
-      <w:pPr>
-        <w:pStyle w:val="ListBullet"/>
-        <w:ind w:left="360"/>
-      </w:pPr>
-      <w:r>
-        <w:t>Office files (Word, Excel, PowerPoint) offer a Download button to open in your local Office app.</w:t>
-      </w:r>
-    </w:p>
-    <w:p>
-      <w:pPr>
-        <w:pStyle w:val="ListNumber"/>
-        <w:ind w:left="360"/>
-      </w:pPr>
-      <w:r>
-        <w:t>The viewer's toolbar has buttons for Add Description, View Map Location, Extract Text (OCR), Extract Key Parameters, Scan Barcode (section 4.8), Ask AI (section 4.9, requires an API key - section 6.4), Download, Pop Out, and Close.</w:t>
-      </w:r>
-    </w:p>
-    <w:p>
-      <w:pPr>
-        <w:pStyle w:val="ListNumber"/>
-        <w:ind w:left="360"/>
-      </w:pPr>
-      <w:r>
-        <w:t>Click Close or press Escape to close the viewer.</w:t>
+        <w:t>Optionally type something into Add text to filenames (optional) - it's inserted right after the date when there is one (e.g. 2026-09-17-text-original name), or at the very front of the filename when there isn't. The mic button next to it accepts voice dictation too. Leave it blank to add nothing.</w:t>
       </w:r>
     </w:p>
     <w:p>
@@ -3528,7 +3349,7 @@
       <w:r>
         <w:drawing>
           <wp:inline xmlns:a="http://schemas.openxmlformats.org/drawingml/2006/main" xmlns:pic="http://schemas.openxmlformats.org/drawingml/2006/picture">
-            <wp:extent cx="5486400" cy="3429000"/>
+            <wp:extent cx="5486400" cy="2443102"/>
             <wp:docPr id="11" name="Picture 11"/>
             <wp:cNvGraphicFramePr>
               <a:graphicFrameLocks noChangeAspect="1"/>
@@ -3537,7 +3358,7 @@
               <a:graphicData uri="http://schemas.openxmlformats.org/drawingml/2006/picture">
                 <pic:pic>
                   <pic:nvPicPr>
-                    <pic:cNvPr id="0" name="05_doc_viewer_pdf.png"/>
+                    <pic:cNvPr id="0" name="43_upload_folder_modes.png"/>
                     <pic:cNvPicPr/>
                   </pic:nvPicPr>
                   <pic:blipFill>
@@ -3549,7 +3370,7 @@
                   <pic:spPr>
                     <a:xfrm>
                       <a:off x="0" y="0"/>
-                      <a:ext cx="5486400" cy="3429000"/>
+                      <a:ext cx="5486400" cy="2443102"/>
                     </a:xfrm>
                     <a:prstGeom prst="rect"/>
                   </pic:spPr>
@@ -3570,10 +3391,253 @@
           <w:color w:val="707070"/>
           <w:sz w:val="18"/>
         </w:rPr>
-        <w:t>Figure 4-1  The PDF document viewer</w:t>
+        <w:t>Figure 4-2  The Upload Multiple Folders dialog: the three upload modes and the filename text field</w:t>
       </w:r>
     </w:p>
     <w:p/>
+    <w:p>
+      <w:pPr>
+        <w:pStyle w:val="ListNumber"/>
+        <w:ind w:left="360"/>
+      </w:pPr>
+      <w:r>
+        <w:t>Click Upload in the bottom-right corner to finish.</w:t>
+      </w:r>
+    </w:p>
+    <w:p>
+      <w:pPr>
+        <w:ind w:left="576" w:right="576"/>
+        <w:shd w:val="clear" w:color="auto" w:fill="E6F4EA"/>
+      </w:pPr>
+      <w:r>
+        <w:rPr>
+          <w:b/>
+          <w:color w:val="056F00"/>
+        </w:rPr>
+        <w:t xml:space="preserve">Tip: </w:t>
+      </w:r>
+      <w:r>
+        <w:rPr>
+          <w:color w:val="333333"/>
+        </w:rPr>
+        <w:t>Mix and match across batches as needed: archive a whole phone-camera-roll folder with Sort into year/month, while a drawing folder that's already organized by project uses Upload as the sources or Recreate the picked folder to keep its structure intact.</w:t>
+      </w:r>
+    </w:p>
+    <w:p>
+      <w:pPr>
+        <w:pStyle w:val="Heading2"/>
+      </w:pPr>
+      <w:r>
+        <w:rPr>
+          <w:color w:val="1D4E89"/>
+        </w:rPr>
+        <w:t>4.3  Pasting Screenshots</w:t>
+      </w:r>
+    </w:p>
+    <w:p>
+      <w:r>
+        <w:t>You don't need to save a file first - a screenshot you just took, or an image copied from elsewhere, can be pasted straight into the current folder.</w:t>
+      </w:r>
+    </w:p>
+    <w:p>
+      <w:pPr>
+        <w:pStyle w:val="ListNumber"/>
+        <w:ind w:left="360"/>
+      </w:pPr>
+      <w:r>
+        <w:t>Select the destination folder in the Tree tab.</w:t>
+      </w:r>
+    </w:p>
+    <w:p>
+      <w:pPr>
+        <w:pStyle w:val="ListNumber"/>
+        <w:ind w:left="360"/>
+      </w:pPr>
+      <w:r>
+        <w:t>Take a screenshot (or copy an image) to the system clipboard.</w:t>
+      </w:r>
+    </w:p>
+    <w:p>
+      <w:pPr>
+        <w:pStyle w:val="ListNumber"/>
+        <w:ind w:left="360"/>
+      </w:pPr>
+      <w:r>
+        <w:t>Click Paste Screenshot, or simply press Ctrl+V (Windows) / Cmd+V (Mac).</w:t>
+      </w:r>
+    </w:p>
+    <w:p>
+      <w:pPr>
+        <w:pStyle w:val="ListNumber"/>
+        <w:ind w:left="360"/>
+      </w:pPr>
+      <w:r>
+        <w:t>DMS saves the clipboard image as a PDF and adds it to the current folder.</w:t>
+      </w:r>
+    </w:p>
+    <w:p>
+      <w:pPr>
+        <w:pStyle w:val="Heading2"/>
+      </w:pPr>
+      <w:r>
+        <w:rPr>
+          <w:color w:val="1D4E89"/>
+        </w:rPr>
+        <w:t>4.4  Linking Existing Documents</w:t>
+      </w:r>
+    </w:p>
+    <w:p>
+      <w:r>
+        <w:t>The same document can be linked into multiple folders without duplicating the file on disk.</w:t>
+      </w:r>
+    </w:p>
+    <w:p>
+      <w:pPr>
+        <w:pStyle w:val="ListNumber"/>
+        <w:ind w:left="360"/>
+      </w:pPr>
+      <w:r>
+        <w:t>Select the folder you want to link the document into.</w:t>
+      </w:r>
+    </w:p>
+    <w:p>
+      <w:pPr>
+        <w:pStyle w:val="ListNumber"/>
+        <w:ind w:left="360"/>
+      </w:pPr>
+      <w:r>
+        <w:t>Click Link Existing Document.</w:t>
+      </w:r>
+    </w:p>
+    <w:p>
+      <w:pPr>
+        <w:pStyle w:val="ListNumber"/>
+        <w:ind w:left="360"/>
+      </w:pPr>
+      <w:r>
+        <w:t>A dialog lists all documents in the system.</w:t>
+      </w:r>
+    </w:p>
+    <w:p>
+      <w:pPr>
+        <w:pStyle w:val="ListNumber"/>
+        <w:ind w:left="360"/>
+      </w:pPr>
+      <w:r>
+        <w:t>Check the document(s) you want and click Add Link.</w:t>
+      </w:r>
+    </w:p>
+    <w:p>
+      <w:pPr>
+        <w:pStyle w:val="ListNumber"/>
+        <w:ind w:left="360"/>
+      </w:pPr>
+      <w:r>
+        <w:t>The document now appears in both the original folder and the new folder.</w:t>
+      </w:r>
+    </w:p>
+    <w:p>
+      <w:pPr>
+        <w:ind w:left="576" w:right="576"/>
+        <w:shd w:val="clear" w:color="auto" w:fill="E6F4EA"/>
+      </w:pPr>
+      <w:r>
+        <w:rPr>
+          <w:b/>
+          <w:color w:val="056F00"/>
+        </w:rPr>
+        <w:t xml:space="preserve">Tip: </w:t>
+      </w:r>
+      <w:r>
+        <w:rPr>
+          <w:color w:val="333333"/>
+        </w:rPr>
+        <w:t>A faster way: just drag a document card and drop it directly onto the target folder in the left-hand tree. It has exactly the same effect as the steps above, without opening the picker dialog first.</w:t>
+      </w:r>
+    </w:p>
+    <w:p>
+      <w:pPr>
+        <w:pStyle w:val="Heading2"/>
+      </w:pPr>
+      <w:r>
+        <w:rPr>
+          <w:color w:val="1D4E89"/>
+        </w:rPr>
+        <w:t>4.5  Viewing a Document</w:t>
+      </w:r>
+    </w:p>
+    <w:p>
+      <w:pPr>
+        <w:pStyle w:val="ListNumber"/>
+        <w:ind w:left="360"/>
+      </w:pPr>
+      <w:r>
+        <w:t>Click the document name or thumbnail to open the Document Viewer.</w:t>
+      </w:r>
+    </w:p>
+    <w:p>
+      <w:pPr>
+        <w:pStyle w:val="ListNumber"/>
+        <w:ind w:left="360"/>
+      </w:pPr>
+      <w:r>
+        <w:t>The viewer opens as an overlay with the preview as its main content; you can drag its edges to resize it, drag the title bar to move it, or click Pop Out to turn the viewer into its own separate browser window (for example, to drag it to a second monitor). The divider between the preview and the info panel on the right can also be dragged to resize either side.</w:t>
+      </w:r>
+    </w:p>
+    <w:p>
+      <w:pPr>
+        <w:pStyle w:val="ListBullet"/>
+        <w:ind w:left="360"/>
+      </w:pPr>
+      <w:r>
+        <w:t>Images are shown inline.</w:t>
+      </w:r>
+    </w:p>
+    <w:p>
+      <w:pPr>
+        <w:pStyle w:val="ListBullet"/>
+        <w:ind w:left="360"/>
+      </w:pPr>
+      <w:r>
+        <w:t>PDFs open in an embedded viewer with scrolling and zoom.</w:t>
+      </w:r>
+    </w:p>
+    <w:p>
+      <w:pPr>
+        <w:pStyle w:val="ListBullet"/>
+        <w:ind w:left="360"/>
+      </w:pPr>
+      <w:r>
+        <w:t>Text files are shown in a readable monospace view.</w:t>
+      </w:r>
+    </w:p>
+    <w:p>
+      <w:pPr>
+        <w:pStyle w:val="ListBullet"/>
+        <w:ind w:left="360"/>
+      </w:pPr>
+      <w:r>
+        <w:t>Office files (Word, Excel, PowerPoint) offer a Download button to open in your local Office app.</w:t>
+      </w:r>
+    </w:p>
+    <w:p>
+      <w:pPr>
+        <w:pStyle w:val="ListNumber"/>
+        <w:ind w:left="360"/>
+      </w:pPr>
+      <w:r>
+        <w:t>The viewer's toolbar has buttons for Add Description, View Map Location, Extract Text (OCR), Extract Key Parameters, Scan Barcode (section 4.8), Ask AI (section 4.9, requires an API key - section 6.4), Download, Pop Out, and Close.</w:t>
+      </w:r>
+    </w:p>
+    <w:p>
+      <w:pPr>
+        <w:pStyle w:val="ListNumber"/>
+        <w:ind w:left="360"/>
+      </w:pPr>
+      <w:r>
+        <w:t>Click Close or press Escape to close the viewer.</w:t>
+      </w:r>
+    </w:p>
     <w:p>
       <w:pPr>
         <w:jc w:val="center"/>
@@ -3590,7 +3654,7 @@
               <a:graphicData uri="http://schemas.openxmlformats.org/drawingml/2006/picture">
                 <pic:pic>
                   <pic:nvPicPr>
-                    <pic:cNvPr id="0" name="06_doc_viewer_image.png"/>
+                    <pic:cNvPr id="0" name="05_doc_viewer_pdf.png"/>
                     <pic:cNvPicPr/>
                   </pic:nvPicPr>
                   <pic:blipFill>
@@ -3623,7 +3687,60 @@
           <w:color w:val="707070"/>
           <w:sz w:val="18"/>
         </w:rPr>
-        <w:t>Figure 4-2  The image document viewer</w:t>
+        <w:t>Figure 4-3  The PDF document viewer</w:t>
+      </w:r>
+    </w:p>
+    <w:p/>
+    <w:p>
+      <w:pPr>
+        <w:jc w:val="center"/>
+      </w:pPr>
+      <w:r>
+        <w:drawing>
+          <wp:inline xmlns:a="http://schemas.openxmlformats.org/drawingml/2006/main" xmlns:pic="http://schemas.openxmlformats.org/drawingml/2006/picture">
+            <wp:extent cx="5486400" cy="3429000"/>
+            <wp:docPr id="13" name="Picture 13"/>
+            <wp:cNvGraphicFramePr>
+              <a:graphicFrameLocks noChangeAspect="1"/>
+            </wp:cNvGraphicFramePr>
+            <a:graphic>
+              <a:graphicData uri="http://schemas.openxmlformats.org/drawingml/2006/picture">
+                <pic:pic>
+                  <pic:nvPicPr>
+                    <pic:cNvPr id="0" name="06_doc_viewer_image.png"/>
+                    <pic:cNvPicPr/>
+                  </pic:nvPicPr>
+                  <pic:blipFill>
+                    <a:blip r:embed="rId21"/>
+                    <a:stretch>
+                      <a:fillRect/>
+                    </a:stretch>
+                  </pic:blipFill>
+                  <pic:spPr>
+                    <a:xfrm>
+                      <a:off x="0" y="0"/>
+                      <a:ext cx="5486400" cy="3429000"/>
+                    </a:xfrm>
+                    <a:prstGeom prst="rect"/>
+                  </pic:spPr>
+                </pic:pic>
+              </a:graphicData>
+            </a:graphic>
+          </wp:inline>
+        </w:drawing>
+      </w:r>
+    </w:p>
+    <w:p>
+      <w:pPr>
+        <w:jc w:val="center"/>
+      </w:pPr>
+      <w:r>
+        <w:rPr>
+          <w:i/>
+          <w:color w:val="707070"/>
+          <w:sz w:val="18"/>
+        </w:rPr>
+        <w:t>Figure 4-4  The image document viewer</w:t>
       </w:r>
     </w:p>
     <w:p/>
@@ -3635,7 +3752,7 @@
         <w:drawing>
           <wp:inline xmlns:a="http://schemas.openxmlformats.org/drawingml/2006/main" xmlns:pic="http://schemas.openxmlformats.org/drawingml/2006/picture">
             <wp:extent cx="5486400" cy="2741275"/>
-            <wp:docPr id="13" name="Picture 13"/>
+            <wp:docPr id="14" name="Picture 14"/>
             <wp:cNvGraphicFramePr>
               <a:graphicFrameLocks noChangeAspect="1"/>
             </wp:cNvGraphicFramePr>
@@ -3647,7 +3764,7 @@
                     <pic:cNvPicPr/>
                   </pic:nvPicPr>
                   <pic:blipFill>
-                    <a:blip r:embed="rId21"/>
+                    <a:blip r:embed="rId22"/>
                     <a:stretch>
                       <a:fillRect/>
                     </a:stretch>
@@ -3676,7 +3793,7 @@
           <w:color w:val="707070"/>
           <w:sz w:val="18"/>
         </w:rPr>
-        <w:t>Figure 4-3  The viewer's top toolbar: extract key parameters, scan barcode, ask AI, pop out, and more</w:t>
+        <w:t>Figure 4-5  The viewer's top toolbar: extract key parameters, scan barcode, ask AI, pop out, and more</w:t>
       </w:r>
     </w:p>
     <w:p/>
@@ -3977,7 +4094,7 @@
         <w:drawing>
           <wp:inline xmlns:a="http://schemas.openxmlformats.org/drawingml/2006/main" xmlns:pic="http://schemas.openxmlformats.org/drawingml/2006/picture">
             <wp:extent cx="5486400" cy="2253343"/>
-            <wp:docPr id="14" name="Picture 14"/>
+            <wp:docPr id="15" name="Picture 15"/>
             <wp:cNvGraphicFramePr>
               <a:graphicFrameLocks noChangeAspect="1"/>
             </wp:cNvGraphicFramePr>
@@ -3989,7 +4106,7 @@
                     <pic:cNvPicPr/>
                   </pic:nvPicPr>
                   <pic:blipFill>
-                    <a:blip r:embed="rId22"/>
+                    <a:blip r:embed="rId23"/>
                     <a:stretch>
                       <a:fillRect/>
                     </a:stretch>
@@ -4018,7 +4135,7 @@
           <w:color w:val="707070"/>
           <w:sz w:val="18"/>
         </w:rPr>
-        <w:t>Figure 4-4  Scan Barcode: the success banner after a successful read</w:t>
+        <w:t>Figure 4-6  Scan Barcode: the success banner after a successful read</w:t>
       </w:r>
     </w:p>
     <w:p/>
@@ -4107,116 +4224,6 @@
       </w:pPr>
       <w:r>
         <w:t>The answer appears below, and the question and answer are both appended to a running Q&amp;A record document kept in the same folder, so you can look back at it later.</w:t>
-      </w:r>
-    </w:p>
-    <w:p>
-      <w:pPr>
-        <w:jc w:val="center"/>
-      </w:pPr>
-      <w:r>
-        <w:drawing>
-          <wp:inline xmlns:a="http://schemas.openxmlformats.org/drawingml/2006/main" xmlns:pic="http://schemas.openxmlformats.org/drawingml/2006/picture">
-            <wp:extent cx="5486400" cy="2741275"/>
-            <wp:docPr id="15" name="Picture 15"/>
-            <wp:cNvGraphicFramePr>
-              <a:graphicFrameLocks noChangeAspect="1"/>
-            </wp:cNvGraphicFramePr>
-            <a:graphic>
-              <a:graphicData uri="http://schemas.openxmlformats.org/drawingml/2006/picture">
-                <pic:pic>
-                  <pic:nvPicPr>
-                    <pic:cNvPr id="0" name="30_doc_ask_ai.png"/>
-                    <pic:cNvPicPr/>
-                  </pic:nvPicPr>
-                  <pic:blipFill>
-                    <a:blip r:embed="rId23"/>
-                    <a:stretch>
-                      <a:fillRect/>
-                    </a:stretch>
-                  </pic:blipFill>
-                  <pic:spPr>
-                    <a:xfrm>
-                      <a:off x="0" y="0"/>
-                      <a:ext cx="5486400" cy="2741275"/>
-                    </a:xfrm>
-                    <a:prstGeom prst="rect"/>
-                  </pic:spPr>
-                </pic:pic>
-              </a:graphicData>
-            </a:graphic>
-          </wp:inline>
-        </w:drawing>
-      </w:r>
-    </w:p>
-    <w:p>
-      <w:pPr>
-        <w:jc w:val="center"/>
-      </w:pPr>
-      <w:r>
-        <w:rPr>
-          <w:i/>
-          <w:color w:val="707070"/>
-          <w:sz w:val="18"/>
-        </w:rPr>
-        <w:t>Figure 4-5  Asking AI about a single document (needs a Gemini or DeepSeek API key - section 6.4)</w:t>
-      </w:r>
-    </w:p>
-    <w:p/>
-    <w:p>
-      <w:r>
-        <w:t>The description panel's AI Cleanup button works the same way for a single document's description: choose “Organize / Polish wording / Make concise,” and the AI tidies up rough or dictated text while keeping all the information; the result previews first, and only replaces your text once you click Apply.</w:t>
-      </w:r>
-    </w:p>
-    <w:p>
-      <w:pPr>
-        <w:pStyle w:val="Heading2"/>
-      </w:pPr>
-      <w:r>
-        <w:rPr>
-          <w:color w:val="1D4E89"/>
-        </w:rPr>
-        <w:t>4.10  Convert to PDF (Batch)</w:t>
-      </w:r>
-    </w:p>
-    <w:p>
-      <w:r>
-        <w:t>Need to convert a batch of photos or existing PDFs into a consistent, cleanly named set? You don't have to save each one individually.</w:t>
-      </w:r>
-    </w:p>
-    <w:p>
-      <w:pPr>
-        <w:pStyle w:val="ListNumber"/>
-        <w:ind w:left="360"/>
-      </w:pPr>
-      <w:r>
-        <w:t>Check the images and/or PDFs you want to convert in the folder (use Multi-select, or check them inside the dialog that opens).</w:t>
-      </w:r>
-    </w:p>
-    <w:p>
-      <w:pPr>
-        <w:pStyle w:val="ListNumber"/>
-        <w:ind w:left="360"/>
-      </w:pPr>
-      <w:r>
-        <w:t>Click Convert to PDF; the dialog lists the checked documents and their sizes.</w:t>
-      </w:r>
-    </w:p>
-    <w:p>
-      <w:pPr>
-        <w:pStyle w:val="ListNumber"/>
-        <w:ind w:left="360"/>
-      </w:pPr>
-      <w:r>
-        <w:t>Click Convert N document(s) to PDF.</w:t>
-      </w:r>
-    </w:p>
-    <w:p>
-      <w:pPr>
-        <w:pStyle w:val="ListNumber"/>
-        <w:ind w:left="360"/>
-      </w:pPr>
-      <w:r>
-        <w:t>Each document is converted into its own separate PDF (named with a “YYYY-MM-DD-” prefix whenever a date is known); the originals are moved to “Deleted files” (a soft delete - recoverable, see section 3.2).</w:t>
       </w:r>
     </w:p>
     <w:p>
@@ -4235,7 +4242,7 @@
               <a:graphicData uri="http://schemas.openxmlformats.org/drawingml/2006/picture">
                 <pic:pic>
                   <pic:nvPicPr>
-                    <pic:cNvPr id="0" name="33_convert_to_pdf.png"/>
+                    <pic:cNvPr id="0" name="30_doc_ask_ai.png"/>
                     <pic:cNvPicPr/>
                   </pic:nvPicPr>
                   <pic:blipFill>
@@ -4268,10 +4275,15 @@
           <w:color w:val="707070"/>
           <w:sz w:val="18"/>
         </w:rPr>
-        <w:t>Figure 4-6  The Convert to PDF dialog, with one document selected</w:t>
+        <w:t>Figure 4-7  Asking AI about a single document (needs a Gemini or DeepSeek API key - section 6.4)</w:t>
       </w:r>
     </w:p>
     <w:p/>
+    <w:p>
+      <w:r>
+        <w:t>The description panel's AI Cleanup button works the same way for a single document's description: choose “Organize / Polish wording / Make concise,” and the AI tidies up rough or dictated text while keeping all the information; the result previews first, and only replaces your text once you click Apply.</w:t>
+      </w:r>
+    </w:p>
     <w:p>
       <w:pPr>
         <w:pStyle w:val="Heading2"/>
@@ -4280,55 +4292,48 @@
         <w:rPr>
           <w:color w:val="1D4E89"/>
         </w:rPr>
-        <w:t>4.11  On-Disk Filenames and Recovering Deletions</w:t>
-      </w:r>
-    </w:p>
-    <w:p>
-      <w:r>
-        <w:t>These are lower-level improvements that need no action from you, but are useful to know about when browsing files in your system's file manager or troubleshooting:</w:t>
-      </w:r>
-    </w:p>
-    <w:p>
-      <w:pPr>
-        <w:pStyle w:val="ListBullet"/>
+        <w:t>4.10  Convert to PDF (Batch)</w:t>
+      </w:r>
+    </w:p>
+    <w:p>
+      <w:r>
+        <w:t>Need to convert a batch of photos or existing PDFs into a consistent, cleanly named set? You don't have to save each one individually.</w:t>
+      </w:r>
+    </w:p>
+    <w:p>
+      <w:pPr>
+        <w:pStyle w:val="ListNumber"/>
         <w:ind w:left="360"/>
       </w:pPr>
       <w:r>
-        <w:t>Filenames on disk now start with the document's name instead of its internal ID (e.g. Inspection Report+DOC-20260920-xxx.pdf), so browsing the storage folder directly in Finder / Explorer immediately tells you what a file is without opening it first.</w:t>
-      </w:r>
-    </w:p>
-    <w:p>
-      <w:pPr>
-        <w:pStyle w:val="ListBullet"/>
+        <w:t>Check the images and/or PDFs you want to convert in the folder (use Multi-select, or check them inside the dialog that opens).</w:t>
+      </w:r>
+    </w:p>
+    <w:p>
+      <w:pPr>
+        <w:pStyle w:val="ListNumber"/>
         <w:ind w:left="360"/>
       </w:pPr>
       <w:r>
-        <w:t>A failed upload now reports the actual reason (e.g. disk full, no write permission) instead of a bare, unexplained “500 error.”</w:t>
-      </w:r>
-    </w:p>
-    <w:p>
-      <w:pPr>
-        <w:pStyle w:val="ListBullet"/>
+        <w:t>Click Convert to PDF; the dialog lists the checked documents and their sizes.</w:t>
+      </w:r>
+    </w:p>
+    <w:p>
+      <w:pPr>
+        <w:pStyle w:val="ListNumber"/>
         <w:ind w:left="360"/>
       </w:pPr>
       <w:r>
-        <w:t>Before any change to a project's folder structure (adding/removing folders, moving things, batch operations), DMS automatically saves a snapshot of the structure at that moment; if a particular change ever leaves the structure in a bad state, that snapshot can be used to roll back. This safety net runs entirely in the background - you won't see any UI for it during normal use.</w:t>
-      </w:r>
-    </w:p>
-    <w:p>
-      <w:pPr>
-        <w:pStyle w:val="Heading2"/>
-      </w:pPr>
-      <w:r>
-        <w:rPr>
-          <w:color w:val="1D4E89"/>
-        </w:rPr>
-        <w:t>4.12  Batch Document Actions (Multi-select: Download, Batch Rename, Find Near-Duplicates)</w:t>
-      </w:r>
-    </w:p>
-    <w:p>
-      <w:r>
-        <w:t>The document list has a row of batch-action buttons above it that work on every document in the current folder, without needing to pop out the grid-view window first (Section 19 covers the pop-out window's own batch actions - the two can be used together):</w:t>
+        <w:t>Click Convert N document(s) to PDF.</w:t>
+      </w:r>
+    </w:p>
+    <w:p>
+      <w:pPr>
+        <w:pStyle w:val="ListNumber"/>
+        <w:ind w:left="360"/>
+      </w:pPr>
+      <w:r>
+        <w:t>Each document is converted into its own separate PDF (named with a “YYYY-MM-DD-” prefix whenever a date is known); the originals are moved to “Deleted files” (a soft delete - recoverable, see section 3.2).</w:t>
       </w:r>
     </w:p>
     <w:p>
@@ -4338,7 +4343,7 @@
       <w:r>
         <w:drawing>
           <wp:inline xmlns:a="http://schemas.openxmlformats.org/drawingml/2006/main" xmlns:pic="http://schemas.openxmlformats.org/drawingml/2006/picture">
-            <wp:extent cx="5486400" cy="2936720"/>
+            <wp:extent cx="5486400" cy="2741275"/>
             <wp:docPr id="17" name="Picture 17"/>
             <wp:cNvGraphicFramePr>
               <a:graphicFrameLocks noChangeAspect="1"/>
@@ -4347,7 +4352,7 @@
               <a:graphicData uri="http://schemas.openxmlformats.org/drawingml/2006/picture">
                 <pic:pic>
                   <pic:nvPicPr>
-                    <pic:cNvPr id="0" name="40_multiselect_toolbar.png"/>
+                    <pic:cNvPr id="0" name="33_convert_to_pdf.png"/>
                     <pic:cNvPicPr/>
                   </pic:nvPicPr>
                   <pic:blipFill>
@@ -4359,7 +4364,7 @@
                   <pic:spPr>
                     <a:xfrm>
                       <a:off x="0" y="0"/>
-                      <a:ext cx="5486400" cy="2936720"/>
+                      <a:ext cx="5486400" cy="2741275"/>
                     </a:xfrm>
                     <a:prstGeom prst="rect"/>
                   </pic:spPr>
@@ -4380,17 +4385,33 @@
           <w:color w:val="707070"/>
           <w:sz w:val="18"/>
         </w:rPr>
-        <w:t>Figure 4-7  Document list toolbar: Select, AI-fill parameter, Batch rename, Find near-duplicates</w:t>
+        <w:t>Figure 4-8  The Convert to PDF dialog, with one document selected</w:t>
       </w:r>
     </w:p>
     <w:p/>
+    <w:p>
+      <w:pPr>
+        <w:pStyle w:val="Heading2"/>
+      </w:pPr>
+      <w:r>
+        <w:rPr>
+          <w:color w:val="1D4E89"/>
+        </w:rPr>
+        <w:t>4.11  On-Disk Filenames and Recovering Deletions</w:t>
+      </w:r>
+    </w:p>
+    <w:p>
+      <w:r>
+        <w:t>These are lower-level improvements that need no action from you, but are useful to know about when browsing files in your system's file manager or troubleshooting:</w:t>
+      </w:r>
+    </w:p>
     <w:p>
       <w:pPr>
         <w:pStyle w:val="ListBullet"/>
         <w:ind w:left="360"/>
       </w:pPr>
       <w:r>
-        <w:t>Select - check one or more documents, then either Download them to a folder (defaults to your Downloads folder) or Unlink them from the current folder (the documents themselves are soft-deleted - see section 3.2).</w:t>
+        <w:t>Filenames on disk now start with the document's name instead of its internal ID (e.g. Inspection Report+DOC-20260920-xxx.pdf), so browsing the storage folder directly in Finder / Explorer immediately tells you what a file is without opening it first.</w:t>
       </w:r>
     </w:p>
     <w:p>
@@ -4399,7 +4420,7 @@
         <w:ind w:left="360"/>
       </w:pPr>
       <w:r>
-        <w:t>AI-fill parameter - multi-select documents and have AI read one parameter's value off each and fill it in for all of them at once; see section 6.6 for the full flow.</w:t>
+        <w:t>A failed upload now reports the actual reason (e.g. disk full, no write permission) instead of a bare, unexplained “500 error.”</w:t>
       </w:r>
     </w:p>
     <w:p>
@@ -4408,7 +4429,23 @@
         <w:ind w:left="360"/>
       </w:pPr>
       <w:r>
-        <w:t>Batch rename - renames every document in the current folder to “date + location - original name” (the date comes from the document's own capture/archive date, and documents where no date can be resolved are skipped; the location comes from the document's location metadata and is omitted if there isn't one). The actual file on disk is renamed too. Clicking it shows a preview first; nothing changes until you confirm.</w:t>
+        <w:t>Before any change to a project's folder structure (adding/removing folders, moving things, batch operations), DMS automatically saves a snapshot of the structure at that moment; if a particular change ever leaves the structure in a bad state, that snapshot can be used to roll back. This safety net runs entirely in the background - you won't see any UI for it during normal use.</w:t>
+      </w:r>
+    </w:p>
+    <w:p>
+      <w:pPr>
+        <w:pStyle w:val="Heading2"/>
+      </w:pPr>
+      <w:r>
+        <w:rPr>
+          <w:color w:val="1D4E89"/>
+        </w:rPr>
+        <w:t>4.12  Batch Document Actions (Multi-select: Download, Batch Rename, Find Near-Duplicates)</w:t>
+      </w:r>
+    </w:p>
+    <w:p>
+      <w:r>
+        <w:t>The document list has a row of batch-action buttons above it that work on every document in the current folder, without needing to pop out the grid-view window first (Section 19 covers the pop-out window's own batch actions - the two can be used together):</w:t>
       </w:r>
     </w:p>
     <w:p>
@@ -4427,7 +4464,7 @@
               <a:graphicData uri="http://schemas.openxmlformats.org/drawingml/2006/picture">
                 <pic:pic>
                   <pic:nvPicPr>
-                    <pic:cNvPr id="0" name="42_batch_rename_preview.png"/>
+                    <pic:cNvPr id="0" name="40_multiselect_toolbar.png"/>
                     <pic:cNvPicPr/>
                   </pic:nvPicPr>
                   <pic:blipFill>
@@ -4460,7 +4497,87 @@
           <w:color w:val="707070"/>
           <w:sz w:val="18"/>
         </w:rPr>
-        <w:t>Figure 4-8  Batch rename preview: nothing is renamed until you confirm</w:t>
+        <w:t>Figure 4-9  Document list toolbar: Select, AI-fill parameter, Batch rename, Find near-duplicates</w:t>
+      </w:r>
+    </w:p>
+    <w:p/>
+    <w:p>
+      <w:pPr>
+        <w:pStyle w:val="ListBullet"/>
+        <w:ind w:left="360"/>
+      </w:pPr>
+      <w:r>
+        <w:t>Select - check one or more documents, then either Download them to a folder (defaults to your Downloads folder) or Unlink them from the current folder (the documents themselves are soft-deleted - see section 3.2).</w:t>
+      </w:r>
+    </w:p>
+    <w:p>
+      <w:pPr>
+        <w:pStyle w:val="ListBullet"/>
+        <w:ind w:left="360"/>
+      </w:pPr>
+      <w:r>
+        <w:t>AI-fill parameter - multi-select documents and have AI read one parameter's value off each and fill it in for all of them at once; see section 6.6 for the full flow.</w:t>
+      </w:r>
+    </w:p>
+    <w:p>
+      <w:pPr>
+        <w:pStyle w:val="ListBullet"/>
+        <w:ind w:left="360"/>
+      </w:pPr>
+      <w:r>
+        <w:t>Batch rename - renames every document in the current folder to “date + location - original name” (the date comes from the document's own capture/archive date, and documents where no date can be resolved are skipped; the location comes from the document's location metadata and is omitted if there isn't one). The actual file on disk is renamed too. Clicking it shows a preview first; nothing changes until you confirm.</w:t>
+      </w:r>
+    </w:p>
+    <w:p>
+      <w:pPr>
+        <w:jc w:val="center"/>
+      </w:pPr>
+      <w:r>
+        <w:drawing>
+          <wp:inline xmlns:a="http://schemas.openxmlformats.org/drawingml/2006/main" xmlns:pic="http://schemas.openxmlformats.org/drawingml/2006/picture">
+            <wp:extent cx="5486400" cy="2936720"/>
+            <wp:docPr id="19" name="Picture 19"/>
+            <wp:cNvGraphicFramePr>
+              <a:graphicFrameLocks noChangeAspect="1"/>
+            </wp:cNvGraphicFramePr>
+            <a:graphic>
+              <a:graphicData uri="http://schemas.openxmlformats.org/drawingml/2006/picture">
+                <pic:pic>
+                  <pic:nvPicPr>
+                    <pic:cNvPr id="0" name="42_batch_rename_preview.png"/>
+                    <pic:cNvPicPr/>
+                  </pic:nvPicPr>
+                  <pic:blipFill>
+                    <a:blip r:embed="rId27"/>
+                    <a:stretch>
+                      <a:fillRect/>
+                    </a:stretch>
+                  </pic:blipFill>
+                  <pic:spPr>
+                    <a:xfrm>
+                      <a:off x="0" y="0"/>
+                      <a:ext cx="5486400" cy="2936720"/>
+                    </a:xfrm>
+                    <a:prstGeom prst="rect"/>
+                  </pic:spPr>
+                </pic:pic>
+              </a:graphicData>
+            </a:graphic>
+          </wp:inline>
+        </w:drawing>
+      </w:r>
+    </w:p>
+    <w:p>
+      <w:pPr>
+        <w:jc w:val="center"/>
+      </w:pPr>
+      <w:r>
+        <w:rPr>
+          <w:i/>
+          <w:color w:val="707070"/>
+          <w:sz w:val="18"/>
+        </w:rPr>
+        <w:t>Figure 4-10  Batch rename preview: nothing is renamed until you confirm</w:t>
       </w:r>
     </w:p>
     <w:p/>
@@ -5009,7 +5126,7 @@
         <w:drawing>
           <wp:inline xmlns:a="http://schemas.openxmlformats.org/drawingml/2006/main" xmlns:pic="http://schemas.openxmlformats.org/drawingml/2006/picture">
             <wp:extent cx="5486400" cy="3429000"/>
-            <wp:docPr id="19" name="Picture 19"/>
+            <wp:docPr id="20" name="Picture 20"/>
             <wp:cNvGraphicFramePr>
               <a:graphicFrameLocks noChangeAspect="1"/>
             </wp:cNvGraphicFramePr>
@@ -5021,7 +5138,7 @@
                     <pic:cNvPicPr/>
                   </pic:nvPicPr>
                   <pic:blipFill>
-                    <a:blip r:embed="rId27"/>
+                    <a:blip r:embed="rId28"/>
                     <a:stretch>
                       <a:fillRect/>
                     </a:stretch>
@@ -5080,12 +5197,141 @@
       </w:r>
     </w:p>
     <w:p>
+      <w:r>
+        <w:t>If you don't have an API key yet, a “Don't have an API key?” link sits right below each provider's input field in that dialog and jumps straight to its free sign-up page in a new browser tab:</w:t>
+      </w:r>
+    </w:p>
+    <w:tbl>
+      <w:tblPr>
+        <w:tblStyle w:val="TableGrid"/>
+        <w:tblW w:type="auto" w:w="0"/>
+        <w:tblLook w:firstColumn="1" w:firstRow="1" w:lastColumn="0" w:lastRow="0" w:noHBand="0" w:noVBand="1" w:val="04A0"/>
+      </w:tblPr>
+      <w:tblGrid>
+        <w:gridCol w:w="2928"/>
+        <w:gridCol w:w="2928"/>
+        <w:gridCol w:w="2928"/>
+      </w:tblGrid>
+      <w:tr>
+        <w:tc>
+          <w:tcPr>
+            <w:tcW w:type="dxa" w:w="1872"/>
+            <w:shd w:val="clear" w:color="auto" w:fill="1E40AF"/>
+          </w:tcPr>
+          <w:p>
+            <w:r>
+              <w:rPr>
+                <w:b/>
+                <w:color w:val="FFFFFF"/>
+              </w:rPr>
+              <w:t>Provider</w:t>
+            </w:r>
+          </w:p>
+        </w:tc>
+        <w:tc>
+          <w:tcPr>
+            <w:tcW w:type="dxa" w:w="3168"/>
+            <w:shd w:val="clear" w:color="auto" w:fill="1E40AF"/>
+          </w:tcPr>
+          <w:p>
+            <w:r>
+              <w:rPr>
+                <w:b/>
+                <w:color w:val="FFFFFF"/>
+              </w:rPr>
+              <w:t>Free sign-up URL</w:t>
+            </w:r>
+          </w:p>
+        </w:tc>
+        <w:tc>
+          <w:tcPr>
+            <w:tcW w:type="dxa" w:w="3600"/>
+            <w:shd w:val="clear" w:color="auto" w:fill="1E40AF"/>
+          </w:tcPr>
+          <w:p>
+            <w:r>
+              <w:rPr>
+                <w:b/>
+                <w:color w:val="FFFFFF"/>
+              </w:rPr>
+              <w:t>Steps</w:t>
+            </w:r>
+          </w:p>
+        </w:tc>
+      </w:tr>
+      <w:tr>
+        <w:tc>
+          <w:tcPr>
+            <w:tcW w:type="dxa" w:w="1872"/>
+          </w:tcPr>
+          <w:p>
+            <w:r>
+              <w:t>Google Gemini</w:t>
+            </w:r>
+          </w:p>
+        </w:tc>
+        <w:tc>
+          <w:tcPr>
+            <w:tcW w:type="dxa" w:w="3168"/>
+          </w:tcPr>
+          <w:p>
+            <w:r>
+              <w:t>aistudio.google.com/apikey</w:t>
+            </w:r>
+          </w:p>
+        </w:tc>
+        <w:tc>
+          <w:tcPr>
+            <w:tcW w:type="dxa" w:w="3600"/>
+          </w:tcPr>
+          <w:p>
+            <w:r>
+              <w:t>Sign in with a Google account (free to create one if you don't have one) → click “Create API key” → choose a new project or an existing Google Cloud project → copy the generated key (a string starting with “AIza”).</w:t>
+            </w:r>
+          </w:p>
+        </w:tc>
+      </w:tr>
+      <w:tr>
+        <w:tc>
+          <w:tcPr>
+            <w:tcW w:type="dxa" w:w="1872"/>
+          </w:tcPr>
+          <w:p>
+            <w:r>
+              <w:t>DeepSeek</w:t>
+            </w:r>
+          </w:p>
+        </w:tc>
+        <w:tc>
+          <w:tcPr>
+            <w:tcW w:type="dxa" w:w="3168"/>
+          </w:tcPr>
+          <w:p>
+            <w:r>
+              <w:t>platform.deepseek.com/api_keys</w:t>
+            </w:r>
+          </w:p>
+        </w:tc>
+        <w:tc>
+          <w:tcPr>
+            <w:tcW w:type="dxa" w:w="3600"/>
+          </w:tcPr>
+          <w:p>
+            <w:r>
+              <w:t>Sign up / log in to the DeepSeek platform → on the “API Keys” page, click to create a new key → copy the generated key.</w:t>
+            </w:r>
+          </w:p>
+        </w:tc>
+      </w:tr>
+    </w:tbl>
+    <w:p/>
+    <w:p>
       <w:pPr>
         <w:pStyle w:val="ListNumber"/>
         <w:ind w:left="360"/>
       </w:pPr>
       <w:r>
-        <w:t>Paste your own Google Gemini or DeepSeek API key and click the matching Save button.</w:t>
+        <w:t>Back in DMS's AI Provider Settings dialog, paste the copied key into the matching provider's field and click its Save button.</w:t>
       </w:r>
     </w:p>
     <w:p>
@@ -5095,128 +5341,6 @@
       </w:pPr>
       <w:r>
         <w:t>The two providers' keys are stored completely independently; with both configured, each AI feature generally prefers Gemini and falls back to DeepSeek automatically when Gemini isn't available.</w:t>
-      </w:r>
-    </w:p>
-    <w:p>
-      <w:pPr>
-        <w:jc w:val="center"/>
-      </w:pPr>
-      <w:r>
-        <w:drawing>
-          <wp:inline xmlns:a="http://schemas.openxmlformats.org/drawingml/2006/main" xmlns:pic="http://schemas.openxmlformats.org/drawingml/2006/picture">
-            <wp:extent cx="5486400" cy="2741275"/>
-            <wp:docPr id="20" name="Picture 20"/>
-            <wp:cNvGraphicFramePr>
-              <a:graphicFrameLocks noChangeAspect="1"/>
-            </wp:cNvGraphicFramePr>
-            <a:graphic>
-              <a:graphicData uri="http://schemas.openxmlformats.org/drawingml/2006/picture">
-                <pic:pic>
-                  <pic:nvPicPr>
-                    <pic:cNvPr id="0" name="32_ai_provider_settings.png"/>
-                    <pic:cNvPicPr/>
-                  </pic:nvPicPr>
-                  <pic:blipFill>
-                    <a:blip r:embed="rId28"/>
-                    <a:stretch>
-                      <a:fillRect/>
-                    </a:stretch>
-                  </pic:blipFill>
-                  <pic:spPr>
-                    <a:xfrm>
-                      <a:off x="0" y="0"/>
-                      <a:ext cx="5486400" cy="2741275"/>
-                    </a:xfrm>
-                    <a:prstGeom prst="rect"/>
-                  </pic:spPr>
-                </pic:pic>
-              </a:graphicData>
-            </a:graphic>
-          </wp:inline>
-        </w:drawing>
-      </w:r>
-    </w:p>
-    <w:p>
-      <w:pPr>
-        <w:jc w:val="center"/>
-      </w:pPr>
-      <w:r>
-        <w:rPr>
-          <w:i/>
-          <w:color w:val="707070"/>
-          <w:sz w:val="18"/>
-        </w:rPr>
-        <w:t>Figure 6-2  AI Provider Settings: Gemini and DeepSeek configured separately</w:t>
-      </w:r>
-    </w:p>
-    <w:p/>
-    <w:p>
-      <w:pPr>
-        <w:ind w:left="576" w:right="576"/>
-        <w:shd w:val="clear" w:color="auto" w:fill="FFF8E1"/>
-      </w:pPr>
-      <w:r>
-        <w:rPr>
-          <w:b/>
-          <w:color w:val="924E00"/>
-        </w:rPr>
-        <w:t xml:space="preserve">Note: </w:t>
-      </w:r>
-      <w:r>
-        <w:t>These AI features are opt-in and need an internet connection; with no key configured at all, every core DMS feature (folder management, uploads, OCR, barcode scanning, search, and so on) still runs fully offline and is unaffected. Keys are stored only on this machine (a local server-side file) and are never uploaded to any DMS-related or third-party server.</w:t>
-      </w:r>
-    </w:p>
-    <w:p>
-      <w:pPr>
-        <w:ind w:left="576" w:right="576"/>
-        <w:shd w:val="clear" w:color="auto" w:fill="E6F4EA"/>
-      </w:pPr>
-      <w:r>
-        <w:rPr>
-          <w:b/>
-          <w:color w:val="056F00"/>
-        </w:rPr>
-        <w:t xml:space="preserve">Tip: </w:t>
-      </w:r>
-      <w:r>
-        <w:rPr>
-          <w:color w:val="333333"/>
-        </w:rPr>
-        <w:t>Next to “Detailed Gemini setup steps (including how to get a free/paid key)” in the dialog is a Download setup guide (.docx) link, with screenshots showing how to sign up for a Google account and request a free Gemini API key - handy if you've never gotten one before.</w:t>
-      </w:r>
-    </w:p>
-    <w:p>
-      <w:pPr>
-        <w:pStyle w:val="Heading2"/>
-      </w:pPr>
-      <w:r>
-        <w:rPr>
-          <w:color w:val="1D4E89"/>
-        </w:rPr>
-        <w:t>6.5  Parameter Trend Charts and Snapshots</w:t>
-      </w:r>
-    </w:p>
-    <w:p>
-      <w:r>
-        <w:t>Chart how a key parameter's value changes over time - useful for blood pressure, account balances, inventory levels, or any reading that needs to be logged repeatedly and reviewed for trends.</w:t>
-      </w:r>
-    </w:p>
-    <w:p>
-      <w:pPr>
-        <w:pStyle w:val="ListNumber"/>
-        <w:ind w:left="360"/>
-      </w:pPr>
-      <w:r>
-        <w:t>Select a folder and click the Trend Chart button in the toolbar.</w:t>
-      </w:r>
-    </w:p>
-    <w:p>
-      <w:pPr>
-        <w:pStyle w:val="ListNumber"/>
-        <w:ind w:left="360"/>
-      </w:pPr>
-      <w:r>
-        <w:t>In the Parameter dropdown, choose which key parameter to plot (only parameters with a numeric value somewhere in this folder or its sub-folders are listed); choose a line or bar chart, pick a field for the horizontal axis (such as document date), and “Include sub-folders” controls whether documents in child folders count too.</w:t>
       </w:r>
     </w:p>
     <w:p>
@@ -5235,7 +5359,7 @@
               <a:graphicData uri="http://schemas.openxmlformats.org/drawingml/2006/picture">
                 <pic:pic>
                   <pic:nvPicPr>
-                    <pic:cNvPr id="0" name="29_trend_chart.png"/>
+                    <pic:cNvPr id="0" name="32_ai_provider_settings.png"/>
                     <pic:cNvPicPr/>
                   </pic:nvPicPr>
                   <pic:blipFill>
@@ -5268,26 +5392,24 @@
           <w:color w:val="707070"/>
           <w:sz w:val="18"/>
         </w:rPr>
-        <w:t>Figure 6-3  The trend chart window (this folder has no numeric parameters yet; picking one shows a line/bar chart)</w:t>
+        <w:t>Figure 6-2  AI Provider Settings: Gemini and DeepSeek configured separately</w:t>
       </w:r>
     </w:p>
     <w:p/>
     <w:p>
       <w:pPr>
-        <w:pStyle w:val="ListNumber"/>
-        <w:ind w:left="360"/>
-      </w:pPr>
-      <w:r>
-        <w:t>Like the document viewer, the chart window can be dragged, resized by its edges, or popped out into its own window; the axis ranges can also be set manually instead of relying on auto-scaling.</w:t>
-      </w:r>
-    </w:p>
-    <w:p>
-      <w:pPr>
-        <w:pStyle w:val="ListNumber"/>
-        <w:ind w:left="360"/>
-      </w:pPr>
-      <w:r>
-        <w:t>Happy with a particular parameter's chart? Click Save Snapshot - DMS records that parameter's current total/latest value into an “[X] History.xlsx” document; save a few snapshots over time and you get a chart of how the value has changed.</w:t>
+        <w:ind w:left="576" w:right="576"/>
+        <w:shd w:val="clear" w:color="auto" w:fill="FFF8E1"/>
+      </w:pPr>
+      <w:r>
+        <w:rPr>
+          <w:b/>
+          <w:color w:val="924E00"/>
+        </w:rPr>
+        <w:t xml:space="preserve">Note: </w:t>
+      </w:r>
+      <w:r>
+        <w:t>These AI features are opt-in and need an internet connection; with no key configured at all, every core DMS feature (folder management, uploads, OCR, barcode scanning, search, and so on) still runs fully offline and is unaffected. Keys are stored only on this machine (a local server-side file) and are never uploaded to any DMS-related or third-party server.</w:t>
       </w:r>
     </w:p>
     <w:p>
@@ -5306,6 +5428,149 @@
         <w:rPr>
           <w:color w:val="333333"/>
         </w:rPr>
+        <w:t>Both providers offer a free tier - no credit card needed for occasional use. Free tiers are rate-limited (a cap on calls per minute/day); if you process a lot of documents in a short burst and see a “temporarily over the limit” message, just wait a bit and retry.</w:t>
+      </w:r>
+    </w:p>
+    <w:p>
+      <w:pPr>
+        <w:ind w:left="576" w:right="576"/>
+        <w:shd w:val="clear" w:color="auto" w:fill="E6F4EA"/>
+      </w:pPr>
+      <w:r>
+        <w:rPr>
+          <w:b/>
+          <w:color w:val="056F00"/>
+        </w:rPr>
+        <w:t xml:space="preserve">Tip: </w:t>
+      </w:r>
+      <w:r>
+        <w:rPr>
+          <w:color w:val="333333"/>
+        </w:rPr>
+        <w:t>Next to “Detailed Gemini setup steps (including how to get a free/paid key)” in the dialog is a Download setup guide (.docx) link, with screenshots showing how to sign up for a Google account, request a free Gemini API key, and later upgrade to a paid tier if you need higher limits - handy if you've never gotten one before.</w:t>
+      </w:r>
+    </w:p>
+    <w:p>
+      <w:pPr>
+        <w:pStyle w:val="Heading2"/>
+      </w:pPr>
+      <w:r>
+        <w:rPr>
+          <w:color w:val="1D4E89"/>
+        </w:rPr>
+        <w:t>6.5  Parameter Trend Charts and Snapshots</w:t>
+      </w:r>
+    </w:p>
+    <w:p>
+      <w:r>
+        <w:t>Chart how a key parameter's value changes over time - useful for blood pressure, account balances, inventory levels, or any reading that needs to be logged repeatedly and reviewed for trends.</w:t>
+      </w:r>
+    </w:p>
+    <w:p>
+      <w:pPr>
+        <w:pStyle w:val="ListNumber"/>
+        <w:ind w:left="360"/>
+      </w:pPr>
+      <w:r>
+        <w:t>Select a folder and click the Trend Chart button in the toolbar.</w:t>
+      </w:r>
+    </w:p>
+    <w:p>
+      <w:pPr>
+        <w:pStyle w:val="ListNumber"/>
+        <w:ind w:left="360"/>
+      </w:pPr>
+      <w:r>
+        <w:t>In the Parameter dropdown, choose which key parameter to plot (only parameters with a numeric value somewhere in this folder or its sub-folders are listed); choose a line or bar chart, pick a field for the horizontal axis (such as document date), and “Include sub-folders” controls whether documents in child folders count too.</w:t>
+      </w:r>
+    </w:p>
+    <w:p>
+      <w:pPr>
+        <w:jc w:val="center"/>
+      </w:pPr>
+      <w:r>
+        <w:drawing>
+          <wp:inline xmlns:a="http://schemas.openxmlformats.org/drawingml/2006/main" xmlns:pic="http://schemas.openxmlformats.org/drawingml/2006/picture">
+            <wp:extent cx="5486400" cy="2741275"/>
+            <wp:docPr id="22" name="Picture 22"/>
+            <wp:cNvGraphicFramePr>
+              <a:graphicFrameLocks noChangeAspect="1"/>
+            </wp:cNvGraphicFramePr>
+            <a:graphic>
+              <a:graphicData uri="http://schemas.openxmlformats.org/drawingml/2006/picture">
+                <pic:pic>
+                  <pic:nvPicPr>
+                    <pic:cNvPr id="0" name="29_trend_chart.png"/>
+                    <pic:cNvPicPr/>
+                  </pic:nvPicPr>
+                  <pic:blipFill>
+                    <a:blip r:embed="rId30"/>
+                    <a:stretch>
+                      <a:fillRect/>
+                    </a:stretch>
+                  </pic:blipFill>
+                  <pic:spPr>
+                    <a:xfrm>
+                      <a:off x="0" y="0"/>
+                      <a:ext cx="5486400" cy="2741275"/>
+                    </a:xfrm>
+                    <a:prstGeom prst="rect"/>
+                  </pic:spPr>
+                </pic:pic>
+              </a:graphicData>
+            </a:graphic>
+          </wp:inline>
+        </w:drawing>
+      </w:r>
+    </w:p>
+    <w:p>
+      <w:pPr>
+        <w:jc w:val="center"/>
+      </w:pPr>
+      <w:r>
+        <w:rPr>
+          <w:i/>
+          <w:color w:val="707070"/>
+          <w:sz w:val="18"/>
+        </w:rPr>
+        <w:t>Figure 6-3  The trend chart window (this folder has no numeric parameters yet; picking one shows a line/bar chart)</w:t>
+      </w:r>
+    </w:p>
+    <w:p/>
+    <w:p>
+      <w:pPr>
+        <w:pStyle w:val="ListNumber"/>
+        <w:ind w:left="360"/>
+      </w:pPr>
+      <w:r>
+        <w:t>Like the document viewer, the chart window can be dragged, resized by its edges, or popped out into its own window; the axis ranges can also be set manually instead of relying on auto-scaling.</w:t>
+      </w:r>
+    </w:p>
+    <w:p>
+      <w:pPr>
+        <w:pStyle w:val="ListNumber"/>
+        <w:ind w:left="360"/>
+      </w:pPr>
+      <w:r>
+        <w:t>Happy with a particular parameter's chart? Click Save Snapshot - DMS records that parameter's current total/latest value into an “[X] History.xlsx” document; save a few snapshots over time and you get a chart of how the value has changed.</w:t>
+      </w:r>
+    </w:p>
+    <w:p>
+      <w:pPr>
+        <w:ind w:left="576" w:right="576"/>
+        <w:shd w:val="clear" w:color="auto" w:fill="E6F4EA"/>
+      </w:pPr>
+      <w:r>
+        <w:rPr>
+          <w:b/>
+          <w:color w:val="056F00"/>
+        </w:rPr>
+        <w:t xml:space="preserve">Tip: </w:t>
+      </w:r>
+      <w:r>
+        <w:rPr>
+          <w:color w:val="333333"/>
+        </w:rPr>
         <w:t>Typical use: click Save Snapshot on a “Bank Account” folder's balance parameter at the end of each month; after a few months you'll have a chart of the balance trend. The same pattern works for blood pressure, body weight, or periodic inventory counts.</w:t>
       </w:r>
     </w:p>
@@ -5369,7 +5634,7 @@
         <w:drawing>
           <wp:inline xmlns:a="http://schemas.openxmlformats.org/drawingml/2006/main" xmlns:pic="http://schemas.openxmlformats.org/drawingml/2006/picture">
             <wp:extent cx="5486400" cy="2936720"/>
-            <wp:docPr id="22" name="Picture 22"/>
+            <wp:docPr id="23" name="Picture 23"/>
             <wp:cNvGraphicFramePr>
               <a:graphicFrameLocks noChangeAspect="1"/>
             </wp:cNvGraphicFramePr>
@@ -5381,7 +5646,7 @@
                     <pic:cNvPicPr/>
                   </pic:nvPicPr>
                   <pic:blipFill>
-                    <a:blip r:embed="rId30"/>
+                    <a:blip r:embed="rId31"/>
                     <a:stretch>
                       <a:fillRect/>
                     </a:stretch>
@@ -5594,7 +5859,7 @@
         <w:drawing>
           <wp:inline xmlns:a="http://schemas.openxmlformats.org/drawingml/2006/main" xmlns:pic="http://schemas.openxmlformats.org/drawingml/2006/picture">
             <wp:extent cx="5486400" cy="2936720"/>
-            <wp:docPr id="23" name="Picture 23"/>
+            <wp:docPr id="24" name="Picture 24"/>
             <wp:cNvGraphicFramePr>
               <a:graphicFrameLocks noChangeAspect="1"/>
             </wp:cNvGraphicFramePr>
@@ -5606,7 +5871,7 @@
                     <pic:cNvPicPr/>
                   </pic:nvPicPr>
                   <pic:blipFill>
-                    <a:blip r:embed="rId31"/>
+                    <a:blip r:embed="rId32"/>
                     <a:stretch>
                       <a:fillRect/>
                     </a:stretch>
@@ -5787,7 +6052,7 @@
         <w:drawing>
           <wp:inline xmlns:a="http://schemas.openxmlformats.org/drawingml/2006/main" xmlns:pic="http://schemas.openxmlformats.org/drawingml/2006/picture">
             <wp:extent cx="5486400" cy="3429000"/>
-            <wp:docPr id="24" name="Picture 24"/>
+            <wp:docPr id="25" name="Picture 25"/>
             <wp:cNvGraphicFramePr>
               <a:graphicFrameLocks noChangeAspect="1"/>
             </wp:cNvGraphicFramePr>
@@ -5796,184 +6061,6 @@
                 <pic:pic>
                   <pic:nvPicPr>
                     <pic:cNvPr id="0" name="07_search.png"/>
-                    <pic:cNvPicPr/>
-                  </pic:nvPicPr>
-                  <pic:blipFill>
-                    <a:blip r:embed="rId32"/>
-                    <a:stretch>
-                      <a:fillRect/>
-                    </a:stretch>
-                  </pic:blipFill>
-                  <pic:spPr>
-                    <a:xfrm>
-                      <a:off x="0" y="0"/>
-                      <a:ext cx="5486400" cy="3429000"/>
-                    </a:xfrm>
-                    <a:prstGeom prst="rect"/>
-                  </pic:spPr>
-                </pic:pic>
-              </a:graphicData>
-            </a:graphic>
-          </wp:inline>
-        </w:drawing>
-      </w:r>
-    </w:p>
-    <w:p>
-      <w:pPr>
-        <w:jc w:val="center"/>
-      </w:pPr>
-      <w:r>
-        <w:rPr>
-          <w:i/>
-          <w:color w:val="707070"/>
-          <w:sz w:val="18"/>
-        </w:rPr>
-        <w:t>Figure 7-1  Example search results</w:t>
-      </w:r>
-    </w:p>
-    <w:p/>
-    <w:p>
-      <w:pPr>
-        <w:pStyle w:val="Heading2"/>
-      </w:pPr>
-      <w:r>
-        <w:rPr>
-          <w:color w:val="1D4E89"/>
-        </w:rPr>
-        <w:t>7.3  Opening and Jumping to Results</w:t>
-      </w:r>
-    </w:p>
-    <w:p>
-      <w:pPr>
-        <w:pStyle w:val="ListBullet"/>
-        <w:ind w:left="360"/>
-      </w:pPr>
-      <w:r>
-        <w:t>Click a result card to open the Document Viewer for that document.</w:t>
-      </w:r>
-    </w:p>
-    <w:p>
-      <w:pPr>
-        <w:pStyle w:val="ListBullet"/>
-        <w:ind w:left="360"/>
-      </w:pPr>
-      <w:r>
-        <w:t>Double-click a result card to switch to the Tree tab and jump straight to the folder containing that document.</w:t>
-      </w:r>
-    </w:p>
-    <w:p>
-      <w:r>
-        <w:br w:type="page"/>
-      </w:r>
-    </w:p>
-    <w:p>
-      <w:pPr>
-        <w:pStyle w:val="Heading1"/>
-      </w:pPr>
-      <w:r>
-        <w:rPr>
-          <w:color w:val="1E40AF"/>
-        </w:rPr>
-        <w:t>8  Generating a Databook (PDF / Word)</w:t>
-      </w:r>
-    </w:p>
-    <w:p>
-      <w:r>
-        <w:t>The Databook feature combines selected documents into a single, professional document with a cover page, table of contents, section headers, and page numbers. Two modes are available: manually checking documents to build a PDF (8.1-8.2), or automatically generating an editable Word document from a folder's structure (8.3).</w:t>
-      </w:r>
-    </w:p>
-    <w:p>
-      <w:pPr>
-        <w:pStyle w:val="Heading2"/>
-      </w:pPr>
-      <w:r>
-        <w:rPr>
-          <w:color w:val="1D4E89"/>
-        </w:rPr>
-        <w:t>8.1  Selecting Documents (PDF mode)</w:t>
-      </w:r>
-    </w:p>
-    <w:p>
-      <w:pPr>
-        <w:pStyle w:val="ListNumber"/>
-        <w:ind w:left="360"/>
-      </w:pPr>
-      <w:r>
-        <w:t>Click the Databook tab in the sidebar.</w:t>
-      </w:r>
-    </w:p>
-    <w:p>
-      <w:pPr>
-        <w:pStyle w:val="ListNumber"/>
-        <w:ind w:left="360"/>
-      </w:pPr>
-      <w:r>
-        <w:t>The tree is shown with a checkbox next to each folder, plus a Select All link.</w:t>
-      </w:r>
-    </w:p>
-    <w:p>
-      <w:pPr>
-        <w:pStyle w:val="ListNumber"/>
-        <w:ind w:left="360"/>
-      </w:pPr>
-      <w:r>
-        <w:t>Check individual documents, or use the shortcuts:</w:t>
-      </w:r>
-    </w:p>
-    <w:p>
-      <w:pPr>
-        <w:pStyle w:val="ListBullet"/>
-        <w:ind w:left="360"/>
-      </w:pPr>
-      <w:r>
-        <w:t>Click Select All next to a folder to select every document in that folder (optionally including sub-folders).</w:t>
-      </w:r>
-    </w:p>
-    <w:p>
-      <w:pPr>
-        <w:pStyle w:val="ListBullet"/>
-        <w:ind w:left="360"/>
-      </w:pPr>
-      <w:r>
-        <w:t>Click Clear to deselect everything.</w:t>
-      </w:r>
-    </w:p>
-    <w:p>
-      <w:pPr>
-        <w:ind w:left="576" w:right="576"/>
-        <w:shd w:val="clear" w:color="auto" w:fill="E6F4EA"/>
-      </w:pPr>
-      <w:r>
-        <w:rPr>
-          <w:b/>
-          <w:color w:val="056F00"/>
-        </w:rPr>
-        <w:t xml:space="preserve">Tip: </w:t>
-      </w:r>
-      <w:r>
-        <w:rPr>
-          <w:color w:val="333333"/>
-        </w:rPr>
-        <w:t>Your selection is saved automatically - close and reopen DMS and it will still be there.</w:t>
-      </w:r>
-    </w:p>
-    <w:p>
-      <w:pPr>
-        <w:jc w:val="center"/>
-      </w:pPr>
-      <w:r>
-        <w:drawing>
-          <wp:inline xmlns:a="http://schemas.openxmlformats.org/drawingml/2006/main" xmlns:pic="http://schemas.openxmlformats.org/drawingml/2006/picture">
-            <wp:extent cx="5486400" cy="3429000"/>
-            <wp:docPr id="25" name="Picture 25"/>
-            <wp:cNvGraphicFramePr>
-              <a:graphicFrameLocks noChangeAspect="1"/>
-            </wp:cNvGraphicFramePr>
-            <a:graphic>
-              <a:graphicData uri="http://schemas.openxmlformats.org/drawingml/2006/picture">
-                <pic:pic>
-                  <pic:nvPicPr>
-                    <pic:cNvPr id="0" name="08_databook_tab.png"/>
                     <pic:cNvPicPr/>
                   </pic:nvPicPr>
                   <pic:blipFill>
@@ -6006,7 +6093,7 @@
           <w:color w:val="707070"/>
           <w:sz w:val="18"/>
         </w:rPr>
-        <w:t>Figure 8-1  The Databook tab: checking documents to include</w:t>
+        <w:t>Figure 7-1  Example search results</w:t>
       </w:r>
     </w:p>
     <w:p/>
@@ -6018,7 +6105,57 @@
         <w:rPr>
           <w:color w:val="1D4E89"/>
         </w:rPr>
-        <w:t>8.2  Generating the PDF</w:t>
+        <w:t>7.3  Opening and Jumping to Results</w:t>
+      </w:r>
+    </w:p>
+    <w:p>
+      <w:pPr>
+        <w:pStyle w:val="ListBullet"/>
+        <w:ind w:left="360"/>
+      </w:pPr>
+      <w:r>
+        <w:t>Click a result card to open the Document Viewer for that document.</w:t>
+      </w:r>
+    </w:p>
+    <w:p>
+      <w:pPr>
+        <w:pStyle w:val="ListBullet"/>
+        <w:ind w:left="360"/>
+      </w:pPr>
+      <w:r>
+        <w:t>Double-click a result card to switch to the Tree tab and jump straight to the folder containing that document.</w:t>
+      </w:r>
+    </w:p>
+    <w:p>
+      <w:r>
+        <w:br w:type="page"/>
+      </w:r>
+    </w:p>
+    <w:p>
+      <w:pPr>
+        <w:pStyle w:val="Heading1"/>
+      </w:pPr>
+      <w:r>
+        <w:rPr>
+          <w:color w:val="1E40AF"/>
+        </w:rPr>
+        <w:t>8  Generating a Databook (PDF / Word)</w:t>
+      </w:r>
+    </w:p>
+    <w:p>
+      <w:r>
+        <w:t>The Databook feature combines selected documents into a single, professional document with a cover page, table of contents, section headers, and page numbers. Two modes are available: manually checking documents to build a PDF (8.1-8.2), or automatically generating an editable Word document from a folder's structure (8.3).</w:t>
+      </w:r>
+    </w:p>
+    <w:p>
+      <w:pPr>
+        <w:pStyle w:val="Heading2"/>
+      </w:pPr>
+      <w:r>
+        <w:rPr>
+          <w:color w:val="1D4E89"/>
+        </w:rPr>
+        <w:t>8.1  Selecting Documents (PDF mode)</w:t>
       </w:r>
     </w:p>
     <w:p>
@@ -6027,7 +6164,7 @@
         <w:ind w:left="360"/>
       </w:pPr>
       <w:r>
-        <w:t>After selecting documents, click Generate Databook.</w:t>
+        <w:t>Click the Databook tab in the sidebar.</w:t>
       </w:r>
     </w:p>
     <w:p>
@@ -6036,7 +6173,7 @@
         <w:ind w:left="360"/>
       </w:pPr>
       <w:r>
-        <w:t>In the dialog, enter a Title (the main heading on the cover page) and a Subtitle (a secondary line, e.g. project name or revision number).</w:t>
+        <w:t>The tree is shown with a checkbox next to each folder, plus a Select All link.</w:t>
       </w:r>
     </w:p>
     <w:p>
@@ -6045,21 +6182,44 @@
         <w:ind w:left="360"/>
       </w:pPr>
       <w:r>
-        <w:t>Click Generate and Download.</w:t>
-      </w:r>
-    </w:p>
-    <w:p>
-      <w:pPr>
-        <w:pStyle w:val="ListNumber"/>
+        <w:t>Check individual documents, or use the shortcuts:</w:t>
+      </w:r>
+    </w:p>
+    <w:p>
+      <w:pPr>
+        <w:pStyle w:val="ListBullet"/>
         <w:ind w:left="360"/>
       </w:pPr>
       <w:r>
-        <w:t>DMS generates the PDF on the server and your browser downloads it automatically.</w:t>
-      </w:r>
-    </w:p>
-    <w:p>
-      <w:r>
-        <w:t>The generated PDF includes: a cover page (title, subtitle, date), a table of contents with clickable bookmarks, section-header pages, all selected documents in tree order, and page numbers/footers throughout.</w:t>
+        <w:t>Click Select All next to a folder to select every document in that folder (optionally including sub-folders).</w:t>
+      </w:r>
+    </w:p>
+    <w:p>
+      <w:pPr>
+        <w:pStyle w:val="ListBullet"/>
+        <w:ind w:left="360"/>
+      </w:pPr>
+      <w:r>
+        <w:t>Click Clear to deselect everything.</w:t>
+      </w:r>
+    </w:p>
+    <w:p>
+      <w:pPr>
+        <w:ind w:left="576" w:right="576"/>
+        <w:shd w:val="clear" w:color="auto" w:fill="E6F4EA"/>
+      </w:pPr>
+      <w:r>
+        <w:rPr>
+          <w:b/>
+          <w:color w:val="056F00"/>
+        </w:rPr>
+        <w:t xml:space="preserve">Tip: </w:t>
+      </w:r>
+      <w:r>
+        <w:rPr>
+          <w:color w:val="333333"/>
+        </w:rPr>
+        <w:t>Your selection is saved automatically - close and reopen DMS and it will still be there.</w:t>
       </w:r>
     </w:p>
     <w:p>
@@ -6078,7 +6238,7 @@
               <a:graphicData uri="http://schemas.openxmlformats.org/drawingml/2006/picture">
                 <pic:pic>
                   <pic:nvPicPr>
-                    <pic:cNvPr id="0" name="09_databook_dialog.png"/>
+                    <pic:cNvPr id="0" name="08_databook_tab.png"/>
                     <pic:cNvPicPr/>
                   </pic:nvPicPr>
                   <pic:blipFill>
@@ -6111,6 +6271,111 @@
           <w:color w:val="707070"/>
           <w:sz w:val="18"/>
         </w:rPr>
+        <w:t>Figure 8-1  The Databook tab: checking documents to include</w:t>
+      </w:r>
+    </w:p>
+    <w:p/>
+    <w:p>
+      <w:pPr>
+        <w:pStyle w:val="Heading2"/>
+      </w:pPr>
+      <w:r>
+        <w:rPr>
+          <w:color w:val="1D4E89"/>
+        </w:rPr>
+        <w:t>8.2  Generating the PDF</w:t>
+      </w:r>
+    </w:p>
+    <w:p>
+      <w:pPr>
+        <w:pStyle w:val="ListNumber"/>
+        <w:ind w:left="360"/>
+      </w:pPr>
+      <w:r>
+        <w:t>After selecting documents, click Generate Databook.</w:t>
+      </w:r>
+    </w:p>
+    <w:p>
+      <w:pPr>
+        <w:pStyle w:val="ListNumber"/>
+        <w:ind w:left="360"/>
+      </w:pPr>
+      <w:r>
+        <w:t>In the dialog, enter a Title (the main heading on the cover page) and a Subtitle (a secondary line, e.g. project name or revision number).</w:t>
+      </w:r>
+    </w:p>
+    <w:p>
+      <w:pPr>
+        <w:pStyle w:val="ListNumber"/>
+        <w:ind w:left="360"/>
+      </w:pPr>
+      <w:r>
+        <w:t>Click Generate and Download.</w:t>
+      </w:r>
+    </w:p>
+    <w:p>
+      <w:pPr>
+        <w:pStyle w:val="ListNumber"/>
+        <w:ind w:left="360"/>
+      </w:pPr>
+      <w:r>
+        <w:t>DMS generates the PDF on the server and your browser downloads it automatically.</w:t>
+      </w:r>
+    </w:p>
+    <w:p>
+      <w:r>
+        <w:t>The generated PDF includes: a cover page (title, subtitle, date), a table of contents with clickable bookmarks, section-header pages, all selected documents in tree order, and page numbers/footers throughout.</w:t>
+      </w:r>
+    </w:p>
+    <w:p>
+      <w:pPr>
+        <w:jc w:val="center"/>
+      </w:pPr>
+      <w:r>
+        <w:drawing>
+          <wp:inline xmlns:a="http://schemas.openxmlformats.org/drawingml/2006/main" xmlns:pic="http://schemas.openxmlformats.org/drawingml/2006/picture">
+            <wp:extent cx="5486400" cy="3429000"/>
+            <wp:docPr id="27" name="Picture 27"/>
+            <wp:cNvGraphicFramePr>
+              <a:graphicFrameLocks noChangeAspect="1"/>
+            </wp:cNvGraphicFramePr>
+            <a:graphic>
+              <a:graphicData uri="http://schemas.openxmlformats.org/drawingml/2006/picture">
+                <pic:pic>
+                  <pic:nvPicPr>
+                    <pic:cNvPr id="0" name="09_databook_dialog.png"/>
+                    <pic:cNvPicPr/>
+                  </pic:nvPicPr>
+                  <pic:blipFill>
+                    <a:blip r:embed="rId35"/>
+                    <a:stretch>
+                      <a:fillRect/>
+                    </a:stretch>
+                  </pic:blipFill>
+                  <pic:spPr>
+                    <a:xfrm>
+                      <a:off x="0" y="0"/>
+                      <a:ext cx="5486400" cy="3429000"/>
+                    </a:xfrm>
+                    <a:prstGeom prst="rect"/>
+                  </pic:spPr>
+                </pic:pic>
+              </a:graphicData>
+            </a:graphic>
+          </wp:inline>
+        </w:drawing>
+      </w:r>
+    </w:p>
+    <w:p>
+      <w:pPr>
+        <w:jc w:val="center"/>
+      </w:pPr>
+      <w:r>
+        <w:rPr>
+          <w:i/>
+          <w:color w:val="707070"/>
+          <w:sz w:val="18"/>
+        </w:rPr>
         <w:t>Figure 8-2  The Generate Databook dialog</w:t>
       </w:r>
     </w:p>
@@ -6166,7 +6431,7 @@
         <w:drawing>
           <wp:inline xmlns:a="http://schemas.openxmlformats.org/drawingml/2006/main" xmlns:pic="http://schemas.openxmlformats.org/drawingml/2006/picture">
             <wp:extent cx="5486400" cy="2741275"/>
-            <wp:docPr id="27" name="Picture 27"/>
+            <wp:docPr id="28" name="Picture 28"/>
             <wp:cNvGraphicFramePr>
               <a:graphicFrameLocks noChangeAspect="1"/>
             </wp:cNvGraphicFramePr>
@@ -6178,7 +6443,7 @@
                     <pic:cNvPicPr/>
                   </pic:nvPicPr>
                   <pic:blipFill>
-                    <a:blip r:embed="rId35"/>
+                    <a:blip r:embed="rId36"/>
                     <a:stretch>
                       <a:fillRect/>
                     </a:stretch>
@@ -6326,7 +6591,7 @@
         <w:drawing>
           <wp:inline xmlns:a="http://schemas.openxmlformats.org/drawingml/2006/main" xmlns:pic="http://schemas.openxmlformats.org/drawingml/2006/picture">
             <wp:extent cx="5486400" cy="3429000"/>
-            <wp:docPr id="28" name="Picture 28"/>
+            <wp:docPr id="29" name="Picture 29"/>
             <wp:cNvGraphicFramePr>
               <a:graphicFrameLocks noChangeAspect="1"/>
             </wp:cNvGraphicFramePr>
@@ -6335,118 +6600,6 @@
                 <pic:pic>
                   <pic:nvPicPr>
                     <pic:cNvPr id="0" name="10_combine_dialog.png"/>
-                    <pic:cNvPicPr/>
-                  </pic:nvPicPr>
-                  <pic:blipFill>
-                    <a:blip r:embed="rId36"/>
-                    <a:stretch>
-                      <a:fillRect/>
-                    </a:stretch>
-                  </pic:blipFill>
-                  <pic:spPr>
-                    <a:xfrm>
-                      <a:off x="0" y="0"/>
-                      <a:ext cx="5486400" cy="3429000"/>
-                    </a:xfrm>
-                    <a:prstGeom prst="rect"/>
-                  </pic:spPr>
-                </pic:pic>
-              </a:graphicData>
-            </a:graphic>
-          </wp:inline>
-        </w:drawing>
-      </w:r>
-    </w:p>
-    <w:p>
-      <w:pPr>
-        <w:jc w:val="center"/>
-      </w:pPr>
-      <w:r>
-        <w:rPr>
-          <w:i/>
-          <w:color w:val="707070"/>
-          <w:sz w:val="18"/>
-        </w:rPr>
-        <w:t>Figure 9-1  The merge-documents dialog</w:t>
-      </w:r>
-    </w:p>
-    <w:p/>
-    <w:p>
-      <w:r>
-        <w:br w:type="page"/>
-      </w:r>
-    </w:p>
-    <w:p>
-      <w:pPr>
-        <w:pStyle w:val="Heading1"/>
-      </w:pPr>
-      <w:r>
-        <w:rPr>
-          <w:color w:val="1E40AF"/>
-        </w:rPr>
-        <w:t>10  Face Recognition</w:t>
-      </w:r>
-    </w:p>
-    <w:p>
-      <w:r>
-        <w:t>The optional face-recognition component lets you tag faces in your photos and later browse them by person, with DMS automatically matching new photos of people it already knows.</w:t>
-      </w:r>
-    </w:p>
-    <w:p>
-      <w:pPr>
-        <w:pStyle w:val="Heading2"/>
-      </w:pPr>
-      <w:r>
-        <w:rPr>
-          <w:color w:val="1D4E89"/>
-        </w:rPr>
-        <w:t>10.1  Installing the Face Recognition Component</w:t>
-      </w:r>
-    </w:p>
-    <w:p>
-      <w:pPr>
-        <w:pStyle w:val="ListNumber"/>
-        <w:ind w:left="360"/>
-      </w:pPr>
-      <w:r>
-        <w:t>Click the Faces tab in the sidebar.</w:t>
-      </w:r>
-    </w:p>
-    <w:p>
-      <w:pPr>
-        <w:pStyle w:val="ListNumber"/>
-        <w:ind w:left="360"/>
-      </w:pPr>
-      <w:r>
-        <w:t>If the component (deepface) isn't installed yet, a prompt explains this and offers an Auto-install deepface button.</w:t>
-      </w:r>
-    </w:p>
-    <w:p>
-      <w:pPr>
-        <w:pStyle w:val="ListNumber"/>
-        <w:ind w:left="360"/>
-      </w:pPr>
-      <w:r>
-        <w:t>Click it and wait - this downloads TensorFlow and related libraries in the background and can take several minutes on a slow connection; you can keep using the rest of the app meanwhile.</w:t>
-      </w:r>
-    </w:p>
-    <w:p>
-      <w:pPr>
-        <w:jc w:val="center"/>
-      </w:pPr>
-      <w:r>
-        <w:drawing>
-          <wp:inline xmlns:a="http://schemas.openxmlformats.org/drawingml/2006/main" xmlns:pic="http://schemas.openxmlformats.org/drawingml/2006/picture">
-            <wp:extent cx="5486400" cy="3429000"/>
-            <wp:docPr id="29" name="Picture 29"/>
-            <wp:cNvGraphicFramePr>
-              <a:graphicFrameLocks noChangeAspect="1"/>
-            </wp:cNvGraphicFramePr>
-            <a:graphic>
-              <a:graphicData uri="http://schemas.openxmlformats.org/drawingml/2006/picture">
-                <pic:pic>
-                  <pic:nvPicPr>
-                    <pic:cNvPr id="0" name="16_face_tab.png"/>
                     <pic:cNvPicPr/>
                   </pic:nvPicPr>
                   <pic:blipFill>
@@ -6479,27 +6632,29 @@
           <w:color w:val="707070"/>
           <w:sz w:val="18"/>
         </w:rPr>
-        <w:t>Figure 10-1  The Faces tab (shown here with the component already installed, hence the empty state; before installing, you'd instead see a prompt with an Auto-install deepface button)</w:t>
+        <w:t>Figure 9-1  The merge-documents dialog</w:t>
       </w:r>
     </w:p>
     <w:p/>
     <w:p>
-      <w:pPr>
-        <w:ind w:left="576" w:right="576"/>
-        <w:shd w:val="clear" w:color="auto" w:fill="E6F4EA"/>
+      <w:r>
+        <w:br w:type="page"/>
+      </w:r>
+    </w:p>
+    <w:p>
+      <w:pPr>
+        <w:pStyle w:val="Heading1"/>
       </w:pPr>
       <w:r>
         <w:rPr>
-          <w:b/>
-          <w:color w:val="056F00"/>
+          <w:color w:val="1E40AF"/>
         </w:rPr>
-        <w:t xml:space="preserve">Tip: </w:t>
-      </w:r>
-      <w:r>
-        <w:rPr>
-          <w:color w:val="333333"/>
-        </w:rPr>
-        <w:t>If auto-install keeps failing (more common on Windows), download the Face Recognition Install Guide (.txt) - Windows from the Project menu's Downloads group for manual, step-by-step instructions for installing Python 3.12 and deepface.</w:t>
+        <w:t>10  Face Recognition</w:t>
+      </w:r>
+    </w:p>
+    <w:p>
+      <w:r>
+        <w:t>The optional face-recognition component lets you tag faces in your photos and later browse them by person, with DMS automatically matching new photos of people it already knows.</w:t>
       </w:r>
     </w:p>
     <w:p>
@@ -6510,7 +6665,7 @@
         <w:rPr>
           <w:color w:val="1D4E89"/>
         </w:rPr>
-        <w:t>10.2  Tagging Faces</w:t>
+        <w:t>10.1  Installing the Face Recognition Component</w:t>
       </w:r>
     </w:p>
     <w:p>
@@ -6519,7 +6674,7 @@
         <w:ind w:left="360"/>
       </w:pPr>
       <w:r>
-        <w:t>From a folder, click Tag Faces to enter selection mode.</w:t>
+        <w:t>Click the Faces tab in the sidebar.</w:t>
       </w:r>
     </w:p>
     <w:p>
@@ -6528,7 +6683,16 @@
         <w:ind w:left="360"/>
       </w:pPr>
       <w:r>
-        <w:t>Check the photos you want DMS to scan for faces.</w:t>
+        <w:t>If the component (deepface) isn't installed yet, a prompt explains this and offers an Auto-install deepface button.</w:t>
+      </w:r>
+    </w:p>
+    <w:p>
+      <w:pPr>
+        <w:pStyle w:val="ListNumber"/>
+        <w:ind w:left="360"/>
+      </w:pPr>
+      <w:r>
+        <w:t>Click it and wait - this downloads TensorFlow and related libraries in the background and can take several minutes on a slow connection; you can keep using the rest of the app meanwhile.</w:t>
       </w:r>
     </w:p>
     <w:p>
@@ -6547,7 +6711,7 @@
               <a:graphicData uri="http://schemas.openxmlformats.org/drawingml/2006/picture">
                 <pic:pic>
                   <pic:nvPicPr>
-                    <pic:cNvPr id="0" name="21_face_select_mode.png"/>
+                    <pic:cNvPr id="0" name="16_face_tab.png"/>
                     <pic:cNvPicPr/>
                   </pic:nvPicPr>
                   <pic:blipFill>
@@ -6580,17 +6744,56 @@
           <w:color w:val="707070"/>
           <w:sz w:val="18"/>
         </w:rPr>
-        <w:t>Figure 10-2  Selection mode: photos checked for face detection</w:t>
+        <w:t>Figure 10-1  The Faces tab (shown here with the component already installed, hence the empty state; before installing, you'd instead see a prompt with an Auto-install deepface button)</w:t>
       </w:r>
     </w:p>
     <w:p/>
+    <w:p>
+      <w:pPr>
+        <w:ind w:left="576" w:right="576"/>
+        <w:shd w:val="clear" w:color="auto" w:fill="E6F4EA"/>
+      </w:pPr>
+      <w:r>
+        <w:rPr>
+          <w:b/>
+          <w:color w:val="056F00"/>
+        </w:rPr>
+        <w:t xml:space="preserve">Tip: </w:t>
+      </w:r>
+      <w:r>
+        <w:rPr>
+          <w:color w:val="333333"/>
+        </w:rPr>
+        <w:t>If auto-install keeps failing (more common on Windows), download the Face Recognition Install Guide (.txt) - Windows from the Project menu's Downloads group for manual, step-by-step instructions for installing Python 3.12 and deepface.</w:t>
+      </w:r>
+    </w:p>
+    <w:p>
+      <w:pPr>
+        <w:pStyle w:val="Heading2"/>
+      </w:pPr>
+      <w:r>
+        <w:rPr>
+          <w:color w:val="1D4E89"/>
+        </w:rPr>
+        <w:t>10.2  Tagging Faces</w:t>
+      </w:r>
+    </w:p>
     <w:p>
       <w:pPr>
         <w:pStyle w:val="ListNumber"/>
         <w:ind w:left="360"/>
       </w:pPr>
       <w:r>
-        <w:t>Click to run detection; DMS finds faces in the checked photos.</w:t>
+        <w:t>From a folder, click Tag Faces to enter selection mode.</w:t>
+      </w:r>
+    </w:p>
+    <w:p>
+      <w:pPr>
+        <w:pStyle w:val="ListNumber"/>
+        <w:ind w:left="360"/>
+      </w:pPr>
+      <w:r>
+        <w:t>Check the photos you want DMS to scan for faces.</w:t>
       </w:r>
     </w:p>
     <w:p>
@@ -6609,7 +6812,7 @@
               <a:graphicData uri="http://schemas.openxmlformats.org/drawingml/2006/picture">
                 <pic:pic>
                   <pic:nvPicPr>
-                    <pic:cNvPr id="0" name="22_face_tagging_dialog.png"/>
+                    <pic:cNvPr id="0" name="21_face_select_mode.png"/>
                     <pic:cNvPicPr/>
                   </pic:nvPicPr>
                   <pic:blipFill>
@@ -6642,7 +6845,7 @@
           <w:color w:val="707070"/>
           <w:sz w:val="18"/>
         </w:rPr>
-        <w:t>Figure 10-3  Face detection in progress</w:t>
+        <w:t>Figure 10-2  Selection mode: photos checked for face detection</w:t>
       </w:r>
     </w:p>
     <w:p/>
@@ -6652,345 +6855,7 @@
         <w:ind w:left="360"/>
       </w:pPr>
       <w:r>
-        <w:t>For each detected face, type a person's name (or pick an existing one) to tag it.</w:t>
-      </w:r>
-    </w:p>
-    <w:p>
-      <w:pPr>
-        <w:pStyle w:val="Heading2"/>
-      </w:pPr>
-      <w:r>
-        <w:rPr>
-          <w:color w:val="1D4E89"/>
-        </w:rPr>
-        <w:t>10.3  Browsing by Person / Auto-Matching</w:t>
-      </w:r>
-    </w:p>
-    <w:p>
-      <w:r>
-        <w:t>Once some faces are tagged, the Faces tab lets you browse photos grouped by person. New photos you tag later are automatically compared against known faces and suggested matches, so you don't have to name every single photo of the same person from scratch.</w:t>
-      </w:r>
-    </w:p>
-    <w:p>
-      <w:r>
-        <w:br w:type="page"/>
-      </w:r>
-    </w:p>
-    <w:p>
-      <w:pPr>
-        <w:pStyle w:val="Heading1"/>
-      </w:pPr>
-      <w:r>
-        <w:rPr>
-          <w:color w:val="1E40AF"/>
-        </w:rPr>
-        <w:t>11  Remote and Mobile Upload</w:t>
-      </w:r>
-    </w:p>
-    <w:p>
-      <w:pPr>
-        <w:pStyle w:val="Heading2"/>
-      </w:pPr>
-      <w:r>
-        <w:rPr>
-          <w:color w:val="1D4E89"/>
-        </w:rPr>
-        <w:t>11.1  Sending a Single Document to a Phone</w:t>
-      </w:r>
-    </w:p>
-    <w:p>
-      <w:r>
-        <w:t>Click the “send to phone” icon on any document card to generate a link that opens the document directly on a phone's browser - share it by SMS/iMessage, or copy the link and send it any way you like.</w:t>
-      </w:r>
-    </w:p>
-    <w:p>
-      <w:pPr>
-        <w:pStyle w:val="Heading2"/>
-      </w:pPr>
-      <w:r>
-        <w:rPr>
-          <w:color w:val="1D4E89"/>
-        </w:rPr>
-        <w:t>11.2  Remote Upload (QR-Code Batch Intake)</w:t>
-      </w:r>
-    </w:p>
-    <w:p>
-      <w:r>
-        <w:t>To receive a batch of photos or files from someone else's phone (or your own) without emailing them one by one, use Remote Upload from the desktop launcher: it shows a QR code that, once scanned, opens an upload page on the phone's browser, and anything uploaded there lands directly in the folder you chose on the desktop.</w:t>
-      </w:r>
-    </w:p>
-    <w:p>
-      <w:pPr>
-        <w:ind w:left="576" w:right="576"/>
-        <w:shd w:val="clear" w:color="auto" w:fill="FFF8E1"/>
-      </w:pPr>
-      <w:r>
-        <w:rPr>
-          <w:b/>
-          <w:color w:val="924E00"/>
-        </w:rPr>
-        <w:t xml:space="preserve">Note: </w:t>
-      </w:r>
-      <w:r>
-        <w:t>Remote upload works over your local network by default; sending or receiving across the open internet requires the tunnel/ngrok setup described alongside that feature in the app, which is outside the scope of this manual section.</w:t>
-      </w:r>
-    </w:p>
-    <w:p>
-      <w:r>
-        <w:br w:type="page"/>
-      </w:r>
-    </w:p>
-    <w:p>
-      <w:pPr>
-        <w:pStyle w:val="Heading1"/>
-      </w:pPr>
-      <w:r>
-        <w:rPr>
-          <w:color w:val="1E40AF"/>
-        </w:rPr>
-        <w:t>12  Project Management</w:t>
-      </w:r>
-    </w:p>
-    <w:p>
-      <w:r>
-        <w:t>The Project menu (in the header bar) provides tools for backing up, restoring, merging, and importing data.</w:t>
-      </w:r>
-    </w:p>
-    <w:p>
-      <w:pPr>
-        <w:ind w:left="576" w:right="576"/>
-        <w:shd w:val="clear" w:color="auto" w:fill="FFF8E1"/>
-      </w:pPr>
-      <w:r>
-        <w:rPr>
-          <w:b/>
-          <w:color w:val="924E00"/>
-        </w:rPr>
-        <w:t xml:space="preserve">Note: </w:t>
-      </w:r>
-      <w:r>
-        <w:t>If you've set an access password (Chapter 14), all three export types (METADATA / COMP / PART) show an “Automatically encrypted with the project password” note in the menu - the exported .dms file is encrypted with that password, and the same password is needed to decrypt it when importing on another machine. Without a password set, exported backups are not encrypted.</w:t>
-      </w:r>
-    </w:p>
-    <w:p>
-      <w:pPr>
-        <w:pStyle w:val="Heading2"/>
-      </w:pPr>
-      <w:r>
-        <w:rPr>
-          <w:color w:val="1D4E89"/>
-        </w:rPr>
-        <w:t>12.1  Export Index Backup (METADATA)</w:t>
-      </w:r>
-    </w:p>
-    <w:p>
-      <w:r>
-        <w:t>Backs up only the folder-tree structure and metadata (not the actual document files) as a .dms file, named with a METADATA- prefix. Much smaller and faster than a full backup - useful for structural snapshots.</w:t>
-      </w:r>
-    </w:p>
-    <w:p>
-      <w:pPr>
-        <w:pStyle w:val="Heading2"/>
-      </w:pPr>
-      <w:r>
-        <w:rPr>
-          <w:color w:val="1D4E89"/>
-        </w:rPr>
-        <w:t>12.2  Export Full Backup (COMP)</w:t>
-      </w:r>
-    </w:p>
-    <w:p>
-      <w:r>
-        <w:t>Backs up the entire folder tree and every document file, packaged as a .dms file with a COMP- prefix. This is a complete, self-contained backup of the project.</w:t>
-      </w:r>
-    </w:p>
-    <w:p>
-      <w:pPr>
-        <w:ind w:left="576" w:right="576"/>
-        <w:shd w:val="clear" w:color="auto" w:fill="E6F4EA"/>
-      </w:pPr>
-      <w:r>
-        <w:rPr>
-          <w:b/>
-          <w:color w:val="056F00"/>
-        </w:rPr>
-        <w:t xml:space="preserve">Tip: </w:t>
-      </w:r>
-      <w:r>
-        <w:rPr>
-          <w:color w:val="333333"/>
-        </w:rPr>
-        <w:t>Save this file to a USB drive or cloud storage as a regular backup.</w:t>
-      </w:r>
-    </w:p>
-    <w:p>
-      <w:pPr>
-        <w:pStyle w:val="Heading2"/>
-      </w:pPr>
-      <w:r>
-        <w:rPr>
-          <w:color w:val="1D4E89"/>
-        </w:rPr>
-        <w:t>12.3  Export Selected Folders (PART)</w:t>
-      </w:r>
-    </w:p>
-    <w:p>
-      <w:r>
-        <w:t>Lets you pick specific folders to export (with their files), producing a .dms file with a PART- prefix - useful for sharing or archiving just part of a project.</w:t>
-      </w:r>
-    </w:p>
-    <w:p>
-      <w:pPr>
-        <w:pStyle w:val="Heading2"/>
-      </w:pPr>
-      <w:r>
-        <w:rPr>
-          <w:color w:val="1D4E89"/>
-        </w:rPr>
-        <w:t>12.4  Backup Retention Rules</w:t>
-      </w:r>
-    </w:p>
-    <w:p>
-      <w:r>
-        <w:t>The project keeps the 10 most recent .dms backups in the project's root folder; older ones are automatically moved into a “Not Shown in The Tree” archive folder at the root of the storage directory (not to be confused with the similarly named “Not Show in Tree” node inside the document tree from section 3.2, which holds soft-deleted documents instead).</w:t>
-      </w:r>
-    </w:p>
-    <w:p>
-      <w:pPr>
-        <w:pStyle w:val="Heading2"/>
-      </w:pPr>
-      <w:r>
-        <w:rPr>
-          <w:color w:val="1D4E89"/>
-        </w:rPr>
-        <w:t>12.5  Import a Project (.dms)</w:t>
-      </w:r>
-    </w:p>
-    <w:p>
-      <w:pPr>
-        <w:pStyle w:val="ListNumber"/>
-        <w:ind w:left="360"/>
-      </w:pPr>
-      <w:r>
-        <w:t>Click Project, then Import Project (.dms) and select the file.</w:t>
-      </w:r>
-    </w:p>
-    <w:p>
-      <w:pPr>
-        <w:pStyle w:val="ListNumber"/>
-        <w:ind w:left="360"/>
-      </w:pPr>
-      <w:r>
-        <w:t>Choose a destination folder for the import (a new, empty folder is recommended).</w:t>
-      </w:r>
-    </w:p>
-    <w:p>
-      <w:pPr>
-        <w:pStyle w:val="ListNumber"/>
-        <w:ind w:left="360"/>
-      </w:pPr>
-      <w:r>
-        <w:t>Click Import and Switch.</w:t>
-      </w:r>
-    </w:p>
-    <w:p>
-      <w:pPr>
-        <w:pStyle w:val="ListNumber"/>
-        <w:ind w:left="360"/>
-      </w:pPr>
-      <w:r>
-        <w:t>DMS extracts the files and rebuilds the tree structure, and switches the active project to it.</w:t>
-      </w:r>
-    </w:p>
-    <w:p>
-      <w:pPr>
-        <w:ind w:left="576" w:right="576"/>
-        <w:shd w:val="clear" w:color="auto" w:fill="FFF8E1"/>
-      </w:pPr>
-      <w:r>
-        <w:rPr>
-          <w:b/>
-          <w:color w:val="924E00"/>
-        </w:rPr>
-        <w:t xml:space="preserve">Note: </w:t>
-      </w:r>
-      <w:r>
-        <w:t>Importing only restores the folder-tree structure; it never deletes files already on disk.</w:t>
-      </w:r>
-    </w:p>
-    <w:p>
-      <w:pPr>
-        <w:pStyle w:val="Heading2"/>
-      </w:pPr>
-      <w:r>
-        <w:rPr>
-          <w:color w:val="1D4E89"/>
-        </w:rPr>
-        <w:t>12.6  CSV Export</w:t>
-      </w:r>
-    </w:p>
-    <w:p>
-      <w:r>
-        <w:t>Click Project, then Export Metadata (CSV) to download a spreadsheet with one row per document, including document ID, name, size, upload date, and metadata fields. Open it in Excel or Google Sheets for analysis or sharing.</w:t>
-      </w:r>
-    </w:p>
-    <w:p>
-      <w:pPr>
-        <w:pStyle w:val="Heading2"/>
-      </w:pPr>
-      <w:r>
-        <w:rPr>
-          <w:color w:val="1D4E89"/>
-        </w:rPr>
-        <w:t>12.7  Batch ZIP Import</w:t>
-      </w:r>
-    </w:p>
-    <w:p>
-      <w:r>
-        <w:t>Upload many files at once from a ZIP archive and have DMS automatically sort them into matching folders by filename prefix. Folders referenced by a filename must already exist in the tree; documents with an unrecognized folder name are left unlinked.</w:t>
-      </w:r>
-    </w:p>
-    <w:p>
-      <w:pPr>
-        <w:pStyle w:val="Heading2"/>
-      </w:pPr>
-      <w:r>
-        <w:rPr>
-          <w:color w:val="1D4E89"/>
-        </w:rPr>
-        <w:t>12.8  Hierarchy Import (with auto de-duplication)</w:t>
-      </w:r>
-    </w:p>
-    <w:p>
-      <w:r>
-        <w:t>Builds a folder tree quickly from a plain text file.</w:t>
-      </w:r>
-    </w:p>
-    <w:p>
-      <w:pPr>
-        <w:pStyle w:val="ListNumber"/>
-        <w:ind w:left="360"/>
-      </w:pPr>
-      <w:r>
-        <w:t>Prepare a text file with 2-3 comma-separated columns per line: folder name, parent folder name, description (optional). The first line is the root folder, with the parent-folder column omitted for it.</w:t>
-      </w:r>
-    </w:p>
-    <w:p>
-      <w:pPr>
-        <w:pStyle w:val="ListNumber"/>
-        <w:ind w:left="360"/>
-      </w:pPr>
-      <w:r>
-        <w:t>Click Project, then Create Folder Tree from Hierarchy, and upload (or paste) the text.</w:t>
-      </w:r>
-    </w:p>
-    <w:p>
-      <w:pPr>
-        <w:pStyle w:val="ListNumber"/>
-        <w:ind w:left="360"/>
-      </w:pPr>
-      <w:r>
-        <w:t>DMS validates the structure and shows a preview, including any errors.</w:t>
+        <w:t>Click to run detection; DMS finds faces in the checked photos.</w:t>
       </w:r>
     </w:p>
     <w:p>
@@ -7009,7 +6874,7 @@
               <a:graphicData uri="http://schemas.openxmlformats.org/drawingml/2006/picture">
                 <pic:pic>
                   <pic:nvPicPr>
-                    <pic:cNvPr id="0" name="12_hierarchy_import_empty.png"/>
+                    <pic:cNvPr id="0" name="22_face_tagging_dialog.png"/>
                     <pic:cNvPicPr/>
                   </pic:nvPicPr>
                   <pic:blipFill>
@@ -7042,10 +6907,614 @@
           <w:color w:val="707070"/>
           <w:sz w:val="18"/>
         </w:rPr>
-        <w:t>Figure 12-1  The hierarchy import dialog (initial state)</w:t>
+        <w:t>Figure 10-3  Face detection in progress</w:t>
       </w:r>
     </w:p>
     <w:p/>
+    <w:p>
+      <w:pPr>
+        <w:pStyle w:val="ListNumber"/>
+        <w:ind w:left="360"/>
+      </w:pPr>
+      <w:r>
+        <w:t>For each detected face, type a person's name (or pick an existing one) to tag it.</w:t>
+      </w:r>
+    </w:p>
+    <w:p>
+      <w:pPr>
+        <w:pStyle w:val="Heading2"/>
+      </w:pPr>
+      <w:r>
+        <w:rPr>
+          <w:color w:val="1D4E89"/>
+        </w:rPr>
+        <w:t>10.3  Browsing by Person / Auto-Matching</w:t>
+      </w:r>
+    </w:p>
+    <w:p>
+      <w:r>
+        <w:t>Once some faces are tagged, the Faces tab lets you browse photos grouped by person. New photos you tag later are automatically compared against known faces and suggested matches, so you don't have to name every single photo of the same person from scratch.</w:t>
+      </w:r>
+    </w:p>
+    <w:p>
+      <w:r>
+        <w:br w:type="page"/>
+      </w:r>
+    </w:p>
+    <w:p>
+      <w:pPr>
+        <w:pStyle w:val="Heading1"/>
+      </w:pPr>
+      <w:r>
+        <w:rPr>
+          <w:color w:val="1E40AF"/>
+        </w:rPr>
+        <w:t>11  Remote and Mobile Upload</w:t>
+      </w:r>
+    </w:p>
+    <w:p>
+      <w:pPr>
+        <w:pStyle w:val="Heading2"/>
+      </w:pPr>
+      <w:r>
+        <w:rPr>
+          <w:color w:val="1D4E89"/>
+        </w:rPr>
+        <w:t>11.1  Sending a Single Document to a Phone</w:t>
+      </w:r>
+    </w:p>
+    <w:p>
+      <w:r>
+        <w:t>Click the “send to phone” icon on any document card to generate a link that opens the document directly on a phone's browser - share it by SMS/iMessage, or copy the link and send it any way you like.</w:t>
+      </w:r>
+    </w:p>
+    <w:p>
+      <w:pPr>
+        <w:pStyle w:val="Heading2"/>
+      </w:pPr>
+      <w:r>
+        <w:rPr>
+          <w:color w:val="1D4E89"/>
+        </w:rPr>
+        <w:t>11.2  Remote Upload (QR-Code Batch Intake)</w:t>
+      </w:r>
+    </w:p>
+    <w:p>
+      <w:r>
+        <w:t>To receive a batch of photos or files from someone else's phone (or your own) without emailing them one by one, use Remote Upload from the desktop launcher: it shows a QR code that, once scanned, opens an upload page on the phone's browser, and anything uploaded there lands directly in the folder you chose on the desktop.</w:t>
+      </w:r>
+    </w:p>
+    <w:p>
+      <w:pPr>
+        <w:ind w:left="576" w:right="576"/>
+        <w:shd w:val="clear" w:color="auto" w:fill="FFF8E1"/>
+      </w:pPr>
+      <w:r>
+        <w:rPr>
+          <w:b/>
+          <w:color w:val="924E00"/>
+        </w:rPr>
+        <w:t xml:space="preserve">Note: </w:t>
+      </w:r>
+      <w:r>
+        <w:t>Remote upload works over your local network by default; sending or receiving across the open internet requires the tunnel/ngrok setup described alongside that feature in the app, which is outside the scope of this manual section.</w:t>
+      </w:r>
+    </w:p>
+    <w:p>
+      <w:r>
+        <w:br w:type="page"/>
+      </w:r>
+    </w:p>
+    <w:p>
+      <w:pPr>
+        <w:pStyle w:val="Heading1"/>
+      </w:pPr>
+      <w:r>
+        <w:rPr>
+          <w:color w:val="1E40AF"/>
+        </w:rPr>
+        <w:t>12  Project Management</w:t>
+      </w:r>
+    </w:p>
+    <w:p>
+      <w:r>
+        <w:t>The Project menu (in the header bar) provides tools for backing up, restoring, merging, and importing data.</w:t>
+      </w:r>
+    </w:p>
+    <w:p>
+      <w:pPr>
+        <w:ind w:left="576" w:right="576"/>
+        <w:shd w:val="clear" w:color="auto" w:fill="FFF8E1"/>
+      </w:pPr>
+      <w:r>
+        <w:rPr>
+          <w:b/>
+          <w:color w:val="924E00"/>
+        </w:rPr>
+        <w:t xml:space="preserve">Note: </w:t>
+      </w:r>
+      <w:r>
+        <w:t>If you've set an access password (Chapter 14), all three export types (METADATA / COMP / PART) show an “Automatically encrypted with the project password” note in the menu - the exported .dms file is encrypted with that password, and the same password is needed to decrypt it when importing on another machine. Without a password set, exported backups are not encrypted.</w:t>
+      </w:r>
+    </w:p>
+    <w:p>
+      <w:pPr>
+        <w:pStyle w:val="Heading2"/>
+      </w:pPr>
+      <w:r>
+        <w:rPr>
+          <w:color w:val="1D4E89"/>
+        </w:rPr>
+        <w:t>12.1  Export Index Backup (METADATA)</w:t>
+      </w:r>
+    </w:p>
+    <w:p>
+      <w:r>
+        <w:t>Backs up only the folder-tree structure and metadata (not the actual document files) as a .dms file, named with a METADATA- prefix. Much smaller and faster than a full backup - useful for structural snapshots.</w:t>
+      </w:r>
+    </w:p>
+    <w:p>
+      <w:pPr>
+        <w:pStyle w:val="Heading2"/>
+      </w:pPr>
+      <w:r>
+        <w:rPr>
+          <w:color w:val="1D4E89"/>
+        </w:rPr>
+        <w:t>12.2  Export Full Backup (COMP)</w:t>
+      </w:r>
+    </w:p>
+    <w:p>
+      <w:r>
+        <w:t>Backs up the entire folder tree and every document file, packaged as a .dms file with a COMP- prefix. This is a complete, self-contained backup of the project.</w:t>
+      </w:r>
+    </w:p>
+    <w:p>
+      <w:pPr>
+        <w:ind w:left="576" w:right="576"/>
+        <w:shd w:val="clear" w:color="auto" w:fill="E6F4EA"/>
+      </w:pPr>
+      <w:r>
+        <w:rPr>
+          <w:b/>
+          <w:color w:val="056F00"/>
+        </w:rPr>
+        <w:t xml:space="preserve">Tip: </w:t>
+      </w:r>
+      <w:r>
+        <w:rPr>
+          <w:color w:val="333333"/>
+        </w:rPr>
+        <w:t>Save this file to a USB drive or cloud storage as a regular backup.</w:t>
+      </w:r>
+    </w:p>
+    <w:p>
+      <w:pPr>
+        <w:pStyle w:val="Heading2"/>
+      </w:pPr>
+      <w:r>
+        <w:rPr>
+          <w:color w:val="1D4E89"/>
+        </w:rPr>
+        <w:t>12.3  Export Selected Folders (PART)</w:t>
+      </w:r>
+    </w:p>
+    <w:p>
+      <w:r>
+        <w:t>Lets you pick specific folders to export (with their files), producing a .dms file with a PART- prefix - useful for sharing or archiving just part of a project.</w:t>
+      </w:r>
+    </w:p>
+    <w:p>
+      <w:pPr>
+        <w:pStyle w:val="Heading2"/>
+      </w:pPr>
+      <w:r>
+        <w:rPr>
+          <w:color w:val="1D4E89"/>
+        </w:rPr>
+        <w:t>12.4  Backup Retention Rules</w:t>
+      </w:r>
+    </w:p>
+    <w:p>
+      <w:r>
+        <w:t>The project keeps the 10 most recent .dms backups in the project's root folder; older ones are automatically moved into a “Not Shown in The Tree” archive folder at the root of the storage directory (not to be confused with the similarly named “Not Show in Tree” node inside the document tree from section 3.2, which holds soft-deleted documents instead).</w:t>
+      </w:r>
+    </w:p>
+    <w:p>
+      <w:pPr>
+        <w:pStyle w:val="Heading2"/>
+      </w:pPr>
+      <w:r>
+        <w:rPr>
+          <w:color w:val="1D4E89"/>
+        </w:rPr>
+        <w:t>12.5  Import a Project (.dms)</w:t>
+      </w:r>
+    </w:p>
+    <w:p>
+      <w:pPr>
+        <w:pStyle w:val="ListNumber"/>
+        <w:ind w:left="360"/>
+      </w:pPr>
+      <w:r>
+        <w:t>Click Project, then Import Project (.dms) and select the file.</w:t>
+      </w:r>
+    </w:p>
+    <w:p>
+      <w:pPr>
+        <w:pStyle w:val="ListNumber"/>
+        <w:ind w:left="360"/>
+      </w:pPr>
+      <w:r>
+        <w:t>Choose a destination folder for the import (a new, empty folder is recommended).</w:t>
+      </w:r>
+    </w:p>
+    <w:p>
+      <w:pPr>
+        <w:pStyle w:val="ListNumber"/>
+        <w:ind w:left="360"/>
+      </w:pPr>
+      <w:r>
+        <w:t>Click Import and Switch.</w:t>
+      </w:r>
+    </w:p>
+    <w:p>
+      <w:pPr>
+        <w:pStyle w:val="ListNumber"/>
+        <w:ind w:left="360"/>
+      </w:pPr>
+      <w:r>
+        <w:t>DMS extracts the files and rebuilds the tree structure, and switches the active project to it.</w:t>
+      </w:r>
+    </w:p>
+    <w:p>
+      <w:pPr>
+        <w:ind w:left="576" w:right="576"/>
+        <w:shd w:val="clear" w:color="auto" w:fill="FFF8E1"/>
+      </w:pPr>
+      <w:r>
+        <w:rPr>
+          <w:b/>
+          <w:color w:val="924E00"/>
+        </w:rPr>
+        <w:t xml:space="preserve">Note: </w:t>
+      </w:r>
+      <w:r>
+        <w:t>Importing only restores the folder-tree structure; it never deletes files already on disk.</w:t>
+      </w:r>
+    </w:p>
+    <w:p>
+      <w:pPr>
+        <w:pStyle w:val="Heading2"/>
+      </w:pPr>
+      <w:r>
+        <w:rPr>
+          <w:color w:val="1D4E89"/>
+        </w:rPr>
+        <w:t>12.6  CSV Export</w:t>
+      </w:r>
+    </w:p>
+    <w:p>
+      <w:r>
+        <w:t>Click Project, then Export Metadata (CSV) to download a spreadsheet with one row per document, including document ID, name, size, upload date, and metadata fields. Open it in Excel or Google Sheets for analysis or sharing.</w:t>
+      </w:r>
+    </w:p>
+    <w:p>
+      <w:pPr>
+        <w:pStyle w:val="Heading2"/>
+      </w:pPr>
+      <w:r>
+        <w:rPr>
+          <w:color w:val="1D4E89"/>
+        </w:rPr>
+        <w:t>12.7  Batch ZIP Import</w:t>
+      </w:r>
+    </w:p>
+    <w:p>
+      <w:r>
+        <w:t>Upload a large batch of files at once using a naming convention, and have DMS automatically sort each one into its matching folder.</w:t>
+      </w:r>
+    </w:p>
+    <w:p>
+      <w:pPr>
+        <w:pStyle w:val="ListNumber"/>
+        <w:ind w:left="360"/>
+      </w:pPr>
+      <w:r>
+        <w:t>Prepare a ZIP file, naming each file inside it like this: FolderName#description.pdf (e.g. Home Insurance#2026 Policy.pdf) - the part before the # is the destination folder name, and everything after the # is the rest of the filename, which can be anything you like.</w:t>
+      </w:r>
+    </w:p>
+    <w:p>
+      <w:pPr>
+        <w:pStyle w:val="ListNumber"/>
+        <w:ind w:left="360"/>
+      </w:pPr>
+      <w:r>
+        <w:t>Click Project, then Import Documents from ZIP, and choose your ZIP file.</w:t>
+      </w:r>
+    </w:p>
+    <w:p>
+      <w:pPr>
+        <w:pStyle w:val="ListNumber"/>
+        <w:ind w:left="360"/>
+      </w:pPr>
+      <w:r>
+        <w:t>DMS reads every filename, matches the part before the # against folder names in the tree, and places each document into the matching folder.</w:t>
+      </w:r>
+    </w:p>
+    <w:p>
+      <w:pPr>
+        <w:ind w:left="576" w:right="576"/>
+        <w:shd w:val="clear" w:color="auto" w:fill="FFF8E1"/>
+      </w:pPr>
+      <w:r>
+        <w:rPr>
+          <w:b/>
+          <w:color w:val="924E00"/>
+        </w:rPr>
+        <w:t xml:space="preserve">Note: </w:t>
+      </w:r>
+      <w:r>
+        <w:t>Folders referenced by a filename must already exist in the tree before importing (unlike Hierarchy Import in section 12.8, this does not create new folders). Documents whose folder name doesn't match anything are left unlinked.</w:t>
+      </w:r>
+    </w:p>
+    <w:p>
+      <w:pPr>
+        <w:ind w:left="576" w:right="576"/>
+        <w:shd w:val="clear" w:color="auto" w:fill="FFF8E1"/>
+      </w:pPr>
+      <w:r>
+        <w:rPr>
+          <w:b/>
+          <w:color w:val="924E00"/>
+        </w:rPr>
+        <w:t xml:space="preserve">Note: </w:t>
+      </w:r>
+      <w:r>
+        <w:t>If the same folder name occurs more than once in the tree (e.g. a “Bolt” sub-part under both “Rotor Assembly” and “Housing Assembly”), matching by bare name lands on whichever one comes first, which may not be the one you meant. In that case, use a “/”-separated path before the # instead of a bare name - starting from the root or from any ancestor folder that makes the path unique - e.g. Rotor Assembly/Bolt#List.pdf to land specifically on the “Bolt” folder under “Rotor Assembly” rather than the identically-named one under “Housing Assembly.”</w:t>
+      </w:r>
+    </w:p>
+    <w:p>
+      <w:pPr>
+        <w:pStyle w:val="Heading2"/>
+      </w:pPr>
+      <w:r>
+        <w:rPr>
+          <w:color w:val="1D4E89"/>
+        </w:rPr>
+        <w:t>12.8  Hierarchy Import (with auto de-duplication)</w:t>
+      </w:r>
+    </w:p>
+    <w:p>
+      <w:r>
+        <w:t>Builds a folder tree quickly from a plain text/CSV file - handy for turning a bill of materials or org-chart export from another system straight into a matching folder structure.</w:t>
+      </w:r>
+    </w:p>
+    <w:p>
+      <w:pPr>
+        <w:pStyle w:val="ListNumber"/>
+        <w:ind w:left="360"/>
+      </w:pPr>
+      <w:r>
+        <w:t>Prepare a text file with 2-3 comma-separated columns per line:</w:t>
+      </w:r>
+    </w:p>
+    <w:tbl>
+      <w:tblPr>
+        <w:tblStyle w:val="TableGrid"/>
+        <w:tblW w:type="auto" w:w="0"/>
+        <w:tblLook w:firstColumn="1" w:firstRow="1" w:lastColumn="0" w:lastRow="0" w:noHBand="0" w:noVBand="1" w:val="04A0"/>
+      </w:tblPr>
+      <w:tblGrid>
+        <w:gridCol w:w="2928"/>
+        <w:gridCol w:w="2928"/>
+        <w:gridCol w:w="2928"/>
+      </w:tblGrid>
+      <w:tr>
+        <w:tc>
+          <w:tcPr>
+            <w:tcW w:type="dxa" w:w="1440"/>
+            <w:shd w:val="clear" w:color="auto" w:fill="1E40AF"/>
+          </w:tcPr>
+          <w:p>
+            <w:r>
+              <w:rPr>
+                <w:b/>
+                <w:color w:val="FFFFFF"/>
+              </w:rPr>
+              <w:t>Column</w:t>
+            </w:r>
+          </w:p>
+        </w:tc>
+        <w:tc>
+          <w:tcPr>
+            <w:tcW w:type="dxa" w:w="2592"/>
+            <w:shd w:val="clear" w:color="auto" w:fill="1E40AF"/>
+          </w:tcPr>
+          <w:p>
+            <w:r>
+              <w:rPr>
+                <w:b/>
+                <w:color w:val="FFFFFF"/>
+              </w:rPr>
+              <w:t>Meaning</w:t>
+            </w:r>
+          </w:p>
+        </w:tc>
+        <w:tc>
+          <w:tcPr>
+            <w:tcW w:type="dxa" w:w="5328"/>
+            <w:shd w:val="clear" w:color="auto" w:fill="1E40AF"/>
+          </w:tcPr>
+          <w:p>
+            <w:r>
+              <w:rPr>
+                <w:b/>
+                <w:color w:val="FFFFFF"/>
+              </w:rPr>
+              <w:t>Notes</w:t>
+            </w:r>
+          </w:p>
+        </w:tc>
+      </w:tr>
+      <w:tr>
+        <w:tc>
+          <w:tcPr>
+            <w:tcW w:type="dxa" w:w="1440"/>
+          </w:tcPr>
+          <w:p>
+            <w:r>
+              <w:t>Column 1</w:t>
+            </w:r>
+          </w:p>
+        </w:tc>
+        <w:tc>
+          <w:tcPr>
+            <w:tcW w:type="dxa" w:w="2592"/>
+          </w:tcPr>
+          <w:p>
+            <w:r>
+              <w:t>Folder name</w:t>
+            </w:r>
+          </w:p>
+        </w:tc>
+        <w:tc>
+          <w:tcPr>
+            <w:tcW w:type="dxa" w:w="5328"/>
+          </w:tcPr>
+          <w:p>
+            <w:r>
+              <w:t>Required. The folder this row creates.</w:t>
+            </w:r>
+          </w:p>
+        </w:tc>
+      </w:tr>
+      <w:tr>
+        <w:tc>
+          <w:tcPr>
+            <w:tcW w:type="dxa" w:w="1440"/>
+          </w:tcPr>
+          <w:p>
+            <w:r>
+              <w:t>Column 2</w:t>
+            </w:r>
+          </w:p>
+        </w:tc>
+        <w:tc>
+          <w:tcPr>
+            <w:tcW w:type="dxa" w:w="2592"/>
+          </w:tcPr>
+          <w:p>
+            <w:r>
+              <w:t>Parent folder name</w:t>
+            </w:r>
+          </w:p>
+        </w:tc>
+        <w:tc>
+          <w:tcPr>
+            <w:tcW w:type="dxa" w:w="5328"/>
+          </w:tcPr>
+          <w:p>
+            <w:r>
+              <w:t>Which already-listed folder this one nests under; leave blank for the root. The file's very first row is the root folder itself, so its own parent column must be blank (or omitted).</w:t>
+            </w:r>
+          </w:p>
+        </w:tc>
+      </w:tr>
+      <w:tr>
+        <w:tc>
+          <w:tcPr>
+            <w:tcW w:type="dxa" w:w="1440"/>
+          </w:tcPr>
+          <w:p>
+            <w:r>
+              <w:t>Column 3</w:t>
+            </w:r>
+          </w:p>
+        </w:tc>
+        <w:tc>
+          <w:tcPr>
+            <w:tcW w:type="dxa" w:w="2592"/>
+          </w:tcPr>
+          <w:p>
+            <w:r>
+              <w:t>Description (optional)</w:t>
+            </w:r>
+          </w:p>
+        </w:tc>
+        <w:tc>
+          <w:tcPr>
+            <w:tcW w:type="dxa" w:w="5328"/>
+          </w:tcPr>
+          <w:p>
+            <w:r>
+              <w:t>Can be left out of the file entirely. When present, it becomes that folder's initial description text.</w:t>
+            </w:r>
+          </w:p>
+        </w:tc>
+      </w:tr>
+    </w:tbl>
+    <w:p/>
+    <w:p>
+      <w:r>
+        <w:t>Example:</w:t>
+      </w:r>
+    </w:p>
+    <w:p>
+      <w:pPr>
+        <w:ind w:left="576"/>
+        <w:shd w:val="clear" w:color="auto" w:fill="F3F4F6"/>
+      </w:pPr>
+      <w:r>
+        <w:rPr>
+          <w:rFonts w:ascii="Courier New" w:hAnsi="Courier New"/>
+          <w:sz w:val="18"/>
+        </w:rPr>
+        <w:t>Top Assembly</w:t>
+        <w:br/>
+        <w:t>Pump Housing,Top Assembly</w:t>
+        <w:br/>
+        <w:t>Rotor Assembly,Top Assembly</w:t>
+        <w:br/>
+        <w:t>Impeller,Rotor Assembly</w:t>
+        <w:br/>
+        <w:t>Shaft,Rotor Assembly</w:t>
+      </w:r>
+    </w:p>
+    <w:p>
+      <w:pPr>
+        <w:ind w:left="576" w:right="576"/>
+        <w:shd w:val="clear" w:color="auto" w:fill="FFF8E1"/>
+      </w:pPr>
+      <w:r>
+        <w:rPr>
+          <w:b/>
+          <w:color w:val="924E00"/>
+        </w:rPr>
+        <w:t xml:space="preserve">Note: </w:t>
+      </w:r>
+      <w:r>
+        <w:t>Level-heading rows exported by BOM tools (lines that just say something like “Level 1”) are skipped automatically - no need to delete them by hand. If the first row is a column-title row (“folder name, parent folder name, description,” in whatever wording), DMS detects that structurally from how the rows reference each other and ignores it automatically too, without you needing to delete it.</w:t>
+      </w:r>
+    </w:p>
+    <w:p>
+      <w:pPr>
+        <w:pStyle w:val="ListNumber"/>
+        <w:ind w:left="360"/>
+      </w:pPr>
+      <w:r>
+        <w:t>Click Project, then Create Folder Tree from Hierarchy, and upload (or paste) the text.</w:t>
+      </w:r>
+    </w:p>
+    <w:p>
+      <w:pPr>
+        <w:pStyle w:val="ListNumber"/>
+        <w:ind w:left="360"/>
+      </w:pPr>
+      <w:r>
+        <w:t>Click Validate. If the same folder name repeats anywhere in the file, this is flagged as an error by default, listing the conflicting lines.</w:t>
+      </w:r>
+    </w:p>
     <w:p>
       <w:pPr>
         <w:jc w:val="center"/>
@@ -7062,7 +7531,7 @@
               <a:graphicData uri="http://schemas.openxmlformats.org/drawingml/2006/picture">
                 <pic:pic>
                   <pic:nvPicPr>
-                    <pic:cNvPr id="0" name="14_hierarchy_import_error.png"/>
+                    <pic:cNvPr id="0" name="12_hierarchy_import_empty.png"/>
                     <pic:cNvPicPr/>
                   </pic:nvPicPr>
                   <pic:blipFill>
@@ -7095,7 +7564,7 @@
           <w:color w:val="707070"/>
           <w:sz w:val="18"/>
         </w:rPr>
-        <w:t>Figure 12-2  With auto-numbering off, a duplicate folder name is flagged as an error</w:t>
+        <w:t>Figure 12-1  The hierarchy import dialog (initial state)</w:t>
       </w:r>
     </w:p>
     <w:p/>
@@ -7115,7 +7584,7 @@
               <a:graphicData uri="http://schemas.openxmlformats.org/drawingml/2006/picture">
                 <pic:pic>
                   <pic:nvPicPr>
-                    <pic:cNvPr id="0" name="15_hierarchy_import_dedupe_ok.png"/>
+                    <pic:cNvPr id="0" name="14_hierarchy_import_error.png"/>
                     <pic:cNvPicPr/>
                   </pic:nvPicPr>
                   <pic:blipFill>
@@ -7148,7 +7617,7 @@
           <w:color w:val="707070"/>
           <w:sz w:val="18"/>
         </w:rPr>
-        <w:t>Figure 12-3  With auto-numbering on, the duplicate name is numbered and passes validation</w:t>
+        <w:t>Figure 12-2  With auto-numbering off, a duplicate folder name is flagged as an error</w:t>
       </w:r>
     </w:p>
     <w:p/>
@@ -7158,23 +7627,7 @@
         <w:ind w:left="360"/>
       </w:pPr>
       <w:r>
-        <w:t>Click Create; all folders appear in the tree immediately.</w:t>
-      </w:r>
-    </w:p>
-    <w:p>
-      <w:pPr>
-        <w:pStyle w:val="Heading2"/>
-      </w:pPr>
-      <w:r>
-        <w:rPr>
-          <w:color w:val="1D4E89"/>
-        </w:rPr>
-        <w:t>12.9  Downloading This Manual from Inside the App</w:t>
-      </w:r>
-    </w:p>
-    <w:p>
-      <w:r>
-        <w:t>Click Project, then Download User Manual (.docx) under the Downloads section, to get the same manual you're reading now, generated fresh from inside the running app.</w:t>
+        <w:t>If your data genuinely has same-named folders on purpose (e.g. a “Bolt” sub-part repeated under several assemblies), check Auto-number duplicate folder names (01, 02, 03...) and re-validate - every repeated name is automatically numbered in turn (“Bolt 01,” “Bolt 02,” ...) and the whole file now passes validation instead of erroring.</w:t>
       </w:r>
     </w:p>
     <w:p>
@@ -7193,7 +7646,7 @@
               <a:graphicData uri="http://schemas.openxmlformats.org/drawingml/2006/picture">
                 <pic:pic>
                   <pic:nvPicPr>
-                    <pic:cNvPr id="0" name="11_project_menu.png"/>
+                    <pic:cNvPr id="0" name="15_hierarchy_import_dedupe_ok.png"/>
                     <pic:cNvPicPr/>
                   </pic:nvPicPr>
                   <pic:blipFill>
@@ -7226,24 +7679,26 @@
           <w:color w:val="707070"/>
           <w:sz w:val="18"/>
         </w:rPr>
-        <w:t>Figure 12-4  The Project menu: export, import, and settings</w:t>
+        <w:t>Figure 12-3  With auto-numbering on, the duplicate name is numbered and passes validation</w:t>
       </w:r>
     </w:p>
     <w:p/>
     <w:p>
-      <w:r>
-        <w:br w:type="page"/>
-      </w:r>
-    </w:p>
-    <w:p>
-      <w:pPr>
-        <w:pStyle w:val="Heading1"/>
-      </w:pPr>
-      <w:r>
-        <w:rPr>
-          <w:color w:val="1E40AF"/>
-        </w:rPr>
-        <w:t>13  Cloud Sync and Email</w:t>
+      <w:pPr>
+        <w:pStyle w:val="ListNumber"/>
+        <w:ind w:left="360"/>
+      </w:pPr>
+      <w:r>
+        <w:t>Once validation passes, a tree preview and the number of nodes to be created are shown.</w:t>
+      </w:r>
+    </w:p>
+    <w:p>
+      <w:pPr>
+        <w:pStyle w:val="ListNumber"/>
+        <w:ind w:left="360"/>
+      </w:pPr>
+      <w:r>
+        <w:t>Click Create; all folders appear in the tree immediately.</w:t>
       </w:r>
     </w:p>
     <w:p>
@@ -7254,71 +7709,12 @@
         <w:rPr>
           <w:color w:val="1D4E89"/>
         </w:rPr>
-        <w:t>13.1  Using OneDrive to Sync Storage</w:t>
-      </w:r>
-    </w:p>
-    <w:p>
-      <w:r>
-        <w:t>Pointing your DMS storage folder at a location synced by OneDrive (or a similar cloud-sync service) gives you automatic off-site backup with no extra steps - every change DMS makes on disk gets picked up and uploaded by the sync client in the background, the same as any other file in that folder.</w:t>
-      </w:r>
-    </w:p>
-    <w:p>
-      <w:pPr>
-        <w:ind w:left="576" w:right="576"/>
-        <w:shd w:val="clear" w:color="auto" w:fill="FFF8E1"/>
-      </w:pPr>
-      <w:r>
-        <w:rPr>
-          <w:b/>
-          <w:color w:val="924E00"/>
-        </w:rPr>
-        <w:t xml:space="preserve">Note: </w:t>
-      </w:r>
-      <w:r>
-        <w:t>Very large libraries, or a very slow internet connection, can make cloud sync lag behind your local changes; this is a property of the sync client, not of DMS.</w:t>
-      </w:r>
-    </w:p>
-    <w:p>
-      <w:pPr>
-        <w:pStyle w:val="Heading2"/>
-      </w:pPr>
-      <w:r>
-        <w:rPr>
-          <w:color w:val="1D4E89"/>
-        </w:rPr>
-        <w:t>13.2  Email Sending Setup</w:t>
-      </w:r>
-    </w:p>
-    <w:p>
-      <w:r>
-        <w:t>To use the “email” action on a document card, configure an SMTP account first.</w:t>
-      </w:r>
-    </w:p>
-    <w:p>
-      <w:pPr>
-        <w:pStyle w:val="ListNumber"/>
-        <w:ind w:left="360"/>
-      </w:pPr>
-      <w:r>
-        <w:t>Click Project, then Email Sending Setup.</w:t>
-      </w:r>
-    </w:p>
-    <w:p>
-      <w:pPr>
-        <w:pStyle w:val="ListNumber"/>
-        <w:ind w:left="360"/>
-      </w:pPr>
-      <w:r>
-        <w:t>Enter your SMTP server, port, username, and password (an app-specific password is usually required for Gmail/Outlook accounts with two-factor authentication).</w:t>
-      </w:r>
-    </w:p>
-    <w:p>
-      <w:pPr>
-        <w:pStyle w:val="ListNumber"/>
-        <w:ind w:left="360"/>
-      </w:pPr>
-      <w:r>
-        <w:t>Save the settings; DMS uses them to send documents as attachments going forward.</w:t>
+        <w:t>12.9  Downloading This Manual from Inside the App</w:t>
+      </w:r>
+    </w:p>
+    <w:p>
+      <w:r>
+        <w:t>Click Project, then Download User Manual (.docx) under the Downloads section, to get the same manual you're reading now, generated fresh from inside the running app.</w:t>
       </w:r>
     </w:p>
     <w:p>
@@ -7337,7 +7733,7 @@
               <a:graphicData uri="http://schemas.openxmlformats.org/drawingml/2006/picture">
                 <pic:pic>
                   <pic:nvPicPr>
-                    <pic:cNvPr id="0" name="20_email_settings.png"/>
+                    <pic:cNvPr id="0" name="11_project_menu.png"/>
                     <pic:cNvPicPr/>
                   </pic:nvPicPr>
                   <pic:blipFill>
@@ -7370,10 +7766,42 @@
           <w:color w:val="707070"/>
           <w:sz w:val="18"/>
         </w:rPr>
-        <w:t>Figure 13-1  Email sending (SMTP) settings dialog</w:t>
+        <w:t>Figure 12-4  The Project menu: export, import, and settings</w:t>
       </w:r>
     </w:p>
     <w:p/>
+    <w:p>
+      <w:r>
+        <w:br w:type="page"/>
+      </w:r>
+    </w:p>
+    <w:p>
+      <w:pPr>
+        <w:pStyle w:val="Heading1"/>
+      </w:pPr>
+      <w:r>
+        <w:rPr>
+          <w:color w:val="1E40AF"/>
+        </w:rPr>
+        <w:t>13  Cloud Sync and Email</w:t>
+      </w:r>
+    </w:p>
+    <w:p>
+      <w:pPr>
+        <w:pStyle w:val="Heading2"/>
+      </w:pPr>
+      <w:r>
+        <w:rPr>
+          <w:color w:val="1D4E89"/>
+        </w:rPr>
+        <w:t>13.1  Using OneDrive to Sync Storage</w:t>
+      </w:r>
+    </w:p>
+    <w:p>
+      <w:r>
+        <w:t>Pointing your DMS storage folder at a location synced by OneDrive (or a similar cloud-sync service) gives you automatic off-site backup with no extra steps - every change DMS makes on disk gets picked up and uploaded by the sync client in the background, the same as any other file in that folder.</w:t>
+      </w:r>
+    </w:p>
     <w:p>
       <w:pPr>
         <w:ind w:left="576" w:right="576"/>
@@ -7387,52 +7815,23 @@
         <w:t xml:space="preserve">Note: </w:t>
       </w:r>
       <w:r>
-        <w:t>On Mac, if SMTP hasn't been configured, clicking the email action instead opens your system Mail app with the document attached, so the feature still works without any setup.</w:t>
-      </w:r>
-    </w:p>
-    <w:p>
-      <w:pPr>
-        <w:ind w:left="576" w:right="576"/>
-        <w:shd w:val="clear" w:color="auto" w:fill="E6F4EA"/>
+        <w:t>Very large libraries, or a very slow internet connection, can make cloud sync lag behind your local changes; this is a property of the sync client, not of DMS.</w:t>
+      </w:r>
+    </w:p>
+    <w:p>
+      <w:pPr>
+        <w:pStyle w:val="Heading2"/>
       </w:pPr>
       <w:r>
         <w:rPr>
-          <w:b/>
-          <w:color w:val="056F00"/>
+          <w:color w:val="1D4E89"/>
         </w:rPr>
-        <w:t xml:space="preserve">Tip: </w:t>
-      </w:r>
-      <w:r>
-        <w:rPr>
-          <w:color w:val="333333"/>
-        </w:rPr>
-        <w:t>The Download setup guide (.docx) button in the dialog gives step-by-step, illustrated instructions for enabling SMTP and generating an app-specific password in common providers like Gmail and QQ Mail.</w:t>
-      </w:r>
-    </w:p>
-    <w:p>
-      <w:r>
-        <w:br w:type="page"/>
-      </w:r>
-    </w:p>
-    <w:p>
-      <w:pPr>
-        <w:pStyle w:val="Heading1"/>
-      </w:pPr>
-      <w:r>
-        <w:rPr>
-          <w:color w:val="1E40AF"/>
-        </w:rPr>
-        <w:t>14  Password Protection</w:t>
-      </w:r>
-    </w:p>
-    <w:p>
-      <w:r>
-        <w:t>You can protect DMS with a password so that only authorized users can access the data - strongly recommended once you've enabled LAN access, remote upload, or saved any website login credentials (section 3.6).</w:t>
-      </w:r>
-    </w:p>
-    <w:p>
-      <w:r>
-        <w:t>Set a password:</w:t>
+        <w:t>13.2  Email Sending Setup</w:t>
+      </w:r>
+    </w:p>
+    <w:p>
+      <w:r>
+        <w:t>To use the “email” action on a document card, configure an SMTP account first.</w:t>
       </w:r>
     </w:p>
     <w:p>
@@ -7441,7 +7840,7 @@
         <w:ind w:left="360"/>
       </w:pPr>
       <w:r>
-        <w:t>Click Project, then Set Password.</w:t>
+        <w:t>Click Project, then Email Sending Setup.</w:t>
       </w:r>
     </w:p>
     <w:p>
@@ -7450,7 +7849,7 @@
         <w:ind w:left="360"/>
       </w:pPr>
       <w:r>
-        <w:t>Enter and confirm your chosen password.</w:t>
+        <w:t>Enter your SMTP server, port, username, and password (an app-specific password is usually required for Gmail/Outlook accounts with two-factor authentication).</w:t>
       </w:r>
     </w:p>
     <w:p>
@@ -7459,87 +7858,7 @@
         <w:ind w:left="360"/>
       </w:pPr>
       <w:r>
-        <w:t>Click Set.</w:t>
-      </w:r>
-    </w:p>
-    <w:p>
-      <w:pPr>
-        <w:pStyle w:val="ListNumber"/>
-        <w:ind w:left="360"/>
-      </w:pPr>
-      <w:r>
-        <w:t>On the next DMS startup, a login screen appears before the main interface.</w:t>
-      </w:r>
-    </w:p>
-    <w:p>
-      <w:r>
-        <w:t>Remove the password:</w:t>
-      </w:r>
-    </w:p>
-    <w:p>
-      <w:pPr>
-        <w:pStyle w:val="ListNumber"/>
-        <w:ind w:left="360"/>
-      </w:pPr>
-      <w:r>
-        <w:t>Click Project, then Change Password.</w:t>
-      </w:r>
-    </w:p>
-    <w:p>
-      <w:pPr>
-        <w:pStyle w:val="ListNumber"/>
-        <w:ind w:left="360"/>
-      </w:pPr>
-      <w:r>
-        <w:t>Enter your current password to confirm, then leave the new password fields blank.</w:t>
-      </w:r>
-    </w:p>
-    <w:p>
-      <w:pPr>
-        <w:pStyle w:val="ListNumber"/>
-        <w:ind w:left="360"/>
-      </w:pPr>
-      <w:r>
-        <w:t>Click Set to remove password protection.</w:t>
-      </w:r>
-    </w:p>
-    <w:p>
-      <w:r>
-        <w:t>Logout:</w:t>
-      </w:r>
-    </w:p>
-    <w:p>
-      <w:pPr>
-        <w:pStyle w:val="ListBullet"/>
-        <w:ind w:left="360"/>
-      </w:pPr>
-      <w:r>
-        <w:t>Click Logout in the header bar.</w:t>
-      </w:r>
-    </w:p>
-    <w:p>
-      <w:pPr>
-        <w:pStyle w:val="ListBullet"/>
-        <w:ind w:left="360"/>
-      </w:pPr>
-      <w:r>
-        <w:t>DMS returns to the login screen. The server keeps running; only the browser session ends.</w:t>
-      </w:r>
-    </w:p>
-    <w:p>
-      <w:pPr>
-        <w:ind w:left="576" w:right="576"/>
-        <w:shd w:val="clear" w:color="auto" w:fill="FFF8E1"/>
-      </w:pPr>
-      <w:r>
-        <w:rPr>
-          <w:b/>
-          <w:color w:val="924E00"/>
-        </w:rPr>
-        <w:t xml:space="preserve">Note: </w:t>
-      </w:r>
-      <w:r>
-        <w:t>The password is stored as a salted hash on the server (SHA-256, 100,000 iterations) - never in plain text. A folder's saved website login password (section 3.6) uses a separate, independent reversible-encryption scheme; the two don't affect each other.</w:t>
+        <w:t>Save the settings; DMS uses them to send documents as attachments going forward.</w:t>
       </w:r>
     </w:p>
     <w:p>
@@ -7558,11 +7877,232 @@
               <a:graphicData uri="http://schemas.openxmlformats.org/drawingml/2006/picture">
                 <pic:pic>
                   <pic:nvPicPr>
+                    <pic:cNvPr id="0" name="20_email_settings.png"/>
+                    <pic:cNvPicPr/>
+                  </pic:nvPicPr>
+                  <pic:blipFill>
+                    <a:blip r:embed="rId45"/>
+                    <a:stretch>
+                      <a:fillRect/>
+                    </a:stretch>
+                  </pic:blipFill>
+                  <pic:spPr>
+                    <a:xfrm>
+                      <a:off x="0" y="0"/>
+                      <a:ext cx="5486400" cy="3429000"/>
+                    </a:xfrm>
+                    <a:prstGeom prst="rect"/>
+                  </pic:spPr>
+                </pic:pic>
+              </a:graphicData>
+            </a:graphic>
+          </wp:inline>
+        </w:drawing>
+      </w:r>
+    </w:p>
+    <w:p>
+      <w:pPr>
+        <w:jc w:val="center"/>
+      </w:pPr>
+      <w:r>
+        <w:rPr>
+          <w:i/>
+          <w:color w:val="707070"/>
+          <w:sz w:val="18"/>
+        </w:rPr>
+        <w:t>Figure 13-1  Email sending (SMTP) settings dialog</w:t>
+      </w:r>
+    </w:p>
+    <w:p/>
+    <w:p>
+      <w:pPr>
+        <w:ind w:left="576" w:right="576"/>
+        <w:shd w:val="clear" w:color="auto" w:fill="FFF8E1"/>
+      </w:pPr>
+      <w:r>
+        <w:rPr>
+          <w:b/>
+          <w:color w:val="924E00"/>
+        </w:rPr>
+        <w:t xml:space="preserve">Note: </w:t>
+      </w:r>
+      <w:r>
+        <w:t>On Mac, if SMTP hasn't been configured, clicking the email action instead opens your system Mail app with the document attached, so the feature still works without any setup.</w:t>
+      </w:r>
+    </w:p>
+    <w:p>
+      <w:pPr>
+        <w:ind w:left="576" w:right="576"/>
+        <w:shd w:val="clear" w:color="auto" w:fill="E6F4EA"/>
+      </w:pPr>
+      <w:r>
+        <w:rPr>
+          <w:b/>
+          <w:color w:val="056F00"/>
+        </w:rPr>
+        <w:t xml:space="preserve">Tip: </w:t>
+      </w:r>
+      <w:r>
+        <w:rPr>
+          <w:color w:val="333333"/>
+        </w:rPr>
+        <w:t>The Download setup guide (.docx) button in the dialog gives step-by-step, illustrated instructions for enabling SMTP and generating an app-specific password in common providers like Gmail and QQ Mail.</w:t>
+      </w:r>
+    </w:p>
+    <w:p>
+      <w:r>
+        <w:br w:type="page"/>
+      </w:r>
+    </w:p>
+    <w:p>
+      <w:pPr>
+        <w:pStyle w:val="Heading1"/>
+      </w:pPr>
+      <w:r>
+        <w:rPr>
+          <w:color w:val="1E40AF"/>
+        </w:rPr>
+        <w:t>14  Password Protection</w:t>
+      </w:r>
+    </w:p>
+    <w:p>
+      <w:r>
+        <w:t>You can protect DMS with a password so that only authorized users can access the data - strongly recommended once you've enabled LAN access, remote upload, or saved any website login credentials (section 3.6).</w:t>
+      </w:r>
+    </w:p>
+    <w:p>
+      <w:r>
+        <w:t>Set a password:</w:t>
+      </w:r>
+    </w:p>
+    <w:p>
+      <w:pPr>
+        <w:pStyle w:val="ListNumber"/>
+        <w:ind w:left="360"/>
+      </w:pPr>
+      <w:r>
+        <w:t>Click Project, then Set Password.</w:t>
+      </w:r>
+    </w:p>
+    <w:p>
+      <w:pPr>
+        <w:pStyle w:val="ListNumber"/>
+        <w:ind w:left="360"/>
+      </w:pPr>
+      <w:r>
+        <w:t>Enter and confirm your chosen password.</w:t>
+      </w:r>
+    </w:p>
+    <w:p>
+      <w:pPr>
+        <w:pStyle w:val="ListNumber"/>
+        <w:ind w:left="360"/>
+      </w:pPr>
+      <w:r>
+        <w:t>Click Set.</w:t>
+      </w:r>
+    </w:p>
+    <w:p>
+      <w:pPr>
+        <w:pStyle w:val="ListNumber"/>
+        <w:ind w:left="360"/>
+      </w:pPr>
+      <w:r>
+        <w:t>On the next DMS startup, a login screen appears before the main interface.</w:t>
+      </w:r>
+    </w:p>
+    <w:p>
+      <w:r>
+        <w:t>Remove the password:</w:t>
+      </w:r>
+    </w:p>
+    <w:p>
+      <w:pPr>
+        <w:pStyle w:val="ListNumber"/>
+        <w:ind w:left="360"/>
+      </w:pPr>
+      <w:r>
+        <w:t>Click Project, then Change Password.</w:t>
+      </w:r>
+    </w:p>
+    <w:p>
+      <w:pPr>
+        <w:pStyle w:val="ListNumber"/>
+        <w:ind w:left="360"/>
+      </w:pPr>
+      <w:r>
+        <w:t>Enter your current password to confirm, then leave the new password fields blank.</w:t>
+      </w:r>
+    </w:p>
+    <w:p>
+      <w:pPr>
+        <w:pStyle w:val="ListNumber"/>
+        <w:ind w:left="360"/>
+      </w:pPr>
+      <w:r>
+        <w:t>Click Set to remove password protection.</w:t>
+      </w:r>
+    </w:p>
+    <w:p>
+      <w:r>
+        <w:t>Logout:</w:t>
+      </w:r>
+    </w:p>
+    <w:p>
+      <w:pPr>
+        <w:pStyle w:val="ListBullet"/>
+        <w:ind w:left="360"/>
+      </w:pPr>
+      <w:r>
+        <w:t>Click Logout in the header bar.</w:t>
+      </w:r>
+    </w:p>
+    <w:p>
+      <w:pPr>
+        <w:pStyle w:val="ListBullet"/>
+        <w:ind w:left="360"/>
+      </w:pPr>
+      <w:r>
+        <w:t>DMS returns to the login screen. The server keeps running; only the browser session ends.</w:t>
+      </w:r>
+    </w:p>
+    <w:p>
+      <w:pPr>
+        <w:ind w:left="576" w:right="576"/>
+        <w:shd w:val="clear" w:color="auto" w:fill="FFF8E1"/>
+      </w:pPr>
+      <w:r>
+        <w:rPr>
+          <w:b/>
+          <w:color w:val="924E00"/>
+        </w:rPr>
+        <w:t xml:space="preserve">Note: </w:t>
+      </w:r>
+      <w:r>
+        <w:t>The password is stored as a salted hash on the server (SHA-256, 100,000 iterations) - never in plain text. A folder's saved website login password (section 3.6) uses a separate, independent reversible-encryption scheme; the two don't affect each other.</w:t>
+      </w:r>
+    </w:p>
+    <w:p>
+      <w:pPr>
+        <w:jc w:val="center"/>
+      </w:pPr>
+      <w:r>
+        <w:drawing>
+          <wp:inline xmlns:a="http://schemas.openxmlformats.org/drawingml/2006/main" xmlns:pic="http://schemas.openxmlformats.org/drawingml/2006/picture">
+            <wp:extent cx="5486400" cy="3429000"/>
+            <wp:docPr id="38" name="Picture 38"/>
+            <wp:cNvGraphicFramePr>
+              <a:graphicFrameLocks noChangeAspect="1"/>
+            </wp:cNvGraphicFramePr>
+            <a:graphic>
+              <a:graphicData uri="http://schemas.openxmlformats.org/drawingml/2006/picture">
+                <pic:pic>
+                  <pic:nvPicPr>
                     <pic:cNvPr id="0" name="19_password_dialog.png"/>
                     <pic:cNvPicPr/>
                   </pic:nvPicPr>
                   <pic:blipFill>
-                    <a:blip r:embed="rId45"/>
+                    <a:blip r:embed="rId46"/>
                     <a:stretch>
                       <a:fillRect/>
                     </a:stretch>
@@ -8023,7 +8563,7 @@
         <w:drawing>
           <wp:inline xmlns:a="http://schemas.openxmlformats.org/drawingml/2006/main" xmlns:pic="http://schemas.openxmlformats.org/drawingml/2006/picture">
             <wp:extent cx="5486400" cy="2741275"/>
-            <wp:docPr id="38" name="Picture 38"/>
+            <wp:docPr id="39" name="Picture 39"/>
             <wp:cNvGraphicFramePr>
               <a:graphicFrameLocks noChangeAspect="1"/>
             </wp:cNvGraphicFramePr>
@@ -8035,7 +8575,7 @@
                     <pic:cNvPicPr/>
                   </pic:nvPicPr>
                   <pic:blipFill>
-                    <a:blip r:embed="rId46"/>
+                    <a:blip r:embed="rId47"/>
                     <a:stretch>
                       <a:fillRect/>
                     </a:stretch>
@@ -8193,7 +8733,7 @@
         <w:drawing>
           <wp:inline xmlns:a="http://schemas.openxmlformats.org/drawingml/2006/main" xmlns:pic="http://schemas.openxmlformats.org/drawingml/2006/picture">
             <wp:extent cx="5486400" cy="2737425"/>
-            <wp:docPr id="39" name="Picture 39"/>
+            <wp:docPr id="40" name="Picture 40"/>
             <wp:cNvGraphicFramePr>
               <a:graphicFrameLocks noChangeAspect="1"/>
             </wp:cNvGraphicFramePr>
@@ -8205,7 +8745,7 @@
                     <pic:cNvPicPr/>
                   </pic:nvPicPr>
                   <pic:blipFill>
-                    <a:blip r:embed="rId47"/>
+                    <a:blip r:embed="rId48"/>
                     <a:stretch>
                       <a:fillRect/>
                     </a:stretch>
@@ -8322,7 +8862,7 @@
         <w:drawing>
           <wp:inline xmlns:a="http://schemas.openxmlformats.org/drawingml/2006/main" xmlns:pic="http://schemas.openxmlformats.org/drawingml/2006/picture">
             <wp:extent cx="5486400" cy="2578748"/>
-            <wp:docPr id="40" name="Picture 40"/>
+            <wp:docPr id="41" name="Picture 41"/>
             <wp:cNvGraphicFramePr>
               <a:graphicFrameLocks noChangeAspect="1"/>
             </wp:cNvGraphicFramePr>
@@ -8334,7 +8874,7 @@
                     <pic:cNvPicPr/>
                   </pic:nvPicPr>
                   <pic:blipFill>
-                    <a:blip r:embed="rId48"/>
+                    <a:blip r:embed="rId49"/>
                     <a:stretch>
                       <a:fillRect/>
                     </a:stretch>

</xml_diff>